<commit_message>
Update to version 1.7.1 and copy newest version of manual
</commit_message>
<xml_diff>
--- a/NineTapTour/NineTapTour/Resources/9tapUserManual.docx
+++ b/NineTapTour/NineTapTour/Resources/9tapUserManual.docx
@@ -4476,30 +4476,54 @@
         <w:rPr>
           <w:noProof/>
         </w:rPr>
-        <w:pict w14:anchorId="0D60ED77">
-          <v:shapetype id="_x0000_t75" coordsize="21600,21600" o:spt="75" o:preferrelative="t" path="m@4@5l@4@11@9@11@9@5xe" filled="f" stroked="f">
-            <v:stroke joinstyle="miter"/>
-            <v:formulas>
-              <v:f eqn="if lineDrawn pixelLineWidth 0"/>
-              <v:f eqn="sum @0 1 0"/>
-              <v:f eqn="sum 0 0 @1"/>
-              <v:f eqn="prod @2 1 2"/>
-              <v:f eqn="prod @3 21600 pixelWidth"/>
-              <v:f eqn="prod @3 21600 pixelHeight"/>
-              <v:f eqn="sum @0 0 1"/>
-              <v:f eqn="prod @6 1 2"/>
-              <v:f eqn="prod @7 21600 pixelWidth"/>
-              <v:f eqn="sum @8 21600 0"/>
-              <v:f eqn="prod @7 21600 pixelHeight"/>
-              <v:f eqn="sum @10 21600 0"/>
-            </v:formulas>
-            <v:path o:extrusionok="f" gradientshapeok="t" o:connecttype="rect"/>
-            <o:lock v:ext="edit" aspectratio="t"/>
-          </v:shapetype>
-          <v:shape id="_x0000_i1025" type="#_x0000_t75" style="width:383.25pt;height:195pt">
-            <v:imagedata r:id="rId14" o:title="9TapMainMenu"/>
-          </v:shape>
-        </w:pict>
+        <w:drawing>
+          <wp:inline distT="0" distB="0" distL="0" distR="0" wp14:anchorId="0D60ED77" wp14:editId="083F4382">
+            <wp:extent cx="4867275" cy="2476500"/>
+            <wp:effectExtent l="0" t="0" r="9525" b="0"/>
+            <wp:docPr id="53" name="Picture 1" descr="9TapMainMenu"/>
+            <wp:cNvGraphicFramePr>
+              <a:graphicFrameLocks xmlns:a="http://schemas.openxmlformats.org/drawingml/2006/main" noChangeAspect="1"/>
+            </wp:cNvGraphicFramePr>
+            <a:graphic xmlns:a="http://schemas.openxmlformats.org/drawingml/2006/main">
+              <a:graphicData uri="http://schemas.openxmlformats.org/drawingml/2006/picture">
+                <pic:pic xmlns:pic="http://schemas.openxmlformats.org/drawingml/2006/picture">
+                  <pic:nvPicPr>
+                    <pic:cNvPr id="0" name="Picture 1" descr="9TapMainMenu"/>
+                    <pic:cNvPicPr>
+                      <a:picLocks noChangeAspect="1" noChangeArrowheads="1"/>
+                    </pic:cNvPicPr>
+                  </pic:nvPicPr>
+                  <pic:blipFill>
+                    <a:blip r:embed="rId14" cstate="print">
+                      <a:extLst>
+                        <a:ext uri="{28A0092B-C50C-407E-A947-70E740481C1C}">
+                          <a14:useLocalDpi xmlns:a14="http://schemas.microsoft.com/office/drawing/2010/main" val="0"/>
+                        </a:ext>
+                      </a:extLst>
+                    </a:blip>
+                    <a:srcRect/>
+                    <a:stretch>
+                      <a:fillRect/>
+                    </a:stretch>
+                  </pic:blipFill>
+                  <pic:spPr bwMode="auto">
+                    <a:xfrm>
+                      <a:off x="0" y="0"/>
+                      <a:ext cx="4867275" cy="2476500"/>
+                    </a:xfrm>
+                    <a:prstGeom prst="rect">
+                      <a:avLst/>
+                    </a:prstGeom>
+                    <a:noFill/>
+                    <a:ln>
+                      <a:noFill/>
+                    </a:ln>
+                  </pic:spPr>
+                </pic:pic>
+              </a:graphicData>
+            </a:graphic>
+          </wp:inline>
+        </w:drawing>
       </w:r>
     </w:p>
     <w:p>
@@ -6780,6 +6804,7 @@
         <w:rPr>
           <w:u w:val="single"/>
         </w:rPr>
+        <w:lastRenderedPageBreak/>
         <w:t>Gender</w:t>
       </w:r>
       <w:r>
@@ -6804,7 +6829,6 @@
         <w:rPr>
           <w:u w:val="single"/>
         </w:rPr>
-        <w:lastRenderedPageBreak/>
         <w:t>Lifetime member checkbox</w:t>
       </w:r>
       <w:r>
@@ -7249,7 +7273,6 @@
         <w:ind w:left="360"/>
       </w:pPr>
       <w:r>
-        <w:lastRenderedPageBreak/>
         <w:t>The following fields are calculated automatically or otherwise unable to be modified in Member Info:</w:t>
       </w:r>
     </w:p>
@@ -7569,6 +7592,7 @@
         <w:pStyle w:val="BodyText"/>
       </w:pPr>
       <w:r>
+        <w:lastRenderedPageBreak/>
         <w:t>Select the member to be updated and click “Select”. The member will now be displayed on the Member Info</w:t>
       </w:r>
       <w:r>
@@ -7615,11 +7639,7 @@
         <w:t xml:space="preserve"> screen. Make updates to the member’s information. Then click “Save”. The updates will be saved to the member database.</w:t>
       </w:r>
       <w:r>
-        <w:t xml:space="preserve"> When switching </w:t>
-      </w:r>
-      <w:r>
-        <w:lastRenderedPageBreak/>
-        <w:t>between Members using the Record Number navigatio</w:t>
+        <w:t xml:space="preserve"> When switching between Members using the Record Number navigatio</w:t>
       </w:r>
       <w:r>
         <w:t>n buttons, the changes made if any will be saved.</w:t>
@@ -7721,12 +7741,7 @@
         <w:t xml:space="preserve"> printed to have a hard copy.</w:t>
       </w:r>
       <w:r>
-        <w:t xml:space="preserve"> If a member has won a tournament their bonus pin field will be shaded red to indicate that their pins have been reset</w:t>
-      </w:r>
-      <w:bookmarkStart w:id="22" w:name="_GoBack"/>
-      <w:bookmarkEnd w:id="22"/>
-      <w:r>
-        <w:t>.</w:t>
+        <w:t xml:space="preserve"> If a member has won a tournament their bonus pin field will be shaded red to indicate that their pins have been reset.</w:t>
       </w:r>
     </w:p>
     <w:p>
@@ -7821,15 +7836,14 @@
           <w:szCs w:val="20"/>
         </w:rPr>
       </w:pPr>
-      <w:bookmarkStart w:id="23" w:name="_Toc509165849"/>
+      <w:bookmarkStart w:id="22" w:name="_Toc509165849"/>
       <w:r>
         <w:rPr>
           <w:szCs w:val="20"/>
         </w:rPr>
-        <w:lastRenderedPageBreak/>
         <w:t>Member Search</w:t>
       </w:r>
-      <w:bookmarkEnd w:id="23"/>
+      <w:bookmarkEnd w:id="22"/>
       <w:r>
         <w:rPr>
           <w:szCs w:val="20"/>
@@ -7933,7 +7947,11 @@
         <w:t xml:space="preserve"> The member search button is located furthest right of the Member Info form.</w:t>
       </w:r>
       <w:r>
-        <w:t xml:space="preserve"> From here you can search the member records and select a record to display or update. Do not check “Advance View” if “Search” has not already been clicked.</w:t>
+        <w:t xml:space="preserve"> From here </w:t>
+      </w:r>
+      <w:r>
+        <w:lastRenderedPageBreak/>
+        <w:t>you can search the member records and select a record to display or update. Do not check “Advance View” if “Search” has not already been clicked.</w:t>
       </w:r>
     </w:p>
     <w:p>
@@ -8061,15 +8079,14 @@
           <w:szCs w:val="20"/>
         </w:rPr>
       </w:pPr>
-      <w:bookmarkStart w:id="24" w:name="_Toc509165850"/>
+      <w:bookmarkStart w:id="23" w:name="_Toc509165850"/>
       <w:r>
         <w:rPr>
           <w:szCs w:val="20"/>
         </w:rPr>
-        <w:lastRenderedPageBreak/>
         <w:t>Print Recaps</w:t>
       </w:r>
-      <w:bookmarkEnd w:id="24"/>
+      <w:bookmarkEnd w:id="23"/>
       <w:r>
         <w:rPr>
           <w:szCs w:val="20"/>
@@ -8145,7 +8162,11 @@
         <w:t>’</w:t>
       </w:r>
       <w:r>
-        <w:t xml:space="preserve">s print dialog. You can then “print to pdf” to save the information as a pdf file. The “Print by Date” button </w:t>
+        <w:t xml:space="preserve">s print dialog. You can then “print to pdf” to save the information as a pdf file. The “Print by </w:t>
+      </w:r>
+      <w:r>
+        <w:lastRenderedPageBreak/>
+        <w:t xml:space="preserve">Date” button </w:t>
       </w:r>
       <w:r>
         <w:t>opens the print by date screen. You can enter a date range to print multiple tournaments from here.</w:t>
@@ -8279,14 +8300,14 @@
           <w:szCs w:val="20"/>
         </w:rPr>
       </w:pPr>
-      <w:bookmarkStart w:id="25" w:name="_Toc509165851"/>
+      <w:bookmarkStart w:id="24" w:name="_Toc509165851"/>
       <w:r>
         <w:rPr>
           <w:szCs w:val="20"/>
         </w:rPr>
         <w:t>Import</w:t>
       </w:r>
-      <w:bookmarkEnd w:id="25"/>
+      <w:bookmarkEnd w:id="24"/>
       <w:r>
         <w:rPr>
           <w:szCs w:val="20"/>
@@ -8457,12 +8478,12 @@
       <w:pPr>
         <w:pStyle w:val="Heading1"/>
       </w:pPr>
-      <w:bookmarkStart w:id="26" w:name="_Toc509165852"/>
+      <w:bookmarkStart w:id="25" w:name="_Toc509165852"/>
       <w:r>
         <w:lastRenderedPageBreak/>
         <w:t>Member Scores</w:t>
       </w:r>
-      <w:bookmarkEnd w:id="26"/>
+      <w:bookmarkEnd w:id="25"/>
       <w:r>
         <w:fldChar w:fldCharType="begin"/>
       </w:r>
@@ -8518,11 +8539,54 @@
         <w:rPr>
           <w:noProof/>
         </w:rPr>
-        <w:pict w14:anchorId="5B3445F8">
-          <v:shape id="_x0000_i1026" type="#_x0000_t75" style="width:384pt;height:209.25pt">
-            <v:imagedata r:id="rId23" o:title="Aug302018MemberScores"/>
-          </v:shape>
-        </w:pict>
+        <w:drawing>
+          <wp:inline distT="0" distB="0" distL="0" distR="0" wp14:anchorId="5B3445F8" wp14:editId="7DFF3A4D">
+            <wp:extent cx="4876800" cy="2657475"/>
+            <wp:effectExtent l="0" t="0" r="0" b="9525"/>
+            <wp:docPr id="52" name="Picture 2" descr="Aug302018MemberScores"/>
+            <wp:cNvGraphicFramePr>
+              <a:graphicFrameLocks xmlns:a="http://schemas.openxmlformats.org/drawingml/2006/main" noChangeAspect="1"/>
+            </wp:cNvGraphicFramePr>
+            <a:graphic xmlns:a="http://schemas.openxmlformats.org/drawingml/2006/main">
+              <a:graphicData uri="http://schemas.openxmlformats.org/drawingml/2006/picture">
+                <pic:pic xmlns:pic="http://schemas.openxmlformats.org/drawingml/2006/picture">
+                  <pic:nvPicPr>
+                    <pic:cNvPr id="0" name="Picture 2" descr="Aug302018MemberScores"/>
+                    <pic:cNvPicPr>
+                      <a:picLocks noChangeAspect="1" noChangeArrowheads="1"/>
+                    </pic:cNvPicPr>
+                  </pic:nvPicPr>
+                  <pic:blipFill>
+                    <a:blip r:embed="rId23" cstate="print">
+                      <a:extLst>
+                        <a:ext uri="{28A0092B-C50C-407E-A947-70E740481C1C}">
+                          <a14:useLocalDpi xmlns:a14="http://schemas.microsoft.com/office/drawing/2010/main" val="0"/>
+                        </a:ext>
+                      </a:extLst>
+                    </a:blip>
+                    <a:srcRect/>
+                    <a:stretch>
+                      <a:fillRect/>
+                    </a:stretch>
+                  </pic:blipFill>
+                  <pic:spPr bwMode="auto">
+                    <a:xfrm>
+                      <a:off x="0" y="0"/>
+                      <a:ext cx="4876800" cy="2657475"/>
+                    </a:xfrm>
+                    <a:prstGeom prst="rect">
+                      <a:avLst/>
+                    </a:prstGeom>
+                    <a:noFill/>
+                    <a:ln>
+                      <a:noFill/>
+                    </a:ln>
+                  </pic:spPr>
+                </pic:pic>
+              </a:graphicData>
+            </a:graphic>
+          </wp:inline>
+        </w:drawing>
       </w:r>
     </w:p>
     <w:p>
@@ -8713,11 +8777,11 @@
       <w:pPr>
         <w:pStyle w:val="Heading2"/>
       </w:pPr>
-      <w:bookmarkStart w:id="27" w:name="_Toc509165865"/>
+      <w:bookmarkStart w:id="26" w:name="_Toc509165865"/>
       <w:r>
         <w:t>Comments</w:t>
       </w:r>
-      <w:bookmarkEnd w:id="27"/>
+      <w:bookmarkEnd w:id="26"/>
       <w:r>
         <w:fldChar w:fldCharType="begin"/>
       </w:r>
@@ -8790,7 +8854,7 @@
           <w:szCs w:val="20"/>
         </w:rPr>
       </w:pPr>
-      <w:bookmarkStart w:id="28" w:name="_Toc509165853"/>
+      <w:bookmarkStart w:id="27" w:name="_Toc509165853"/>
       <w:r>
         <w:rPr>
           <w:szCs w:val="20"/>
@@ -8798,7 +8862,7 @@
         <w:lastRenderedPageBreak/>
         <w:t>Tournament Stats</w:t>
       </w:r>
-      <w:bookmarkEnd w:id="28"/>
+      <w:bookmarkEnd w:id="27"/>
       <w:r>
         <w:rPr>
           <w:szCs w:val="20"/>
@@ -9060,7 +9124,7 @@
           <w:szCs w:val="20"/>
         </w:rPr>
       </w:pPr>
-      <w:bookmarkStart w:id="29" w:name="_Toc509165854"/>
+      <w:bookmarkStart w:id="28" w:name="_Toc509165854"/>
       <w:r>
         <w:rPr>
           <w:szCs w:val="20"/>
@@ -9079,7 +9143,7 @@
         </w:rPr>
         <w:t>By Tournament</w:t>
       </w:r>
-      <w:bookmarkEnd w:id="29"/>
+      <w:bookmarkEnd w:id="28"/>
       <w:r>
         <w:rPr>
           <w:szCs w:val="20"/>
@@ -9263,12 +9327,12 @@
       <w:pPr>
         <w:pStyle w:val="Heading2"/>
       </w:pPr>
-      <w:bookmarkStart w:id="30" w:name="_Toc509165855"/>
+      <w:bookmarkStart w:id="29" w:name="_Toc509165855"/>
       <w:r>
         <w:lastRenderedPageBreak/>
         <w:t>Tournament Place Standings</w:t>
       </w:r>
-      <w:bookmarkEnd w:id="30"/>
+      <w:bookmarkEnd w:id="29"/>
       <w:r>
         <w:fldChar w:fldCharType="begin"/>
       </w:r>
@@ -9437,194 +9501,197 @@
       <w:pPr>
         <w:pStyle w:val="Heading2"/>
       </w:pPr>
-      <w:bookmarkStart w:id="31" w:name="_Toc509165856"/>
+      <w:bookmarkStart w:id="30" w:name="_Toc509165856"/>
+      <w:r>
+        <w:t xml:space="preserve"> How to create or e</w:t>
+      </w:r>
+      <w:r>
+        <w:t>dit Tournament</w:t>
+      </w:r>
+      <w:bookmarkEnd w:id="30"/>
+      <w:r>
+        <w:fldChar w:fldCharType="begin"/>
+      </w:r>
+      <w:r>
+        <w:instrText xml:space="preserve"> XE "</w:instrText>
+      </w:r>
+      <w:r>
+        <w:instrText>Create/Edit Tournament</w:instrText>
+      </w:r>
+      <w:r>
+        <w:instrText xml:space="preserve">" </w:instrText>
+      </w:r>
+      <w:r>
+        <w:fldChar w:fldCharType="end"/>
+      </w:r>
+    </w:p>
+    <w:p>
+      <w:pPr>
+        <w:pStyle w:val="BodyText"/>
+        <w:keepNext/>
+      </w:pPr>
+      <w:r>
+        <w:t>Before scores can be</w:t>
+      </w:r>
+      <w:r>
+        <w:t xml:space="preserve"> added into a tournament, a tournament </w:t>
+      </w:r>
+      <w:r>
+        <w:t>needs to be created first. This can be done from the Member Scores tab. To begin</w:t>
+      </w:r>
+      <w:r>
+        <w:t>, click the Create/</w:t>
+      </w:r>
+      <w:r>
+        <w:t>Edit Tournament button located below the Stats s</w:t>
+      </w:r>
+      <w:r>
+        <w:t>ection</w:t>
+      </w:r>
+      <w:r>
+        <w:t>.</w:t>
+      </w:r>
+      <w:r>
+        <w:t xml:space="preserve"> This will open a form to create a tournament.</w:t>
+      </w:r>
+    </w:p>
+    <w:p>
+      <w:pPr>
+        <w:pStyle w:val="BodyText"/>
+        <w:keepNext/>
+      </w:pPr>
+      <w:r>
+        <w:t>Populate this form</w:t>
+      </w:r>
+      <w:r>
+        <w:t xml:space="preserve"> with the following </w:t>
+      </w:r>
+      <w:r>
+        <w:t>information: the location of th</w:t>
+      </w:r>
+      <w:r>
+        <w:t xml:space="preserve">e tournament, </w:t>
+      </w:r>
+      <w:r>
+        <w:t>the name of the tournament, and any sponsors that support the tournament.</w:t>
+      </w:r>
+      <w:r>
+        <w:t xml:space="preserve"> The da</w:t>
+      </w:r>
+      <w:r>
+        <w:t xml:space="preserve">te will default to today’s date. </w:t>
+      </w:r>
+      <w:r>
+        <w:t>If the tournament</w:t>
+      </w:r>
+      <w:r>
+        <w:t xml:space="preserve"> is a 3 Out of 4 tourne</w:t>
+      </w:r>
+      <w:r>
+        <w:t>y, then check the appropriate box</w:t>
+      </w:r>
+      <w:r>
+        <w:t>. Finally, enter the number of squads</w:t>
+      </w:r>
+      <w:r>
+        <w:t xml:space="preserve"> and </w:t>
+      </w:r>
+      <w:r>
+        <w:t>any notes for</w:t>
+      </w:r>
+      <w:r>
+        <w:t xml:space="preserve"> the tournament.</w:t>
+      </w:r>
+      <w:r>
+        <w:t xml:space="preserve"> </w:t>
+      </w:r>
+      <w:r>
+        <w:t>Review</w:t>
+      </w:r>
+      <w:r>
+        <w:t xml:space="preserve"> these fields again if necessary for accuracy and if the user wants to clear the entire form and start over, there is a Clea</w:t>
+      </w:r>
+      <w:r>
+        <w:t xml:space="preserve">r button at the top of the </w:t>
+      </w:r>
+      <w:r>
+        <w:t>form.</w:t>
+      </w:r>
+      <w:r>
+        <w:t xml:space="preserve"> Once all of the information is </w:t>
+      </w:r>
+      <w:r>
+        <w:t>proofread, click the Create Tournament button at the bottom</w:t>
+      </w:r>
+      <w:r>
+        <w:t xml:space="preserve"> of the form to add the </w:t>
+      </w:r>
+      <w:r>
+        <w:t>tournament</w:t>
+      </w:r>
+      <w:r>
+        <w:t xml:space="preserve"> to the </w:t>
+      </w:r>
+      <w:r>
+        <w:t>9-Tap</w:t>
+      </w:r>
+      <w:r>
+        <w:t xml:space="preserve"> database.</w:t>
+      </w:r>
+    </w:p>
+    <w:p>
+      <w:pPr>
+        <w:pStyle w:val="BodyText"/>
+        <w:keepNext/>
+      </w:pPr>
+      <w:r>
+        <w:t>There are some additional details</w:t>
+      </w:r>
+      <w:r>
+        <w:t xml:space="preserve"> to note when it c</w:t>
+      </w:r>
+      <w:r>
+        <w:t>omes to creating</w:t>
+      </w:r>
+      <w:r>
+        <w:t xml:space="preserve"> a tournament. </w:t>
+      </w:r>
+      <w:r>
+        <w:t>If the squads box is empty or is not between one and eight,</w:t>
+      </w:r>
+      <w:r>
+        <w:t xml:space="preserve"> the user</w:t>
+      </w:r>
+      <w:r>
+        <w:t xml:space="preserve"> will be prompted </w:t>
+      </w:r>
+      <w:r>
+        <w:t>to input</w:t>
+      </w:r>
+      <w:r>
+        <w:t xml:space="preserve"> the required information</w:t>
+      </w:r>
+      <w:r>
+        <w:t xml:space="preserve"> </w:t>
+      </w:r>
+      <w:r>
+        <w:t xml:space="preserve">when </w:t>
+      </w:r>
+      <w:r>
+        <w:t>they click the Create Tournament button</w:t>
+      </w:r>
+      <w:r>
+        <w:t>.</w:t>
+      </w:r>
+      <w:r>
+        <w:t xml:space="preserve"> The only</w:t>
+      </w:r>
+      <w:r>
+        <w:t xml:space="preserve"> </w:t>
+      </w:r>
       <w:r>
         <w:lastRenderedPageBreak/>
-        <w:t xml:space="preserve"> How to create or e</w:t>
-      </w:r>
-      <w:r>
-        <w:t>dit Tournament</w:t>
-      </w:r>
-      <w:bookmarkEnd w:id="31"/>
-      <w:r>
-        <w:fldChar w:fldCharType="begin"/>
-      </w:r>
-      <w:r>
-        <w:instrText xml:space="preserve"> XE "</w:instrText>
-      </w:r>
-      <w:r>
-        <w:instrText>Create/Edit Tournament</w:instrText>
-      </w:r>
-      <w:r>
-        <w:instrText xml:space="preserve">" </w:instrText>
-      </w:r>
-      <w:r>
-        <w:fldChar w:fldCharType="end"/>
-      </w:r>
-    </w:p>
-    <w:p>
-      <w:pPr>
-        <w:pStyle w:val="BodyText"/>
-        <w:keepNext/>
-      </w:pPr>
-      <w:r>
-        <w:t>Before scores can be</w:t>
-      </w:r>
-      <w:r>
-        <w:t xml:space="preserve"> added into a tournament, a tournament </w:t>
-      </w:r>
-      <w:r>
-        <w:t>needs to be created first. This can be done from the Member Scores tab. To begin</w:t>
-      </w:r>
-      <w:r>
-        <w:t>, click the Create/</w:t>
-      </w:r>
-      <w:r>
-        <w:t>Edit Tournament button located below the Stats s</w:t>
-      </w:r>
-      <w:r>
-        <w:t>ection</w:t>
-      </w:r>
-      <w:r>
-        <w:t>.</w:t>
-      </w:r>
-      <w:r>
-        <w:t xml:space="preserve"> This will open a form to create a tournament.</w:t>
-      </w:r>
-    </w:p>
-    <w:p>
-      <w:pPr>
-        <w:pStyle w:val="BodyText"/>
-        <w:keepNext/>
-      </w:pPr>
-      <w:r>
-        <w:t>Populate this form</w:t>
-      </w:r>
-      <w:r>
-        <w:t xml:space="preserve"> with the following </w:t>
-      </w:r>
-      <w:r>
-        <w:t>information: the location of th</w:t>
-      </w:r>
-      <w:r>
-        <w:t xml:space="preserve">e tournament, </w:t>
-      </w:r>
-      <w:r>
-        <w:t>the name of the tournament, and any sponsors that support the tournament.</w:t>
-      </w:r>
-      <w:r>
-        <w:t xml:space="preserve"> The da</w:t>
-      </w:r>
-      <w:r>
-        <w:t xml:space="preserve">te will default to today’s date. </w:t>
-      </w:r>
-      <w:r>
-        <w:t>If the tournament</w:t>
-      </w:r>
-      <w:r>
-        <w:t xml:space="preserve"> is a 3 Out of 4 tourne</w:t>
-      </w:r>
-      <w:r>
-        <w:t>y, then check the appropriate box</w:t>
-      </w:r>
-      <w:r>
-        <w:t>. Finally, enter the number of squads</w:t>
-      </w:r>
-      <w:r>
-        <w:t xml:space="preserve"> and </w:t>
-      </w:r>
-      <w:r>
-        <w:t>any notes for</w:t>
-      </w:r>
-      <w:r>
-        <w:t xml:space="preserve"> the tournament.</w:t>
-      </w:r>
-      <w:r>
-        <w:t xml:space="preserve"> </w:t>
-      </w:r>
-      <w:r>
-        <w:t>Review</w:t>
-      </w:r>
-      <w:r>
-        <w:t xml:space="preserve"> these fields again if necessary for accuracy and if the user wants to clear the entire form and start over, there is a Clea</w:t>
-      </w:r>
-      <w:r>
-        <w:t xml:space="preserve">r button at the top of the </w:t>
-      </w:r>
-      <w:r>
-        <w:t>form.</w:t>
-      </w:r>
-      <w:r>
-        <w:t xml:space="preserve"> Once all of the information is </w:t>
-      </w:r>
-      <w:r>
-        <w:t>proofread, click the Create Tournament button at the bottom</w:t>
-      </w:r>
-      <w:r>
-        <w:t xml:space="preserve"> of the form to add the </w:t>
-      </w:r>
-      <w:r>
-        <w:t>tournament</w:t>
-      </w:r>
-      <w:r>
-        <w:t xml:space="preserve"> to the </w:t>
-      </w:r>
-      <w:r>
-        <w:t>9-Tap</w:t>
-      </w:r>
-      <w:r>
-        <w:t xml:space="preserve"> database.</w:t>
-      </w:r>
-    </w:p>
-    <w:p>
-      <w:pPr>
-        <w:pStyle w:val="BodyText"/>
-        <w:keepNext/>
-      </w:pPr>
-      <w:r>
-        <w:t>There are some additional details</w:t>
-      </w:r>
-      <w:r>
-        <w:t xml:space="preserve"> to note when it c</w:t>
-      </w:r>
-      <w:r>
-        <w:t>omes to creating</w:t>
-      </w:r>
-      <w:r>
-        <w:t xml:space="preserve"> a tournament. </w:t>
-      </w:r>
-      <w:r>
-        <w:t>If the squads box is empty or is not between one and eight,</w:t>
-      </w:r>
-      <w:r>
-        <w:t xml:space="preserve"> the user</w:t>
-      </w:r>
-      <w:r>
-        <w:t xml:space="preserve"> will be prompted </w:t>
-      </w:r>
-      <w:r>
-        <w:t>to input</w:t>
-      </w:r>
-      <w:r>
-        <w:t xml:space="preserve"> the required information</w:t>
-      </w:r>
-      <w:r>
-        <w:t xml:space="preserve"> </w:t>
-      </w:r>
-      <w:r>
-        <w:t xml:space="preserve">when </w:t>
-      </w:r>
-      <w:r>
-        <w:t>they click the Create Tournament button</w:t>
-      </w:r>
-      <w:r>
-        <w:t>.</w:t>
-      </w:r>
-      <w:r>
-        <w:t xml:space="preserve"> The only</w:t>
-      </w:r>
-      <w:r>
-        <w:t xml:space="preserve"> requirements to create a tournament</w:t>
+        <w:t>requirements to create a tournament</w:t>
       </w:r>
       <w:r>
         <w:t xml:space="preserve"> are</w:t>
@@ -9707,7 +9774,6 @@
         <w:jc w:val="both"/>
       </w:pPr>
       <w:r>
-        <w:lastRenderedPageBreak/>
         <w:t xml:space="preserve">Figure </w:t>
       </w:r>
       <w:fldSimple w:instr=" SEQ Figure \* ARABIC ">
@@ -9760,22 +9826,98 @@
       <w:pPr>
         <w:pStyle w:val="Heading3"/>
       </w:pPr>
-      <w:bookmarkStart w:id="32" w:name="_Toc509165857"/>
+      <w:bookmarkStart w:id="31" w:name="_Toc509165857"/>
       <w:r>
         <w:t xml:space="preserve"> How t</w:t>
       </w:r>
       <w:r>
         <w:t>o Update an Existing Tournament</w:t>
       </w:r>
+      <w:bookmarkEnd w:id="31"/>
+    </w:p>
+    <w:p>
+      <w:pPr>
+        <w:pStyle w:val="BodyText"/>
+      </w:pPr>
+      <w:r>
+        <w:t>Click on the “Create/Edit Tournament</w:t>
+      </w:r>
+      <w:r>
+        <w:fldChar w:fldCharType="begin"/>
+      </w:r>
+      <w:r>
+        <w:instrText xml:space="preserve"> XE "</w:instrText>
+      </w:r>
+      <w:r>
+        <w:instrText>Create/Edit Tournament</w:instrText>
+      </w:r>
+      <w:r>
+        <w:instrText xml:space="preserve">" </w:instrText>
+      </w:r>
+      <w:r>
+        <w:fldChar w:fldCharType="end"/>
+      </w:r>
+      <w:r>
+        <w:t>” button. On the New Tournament screen, click “Edit Existing Tournament…</w:t>
+      </w:r>
+      <w:r>
+        <w:fldChar w:fldCharType="begin"/>
+      </w:r>
+      <w:r>
+        <w:instrText xml:space="preserve"> XE "</w:instrText>
+      </w:r>
+      <w:r>
+        <w:instrText>Edit Existing Tournament…</w:instrText>
+      </w:r>
+      <w:r>
+        <w:instrText xml:space="preserve">" </w:instrText>
+      </w:r>
+      <w:r>
+        <w:fldChar w:fldCharType="end"/>
+      </w:r>
+      <w:r>
+        <w:t>” This will bring up the “Search Tournaments</w:t>
+      </w:r>
+      <w:r>
+        <w:fldChar w:fldCharType="begin"/>
+      </w:r>
+      <w:r>
+        <w:instrText xml:space="preserve"> XE "</w:instrText>
+      </w:r>
+      <w:r>
+        <w:instrText>Search Tournaments</w:instrText>
+      </w:r>
+      <w:r>
+        <w:instrText xml:space="preserve">" </w:instrText>
+      </w:r>
+      <w:r>
+        <w:fldChar w:fldCharType="end"/>
+      </w:r>
+      <w:r>
+        <w:t>”</w:t>
+      </w:r>
+      <w:r>
+        <w:t xml:space="preserve"> screen</w:t>
+      </w:r>
+      <w:r>
+        <w:t xml:space="preserve">, figure 14. </w:t>
+      </w:r>
+      <w:r>
+        <w:t xml:space="preserve">See Search Tournaments </w:t>
+      </w:r>
+      <w:r>
+        <w:t>for the search function. Once the tournament to edit has been selected, you can then edit the pertinent information and save the entry.</w:t>
+      </w:r>
+    </w:p>
+    <w:p>
+      <w:pPr>
+        <w:pStyle w:val="Heading2"/>
+      </w:pPr>
+      <w:bookmarkStart w:id="32" w:name="_Toc509165858"/>
+      <w:r>
+        <w:t>Search Tournaments</w:t>
+      </w:r>
       <w:bookmarkEnd w:id="32"/>
-    </w:p>
-    <w:p>
-      <w:pPr>
-        <w:pStyle w:val="BodyText"/>
-      </w:pPr>
-      <w:r>
-        <w:t>Click on the “Create/Edit Tournament</w:t>
-      </w:r>
       <w:r>
         <w:fldChar w:fldCharType="begin"/>
       </w:r>
@@ -9783,7 +9925,7 @@
         <w:instrText xml:space="preserve"> XE "</w:instrText>
       </w:r>
       <w:r>
-        <w:instrText>Create/Edit Tournament</w:instrText>
+        <w:instrText>Search Tournaments</w:instrText>
       </w:r>
       <w:r>
         <w:instrText xml:space="preserve">" </w:instrText>
@@ -9791,82 +9933,6 @@
       <w:r>
         <w:fldChar w:fldCharType="end"/>
       </w:r>
-      <w:r>
-        <w:t>” button. On the New Tournament screen, click “Edit Existing Tournament…</w:t>
-      </w:r>
-      <w:r>
-        <w:fldChar w:fldCharType="begin"/>
-      </w:r>
-      <w:r>
-        <w:instrText xml:space="preserve"> XE "</w:instrText>
-      </w:r>
-      <w:r>
-        <w:instrText>Edit Existing Tournament…</w:instrText>
-      </w:r>
-      <w:r>
-        <w:instrText xml:space="preserve">" </w:instrText>
-      </w:r>
-      <w:r>
-        <w:fldChar w:fldCharType="end"/>
-      </w:r>
-      <w:r>
-        <w:t>” This will bring up the “Search Tournaments</w:t>
-      </w:r>
-      <w:r>
-        <w:fldChar w:fldCharType="begin"/>
-      </w:r>
-      <w:r>
-        <w:instrText xml:space="preserve"> XE "</w:instrText>
-      </w:r>
-      <w:r>
-        <w:instrText>Search Tournaments</w:instrText>
-      </w:r>
-      <w:r>
-        <w:instrText xml:space="preserve">" </w:instrText>
-      </w:r>
-      <w:r>
-        <w:fldChar w:fldCharType="end"/>
-      </w:r>
-      <w:r>
-        <w:t>”</w:t>
-      </w:r>
-      <w:r>
-        <w:t xml:space="preserve"> screen</w:t>
-      </w:r>
-      <w:r>
-        <w:t xml:space="preserve">, figure 14. </w:t>
-      </w:r>
-      <w:r>
-        <w:t xml:space="preserve">See Search Tournaments </w:t>
-      </w:r>
-      <w:r>
-        <w:t>for the search function. Once the tournament to edit has been selected, you can then edit the pertinent information and save the entry.</w:t>
-      </w:r>
-    </w:p>
-    <w:p>
-      <w:pPr>
-        <w:pStyle w:val="Heading2"/>
-      </w:pPr>
-      <w:bookmarkStart w:id="33" w:name="_Toc509165858"/>
-      <w:r>
-        <w:t>Search Tournaments</w:t>
-      </w:r>
-      <w:bookmarkEnd w:id="33"/>
-      <w:r>
-        <w:fldChar w:fldCharType="begin"/>
-      </w:r>
-      <w:r>
-        <w:instrText xml:space="preserve"> XE "</w:instrText>
-      </w:r>
-      <w:r>
-        <w:instrText>Search Tournaments</w:instrText>
-      </w:r>
-      <w:r>
-        <w:instrText xml:space="preserve">" </w:instrText>
-      </w:r>
-      <w:r>
-        <w:fldChar w:fldCharType="end"/>
-      </w:r>
     </w:p>
     <w:p>
       <w:pPr>
@@ -9874,7 +9940,11 @@
         <w:keepNext/>
       </w:pPr>
       <w:r>
-        <w:t>Tournaments can be searched by location, event, or tournament date. This function can be reached by either the “Edit Existing Tournament” button on the New Tournament screen; or by the “Search Tournaments</w:t>
+        <w:t xml:space="preserve">Tournaments can be searched by location, event, or tournament date. This function can be reached by either the “Edit Existing Tournament” button on the New Tournament </w:t>
+      </w:r>
+      <w:r>
+        <w:lastRenderedPageBreak/>
+        <w:t>screen; or by the “Search Tournaments</w:t>
       </w:r>
       <w:r>
         <w:fldChar w:fldCharType="begin"/>
@@ -10035,53 +10105,53 @@
       <w:pPr>
         <w:pStyle w:val="Heading3"/>
       </w:pPr>
-      <w:bookmarkStart w:id="34" w:name="_Toc509165859"/>
+      <w:bookmarkStart w:id="33" w:name="_Toc509165859"/>
       <w:r>
         <w:t>Search by Location</w:t>
       </w:r>
+      <w:bookmarkEnd w:id="33"/>
+      <w:r>
+        <w:fldChar w:fldCharType="begin"/>
+      </w:r>
+      <w:r>
+        <w:instrText xml:space="preserve"> XE "</w:instrText>
+      </w:r>
+      <w:r>
+        <w:instrText>Search by Location</w:instrText>
+      </w:r>
+      <w:r>
+        <w:instrText xml:space="preserve">" </w:instrText>
+      </w:r>
+      <w:r>
+        <w:fldChar w:fldCharType="end"/>
+      </w:r>
+    </w:p>
+    <w:p>
+      <w:pPr>
+        <w:pStyle w:val="BodyText"/>
+      </w:pPr>
+      <w:r>
+        <w:t>To search a tournament by location</w:t>
+      </w:r>
+      <w:r>
+        <w:t>:</w:t>
+      </w:r>
+      <w:r>
+        <w:t xml:space="preserve"> Fill in the name of the </w:t>
+      </w:r>
+      <w:r>
+        <w:t>bowling center in the Location field. Click “Search”. Choose the tournament. Click “Accept”.</w:t>
+      </w:r>
+    </w:p>
+    <w:p>
+      <w:pPr>
+        <w:pStyle w:val="Heading3"/>
+      </w:pPr>
+      <w:bookmarkStart w:id="34" w:name="_Toc509165860"/>
+      <w:r>
+        <w:t>Search by Event</w:t>
+      </w:r>
       <w:bookmarkEnd w:id="34"/>
-      <w:r>
-        <w:fldChar w:fldCharType="begin"/>
-      </w:r>
-      <w:r>
-        <w:instrText xml:space="preserve"> XE "</w:instrText>
-      </w:r>
-      <w:r>
-        <w:instrText>Search by Location</w:instrText>
-      </w:r>
-      <w:r>
-        <w:instrText xml:space="preserve">" </w:instrText>
-      </w:r>
-      <w:r>
-        <w:fldChar w:fldCharType="end"/>
-      </w:r>
-    </w:p>
-    <w:p>
-      <w:pPr>
-        <w:pStyle w:val="BodyText"/>
-      </w:pPr>
-      <w:r>
-        <w:t>To search a tournament by location</w:t>
-      </w:r>
-      <w:r>
-        <w:t>:</w:t>
-      </w:r>
-      <w:r>
-        <w:t xml:space="preserve"> Fill in the name of the </w:t>
-      </w:r>
-      <w:r>
-        <w:t>bowling center in the Location field. Click “Search”. Choose the tournament. Click “Accept”.</w:t>
-      </w:r>
-    </w:p>
-    <w:p>
-      <w:pPr>
-        <w:pStyle w:val="Heading3"/>
-      </w:pPr>
-      <w:bookmarkStart w:id="35" w:name="_Toc509165860"/>
-      <w:r>
-        <w:t>Search by Event</w:t>
-      </w:r>
-      <w:bookmarkEnd w:id="35"/>
       <w:r>
         <w:fldChar w:fldCharType="begin"/>
       </w:r>
@@ -10139,79 +10209,79 @@
         <w:pStyle w:val="BodyText"/>
       </w:pPr>
       <w:r>
+        <w:t>S</w:t>
+      </w:r>
+      <w:r>
+        <w:t>earching by event and location can be done with just a letter found in the name of the loc</w:t>
+      </w:r>
+      <w:r>
+        <w:t>ation or the event</w:t>
+      </w:r>
+      <w:r>
+        <w:t>.</w:t>
+      </w:r>
+      <w:r>
+        <w:t xml:space="preserve"> For example, there are two tourname</w:t>
+      </w:r>
+      <w:r>
+        <w:t>nts: one in San Francisco</w:t>
+      </w:r>
+      <w:r>
+        <w:t>, and another in Seattle.</w:t>
+      </w:r>
+      <w:r>
+        <w:t xml:space="preserve"> Entering “S” in the search bar will yield both</w:t>
+      </w:r>
+      <w:r>
+        <w:t xml:space="preserve"> of these</w:t>
+      </w:r>
+      <w:r>
+        <w:t xml:space="preserve"> in the</w:t>
+      </w:r>
+      <w:r>
+        <w:t xml:space="preserve"> results.</w:t>
+      </w:r>
+    </w:p>
+    <w:p>
+      <w:pPr>
+        <w:pStyle w:val="Heading3"/>
+      </w:pPr>
+      <w:bookmarkStart w:id="35" w:name="_Toc509165861"/>
+      <w:r>
+        <w:t>Search by Date</w:t>
+      </w:r>
+      <w:bookmarkEnd w:id="35"/>
+      <w:r>
+        <w:fldChar w:fldCharType="begin"/>
+      </w:r>
+      <w:r>
+        <w:instrText xml:space="preserve"> XE "</w:instrText>
+      </w:r>
+      <w:r>
+        <w:instrText>Search by Date</w:instrText>
+      </w:r>
+      <w:r>
+        <w:instrText xml:space="preserve">" </w:instrText>
+      </w:r>
+      <w:r>
+        <w:fldChar w:fldCharType="end"/>
+      </w:r>
+    </w:p>
+    <w:p>
+      <w:pPr>
+        <w:pStyle w:val="BodyText"/>
+      </w:pPr>
+      <w:r>
+        <w:t>To find a tournament by date: Check the Date box. Pick the date range to search with the From and To date fields. Click “Search”. Choose the tournament you need from the list. Click “Accept”.</w:t>
+      </w:r>
+    </w:p>
+    <w:p>
+      <w:pPr>
+        <w:pStyle w:val="Heading2"/>
+      </w:pPr>
+      <w:bookmarkStart w:id="36" w:name="_Toc509165862"/>
+      <w:r>
         <w:lastRenderedPageBreak/>
-        <w:t>S</w:t>
-      </w:r>
-      <w:r>
-        <w:t>earching by event and location can be done with just a letter found in the name of the loc</w:t>
-      </w:r>
-      <w:r>
-        <w:t>ation or the event</w:t>
-      </w:r>
-      <w:r>
-        <w:t>.</w:t>
-      </w:r>
-      <w:r>
-        <w:t xml:space="preserve"> For example, there are two tourname</w:t>
-      </w:r>
-      <w:r>
-        <w:t>nts: one in San Francisco</w:t>
-      </w:r>
-      <w:r>
-        <w:t>, and another in Seattle.</w:t>
-      </w:r>
-      <w:r>
-        <w:t xml:space="preserve"> Entering “S” in the search bar will yield both</w:t>
-      </w:r>
-      <w:r>
-        <w:t xml:space="preserve"> of these</w:t>
-      </w:r>
-      <w:r>
-        <w:t xml:space="preserve"> in the</w:t>
-      </w:r>
-      <w:r>
-        <w:t xml:space="preserve"> results.</w:t>
-      </w:r>
-    </w:p>
-    <w:p>
-      <w:pPr>
-        <w:pStyle w:val="Heading3"/>
-      </w:pPr>
-      <w:bookmarkStart w:id="36" w:name="_Toc509165861"/>
-      <w:r>
-        <w:t>Search by Date</w:t>
-      </w:r>
-      <w:bookmarkEnd w:id="36"/>
-      <w:r>
-        <w:fldChar w:fldCharType="begin"/>
-      </w:r>
-      <w:r>
-        <w:instrText xml:space="preserve"> XE "</w:instrText>
-      </w:r>
-      <w:r>
-        <w:instrText>Search by Date</w:instrText>
-      </w:r>
-      <w:r>
-        <w:instrText xml:space="preserve">" </w:instrText>
-      </w:r>
-      <w:r>
-        <w:fldChar w:fldCharType="end"/>
-      </w:r>
-    </w:p>
-    <w:p>
-      <w:pPr>
-        <w:pStyle w:val="BodyText"/>
-      </w:pPr>
-      <w:r>
-        <w:t>To find a tournament by date: Check the Date box. Pick the date range to search with the From and To date fields. Click “Search”. Choose the tournament you need from the list. Click “Accept”.</w:t>
-      </w:r>
-    </w:p>
-    <w:p>
-      <w:pPr>
-        <w:pStyle w:val="Heading2"/>
-      </w:pPr>
-      <w:bookmarkStart w:id="37" w:name="_Toc509165862"/>
-      <w:r>
         <w:t>List Tournaments</w:t>
       </w:r>
       <w:r>
@@ -10245,7 +10315,7 @@
       <w:r>
         <w:t>ear</w:t>
       </w:r>
-      <w:bookmarkEnd w:id="37"/>
+      <w:bookmarkEnd w:id="36"/>
       <w:r>
         <w:fldChar w:fldCharType="begin"/>
       </w:r>
@@ -10499,12 +10569,11 @@
       <w:pPr>
         <w:pStyle w:val="Heading2"/>
       </w:pPr>
-      <w:bookmarkStart w:id="38" w:name="_Toc509165863"/>
-      <w:r>
-        <w:lastRenderedPageBreak/>
+      <w:bookmarkStart w:id="37" w:name="_Toc509165863"/>
+      <w:r>
         <w:t>Reports</w:t>
       </w:r>
-      <w:bookmarkEnd w:id="38"/>
+      <w:bookmarkEnd w:id="37"/>
       <w:r>
         <w:fldChar w:fldCharType="begin"/>
       </w:r>
@@ -10814,7 +10883,131 @@
     </w:p>
     <w:p>
       <w:pPr>
-        <w:pStyle w:val="Heading2"/>
+        <w:pStyle w:val="Heading3"/>
+      </w:pPr>
+      <w:bookmarkStart w:id="38" w:name="_GoBack"/>
+      <w:bookmarkEnd w:id="38"/>
+      <w:r>
+        <w:t>Print Series by Squad</w:t>
+      </w:r>
+    </w:p>
+    <w:p>
+      <w:pPr>
+        <w:pStyle w:val="BodyText"/>
+      </w:pPr>
+      <w:r>
+        <w:t xml:space="preserve">To print a Series report displaying specific squads indicate what squads should be displayed on the printout using “Filter Series by Squad” checkboxes </w:t>
+      </w:r>
+      <w:r>
+        <w:t xml:space="preserve">on the member scores screen </w:t>
+      </w:r>
+      <w:r>
+        <w:t xml:space="preserve">before clicking the “Series” print button. The Series printout will say which squads are displayed at the top of the printout and the players will be ordered by score. </w:t>
+      </w:r>
+      <w:r>
+        <w:t xml:space="preserve"> </w:t>
+      </w:r>
+    </w:p>
+    <w:p>
+      <w:pPr>
+        <w:pStyle w:val="Caption"/>
+      </w:pPr>
+      <w:r>
+        <w:rPr>
+          <w:noProof/>
+        </w:rPr>
+        <w:lastRenderedPageBreak/>
+        <w:t xml:space="preserve">                                                       </w:t>
+      </w:r>
+      <w:r>
+        <w:t xml:space="preserve">                                  </w:t>
+      </w:r>
+      <w:r>
+        <w:drawing>
+          <wp:inline distT="0" distB="0" distL="0" distR="0" wp14:anchorId="3FE298C4" wp14:editId="43CE0D6C">
+            <wp:extent cx="1051508" cy="1600200"/>
+            <wp:effectExtent l="0" t="0" r="0" b="0"/>
+            <wp:docPr id="4" name="Picture 4" descr="C:\Users\ajosten\Desktop\seriessquadfilter.png"/>
+            <wp:cNvGraphicFramePr>
+              <a:graphicFrameLocks xmlns:a="http://schemas.openxmlformats.org/drawingml/2006/main" noChangeAspect="1"/>
+            </wp:cNvGraphicFramePr>
+            <a:graphic xmlns:a="http://schemas.openxmlformats.org/drawingml/2006/main">
+              <a:graphicData uri="http://schemas.openxmlformats.org/drawingml/2006/picture">
+                <pic:pic xmlns:pic="http://schemas.openxmlformats.org/drawingml/2006/picture">
+                  <pic:nvPicPr>
+                    <pic:cNvPr id="0" name="Picture 18" descr="C:\Users\ajosten\Desktop\seriessquadfilter.png"/>
+                    <pic:cNvPicPr>
+                      <a:picLocks noChangeAspect="1" noChangeArrowheads="1"/>
+                    </pic:cNvPicPr>
+                  </pic:nvPicPr>
+                  <pic:blipFill rotWithShape="1">
+                    <a:blip r:embed="rId32">
+                      <a:extLst>
+                        <a:ext uri="{28A0092B-C50C-407E-A947-70E740481C1C}">
+                          <a14:useLocalDpi xmlns:a14="http://schemas.microsoft.com/office/drawing/2010/main" val="0"/>
+                        </a:ext>
+                      </a:extLst>
+                    </a:blip>
+                    <a:srcRect b="38159"/>
+                    <a:stretch/>
+                  </pic:blipFill>
+                  <pic:spPr bwMode="auto">
+                    <a:xfrm>
+                      <a:off x="0" y="0"/>
+                      <a:ext cx="1051560" cy="1600279"/>
+                    </a:xfrm>
+                    <a:prstGeom prst="rect">
+                      <a:avLst/>
+                    </a:prstGeom>
+                    <a:noFill/>
+                    <a:ln>
+                      <a:noFill/>
+                    </a:ln>
+                    <a:extLst>
+                      <a:ext uri="{53640926-AAD7-44D8-BBD7-CCE9431645EC}">
+                        <a14:shadowObscured xmlns:a14="http://schemas.microsoft.com/office/drawing/2010/main"/>
+                      </a:ext>
+                    </a:extLst>
+                  </pic:spPr>
+                </pic:pic>
+              </a:graphicData>
+            </a:graphic>
+          </wp:inline>
+        </w:drawing>
+      </w:r>
+    </w:p>
+    <w:p>
+      <w:pPr>
+        <w:pStyle w:val="BodyText"/>
+        <w:jc w:val="center"/>
+      </w:pPr>
+      <w:r>
+        <w:rPr>
+          <w:sz w:val="16"/>
+        </w:rPr>
+        <w:t>Fi</w:t>
+      </w:r>
+      <w:r>
+        <w:rPr>
+          <w:sz w:val="16"/>
+        </w:rPr>
+        <w:t xml:space="preserve">gure 16b </w:t>
+      </w:r>
+      <w:r>
+        <w:rPr>
+          <w:sz w:val="16"/>
+        </w:rPr>
+        <w:t>Filter Series by Squad with four squad tournament</w:t>
+      </w:r>
+    </w:p>
+    <w:p>
+      <w:pPr>
+        <w:pStyle w:val="BodyText"/>
+      </w:pPr>
+    </w:p>
+    <w:p>
+      <w:pPr>
+        <w:pStyle w:val="BodyText"/>
         <w:sectPr>
           <w:type w:val="continuous"/>
           <w:pgSz w:w="12240" w:h="15840" w:code="1"/>
@@ -10926,11 +11119,57 @@
         <w:pStyle w:val="Caption"/>
       </w:pPr>
       <w:r>
-        <w:pict w14:anchorId="7DD6E338">
-          <v:shape id="_x0000_i1027" type="#_x0000_t75" style="width:384pt;height:197.25pt">
-            <v:imagedata r:id="rId32" o:title="TournamentResultsButtonLocation"/>
-          </v:shape>
-        </w:pict>
+        <w:rPr>
+          <w:noProof/>
+        </w:rPr>
+        <w:drawing>
+          <wp:inline distT="0" distB="0" distL="0" distR="0" wp14:anchorId="7DD6E338" wp14:editId="3DE7BB93">
+            <wp:extent cx="4876800" cy="2505075"/>
+            <wp:effectExtent l="0" t="0" r="0" b="9525"/>
+            <wp:docPr id="51" name="Picture 3" descr="TournamentResultsButtonLocation"/>
+            <wp:cNvGraphicFramePr>
+              <a:graphicFrameLocks xmlns:a="http://schemas.openxmlformats.org/drawingml/2006/main" noChangeAspect="1"/>
+            </wp:cNvGraphicFramePr>
+            <a:graphic xmlns:a="http://schemas.openxmlformats.org/drawingml/2006/main">
+              <a:graphicData uri="http://schemas.openxmlformats.org/drawingml/2006/picture">
+                <pic:pic xmlns:pic="http://schemas.openxmlformats.org/drawingml/2006/picture">
+                  <pic:nvPicPr>
+                    <pic:cNvPr id="0" name="Picture 3" descr="TournamentResultsButtonLocation"/>
+                    <pic:cNvPicPr>
+                      <a:picLocks noChangeAspect="1" noChangeArrowheads="1"/>
+                    </pic:cNvPicPr>
+                  </pic:nvPicPr>
+                  <pic:blipFill>
+                    <a:blip r:embed="rId33" cstate="print">
+                      <a:extLst>
+                        <a:ext uri="{28A0092B-C50C-407E-A947-70E740481C1C}">
+                          <a14:useLocalDpi xmlns:a14="http://schemas.microsoft.com/office/drawing/2010/main" val="0"/>
+                        </a:ext>
+                      </a:extLst>
+                    </a:blip>
+                    <a:srcRect/>
+                    <a:stretch>
+                      <a:fillRect/>
+                    </a:stretch>
+                  </pic:blipFill>
+                  <pic:spPr bwMode="auto">
+                    <a:xfrm>
+                      <a:off x="0" y="0"/>
+                      <a:ext cx="4876800" cy="2505075"/>
+                    </a:xfrm>
+                    <a:prstGeom prst="rect">
+                      <a:avLst/>
+                    </a:prstGeom>
+                    <a:noFill/>
+                    <a:ln>
+                      <a:noFill/>
+                    </a:ln>
+                  </pic:spPr>
+                </pic:pic>
+              </a:graphicData>
+            </a:graphic>
+          </wp:inline>
+        </w:drawing>
       </w:r>
       <w:r>
         <w:t>Figure 17 the location of the Tournament Results button in Member Info</w:t>
@@ -10946,11 +11185,54 @@
           <w:noProof/>
         </w:rPr>
         <w:lastRenderedPageBreak/>
-        <w:pict w14:anchorId="521A9C9C">
-          <v:shape id="_x0000_i1028" type="#_x0000_t75" style="width:384pt;height:372.75pt">
-            <v:imagedata r:id="rId33" o:title="TournamentResults"/>
-          </v:shape>
-        </w:pict>
+        <w:drawing>
+          <wp:inline distT="0" distB="0" distL="0" distR="0" wp14:anchorId="521A9C9C" wp14:editId="2DE15F70">
+            <wp:extent cx="4876800" cy="4733925"/>
+            <wp:effectExtent l="0" t="0" r="0" b="9525"/>
+            <wp:docPr id="44" name="Picture 4" descr="TournamentResults"/>
+            <wp:cNvGraphicFramePr>
+              <a:graphicFrameLocks xmlns:a="http://schemas.openxmlformats.org/drawingml/2006/main" noChangeAspect="1"/>
+            </wp:cNvGraphicFramePr>
+            <a:graphic xmlns:a="http://schemas.openxmlformats.org/drawingml/2006/main">
+              <a:graphicData uri="http://schemas.openxmlformats.org/drawingml/2006/picture">
+                <pic:pic xmlns:pic="http://schemas.openxmlformats.org/drawingml/2006/picture">
+                  <pic:nvPicPr>
+                    <pic:cNvPr id="0" name="Picture 4" descr="TournamentResults"/>
+                    <pic:cNvPicPr>
+                      <a:picLocks noChangeAspect="1" noChangeArrowheads="1"/>
+                    </pic:cNvPicPr>
+                  </pic:nvPicPr>
+                  <pic:blipFill>
+                    <a:blip r:embed="rId34">
+                      <a:extLst>
+                        <a:ext uri="{28A0092B-C50C-407E-A947-70E740481C1C}">
+                          <a14:useLocalDpi xmlns:a14="http://schemas.microsoft.com/office/drawing/2010/main" val="0"/>
+                        </a:ext>
+                      </a:extLst>
+                    </a:blip>
+                    <a:srcRect/>
+                    <a:stretch>
+                      <a:fillRect/>
+                    </a:stretch>
+                  </pic:blipFill>
+                  <pic:spPr bwMode="auto">
+                    <a:xfrm>
+                      <a:off x="0" y="0"/>
+                      <a:ext cx="4876800" cy="4733925"/>
+                    </a:xfrm>
+                    <a:prstGeom prst="rect">
+                      <a:avLst/>
+                    </a:prstGeom>
+                    <a:noFill/>
+                    <a:ln>
+                      <a:noFill/>
+                    </a:ln>
+                  </pic:spPr>
+                </pic:pic>
+              </a:graphicData>
+            </a:graphic>
+          </wp:inline>
+        </w:drawing>
       </w:r>
     </w:p>
     <w:p>
@@ -11073,12 +11355,58 @@
         <w:pStyle w:val="Caption"/>
       </w:pPr>
       <w:r>
+        <w:rPr>
+          <w:noProof/>
+        </w:rPr>
         <w:lastRenderedPageBreak/>
-        <w:pict w14:anchorId="75115AE6">
-          <v:shape id="_x0000_i1029" type="#_x0000_t75" style="width:384pt;height:234pt">
-            <v:imagedata r:id="rId34" o:title="FolderSelectionForExcelExport"/>
-          </v:shape>
-        </w:pict>
+        <w:drawing>
+          <wp:inline distT="0" distB="0" distL="0" distR="0" wp14:anchorId="75115AE6" wp14:editId="0BD6CE93">
+            <wp:extent cx="4876800" cy="2971800"/>
+            <wp:effectExtent l="0" t="0" r="0" b="0"/>
+            <wp:docPr id="39" name="Picture 5" descr="FolderSelectionForExcelExport"/>
+            <wp:cNvGraphicFramePr>
+              <a:graphicFrameLocks xmlns:a="http://schemas.openxmlformats.org/drawingml/2006/main" noChangeAspect="1"/>
+            </wp:cNvGraphicFramePr>
+            <a:graphic xmlns:a="http://schemas.openxmlformats.org/drawingml/2006/main">
+              <a:graphicData uri="http://schemas.openxmlformats.org/drawingml/2006/picture">
+                <pic:pic xmlns:pic="http://schemas.openxmlformats.org/drawingml/2006/picture">
+                  <pic:nvPicPr>
+                    <pic:cNvPr id="0" name="Picture 5" descr="FolderSelectionForExcelExport"/>
+                    <pic:cNvPicPr>
+                      <a:picLocks noChangeAspect="1" noChangeArrowheads="1"/>
+                    </pic:cNvPicPr>
+                  </pic:nvPicPr>
+                  <pic:blipFill>
+                    <a:blip r:embed="rId35">
+                      <a:extLst>
+                        <a:ext uri="{28A0092B-C50C-407E-A947-70E740481C1C}">
+                          <a14:useLocalDpi xmlns:a14="http://schemas.microsoft.com/office/drawing/2010/main" val="0"/>
+                        </a:ext>
+                      </a:extLst>
+                    </a:blip>
+                    <a:srcRect/>
+                    <a:stretch>
+                      <a:fillRect/>
+                    </a:stretch>
+                  </pic:blipFill>
+                  <pic:spPr bwMode="auto">
+                    <a:xfrm>
+                      <a:off x="0" y="0"/>
+                      <a:ext cx="4876800" cy="2971800"/>
+                    </a:xfrm>
+                    <a:prstGeom prst="rect">
+                      <a:avLst/>
+                    </a:prstGeom>
+                    <a:noFill/>
+                    <a:ln>
+                      <a:noFill/>
+                    </a:ln>
+                  </pic:spPr>
+                </pic:pic>
+              </a:graphicData>
+            </a:graphic>
+          </wp:inline>
+        </w:drawing>
       </w:r>
       <w:r>
         <w:t>Fi</w:t>
@@ -11276,12 +11604,58 @@
         <w:pStyle w:val="Caption"/>
       </w:pPr>
       <w:r>
+        <w:rPr>
+          <w:noProof/>
+        </w:rPr>
         <w:lastRenderedPageBreak/>
-        <w:pict w14:anchorId="54B7C247">
-          <v:shape id="_x0000_i1030" type="#_x0000_t75" style="width:384pt;height:201.75pt">
-            <v:imagedata r:id="rId35" o:title="9TapResultsPageOne"/>
-          </v:shape>
-        </w:pict>
+        <w:drawing>
+          <wp:inline distT="0" distB="0" distL="0" distR="0" wp14:anchorId="54B7C247" wp14:editId="3FDC200A">
+            <wp:extent cx="4876800" cy="2562225"/>
+            <wp:effectExtent l="0" t="0" r="0" b="9525"/>
+            <wp:docPr id="38" name="Picture 6" descr="9TapResultsPageOne"/>
+            <wp:cNvGraphicFramePr>
+              <a:graphicFrameLocks xmlns:a="http://schemas.openxmlformats.org/drawingml/2006/main" noChangeAspect="1"/>
+            </wp:cNvGraphicFramePr>
+            <a:graphic xmlns:a="http://schemas.openxmlformats.org/drawingml/2006/main">
+              <a:graphicData uri="http://schemas.openxmlformats.org/drawingml/2006/picture">
+                <pic:pic xmlns:pic="http://schemas.openxmlformats.org/drawingml/2006/picture">
+                  <pic:nvPicPr>
+                    <pic:cNvPr id="0" name="Picture 6" descr="9TapResultsPageOne"/>
+                    <pic:cNvPicPr>
+                      <a:picLocks noChangeAspect="1" noChangeArrowheads="1"/>
+                    </pic:cNvPicPr>
+                  </pic:nvPicPr>
+                  <pic:blipFill>
+                    <a:blip r:embed="rId36" cstate="print">
+                      <a:extLst>
+                        <a:ext uri="{28A0092B-C50C-407E-A947-70E740481C1C}">
+                          <a14:useLocalDpi xmlns:a14="http://schemas.microsoft.com/office/drawing/2010/main" val="0"/>
+                        </a:ext>
+                      </a:extLst>
+                    </a:blip>
+                    <a:srcRect/>
+                    <a:stretch>
+                      <a:fillRect/>
+                    </a:stretch>
+                  </pic:blipFill>
+                  <pic:spPr bwMode="auto">
+                    <a:xfrm>
+                      <a:off x="0" y="0"/>
+                      <a:ext cx="4876800" cy="2562225"/>
+                    </a:xfrm>
+                    <a:prstGeom prst="rect">
+                      <a:avLst/>
+                    </a:prstGeom>
+                    <a:noFill/>
+                    <a:ln>
+                      <a:noFill/>
+                    </a:ln>
+                  </pic:spPr>
+                </pic:pic>
+              </a:graphicData>
+            </a:graphic>
+          </wp:inline>
+        </w:drawing>
       </w:r>
       <w:r>
         <w:t>Figure 17c</w:t>
@@ -11300,11 +11674,57 @@
         <w:pStyle w:val="Caption"/>
       </w:pPr>
       <w:r>
-        <w:pict w14:anchorId="157F7C6A">
-          <v:shape id="_x0000_i1031" type="#_x0000_t75" style="width:383.25pt;height:201pt">
-            <v:imagedata r:id="rId36" o:title="9TapResultsPageTwo"/>
-          </v:shape>
-        </w:pict>
+        <w:rPr>
+          <w:noProof/>
+        </w:rPr>
+        <w:drawing>
+          <wp:inline distT="0" distB="0" distL="0" distR="0" wp14:anchorId="157F7C6A" wp14:editId="6639AD82">
+            <wp:extent cx="4867275" cy="2552700"/>
+            <wp:effectExtent l="0" t="0" r="9525" b="0"/>
+            <wp:docPr id="37" name="Picture 7" descr="9TapResultsPageTwo"/>
+            <wp:cNvGraphicFramePr>
+              <a:graphicFrameLocks xmlns:a="http://schemas.openxmlformats.org/drawingml/2006/main" noChangeAspect="1"/>
+            </wp:cNvGraphicFramePr>
+            <a:graphic xmlns:a="http://schemas.openxmlformats.org/drawingml/2006/main">
+              <a:graphicData uri="http://schemas.openxmlformats.org/drawingml/2006/picture">
+                <pic:pic xmlns:pic="http://schemas.openxmlformats.org/drawingml/2006/picture">
+                  <pic:nvPicPr>
+                    <pic:cNvPr id="0" name="Picture 7" descr="9TapResultsPageTwo"/>
+                    <pic:cNvPicPr>
+                      <a:picLocks noChangeAspect="1" noChangeArrowheads="1"/>
+                    </pic:cNvPicPr>
+                  </pic:nvPicPr>
+                  <pic:blipFill>
+                    <a:blip r:embed="rId37" cstate="print">
+                      <a:extLst>
+                        <a:ext uri="{28A0092B-C50C-407E-A947-70E740481C1C}">
+                          <a14:useLocalDpi xmlns:a14="http://schemas.microsoft.com/office/drawing/2010/main" val="0"/>
+                        </a:ext>
+                      </a:extLst>
+                    </a:blip>
+                    <a:srcRect/>
+                    <a:stretch>
+                      <a:fillRect/>
+                    </a:stretch>
+                  </pic:blipFill>
+                  <pic:spPr bwMode="auto">
+                    <a:xfrm>
+                      <a:off x="0" y="0"/>
+                      <a:ext cx="4867275" cy="2552700"/>
+                    </a:xfrm>
+                    <a:prstGeom prst="rect">
+                      <a:avLst/>
+                    </a:prstGeom>
+                    <a:noFill/>
+                    <a:ln>
+                      <a:noFill/>
+                    </a:ln>
+                  </pic:spPr>
+                </pic:pic>
+              </a:graphicData>
+            </a:graphic>
+          </wp:inline>
+        </w:drawing>
       </w:r>
       <w:r>
         <w:t>Figure 17d</w:t>
@@ -11323,11 +11743,58 @@
         <w:pStyle w:val="Caption"/>
       </w:pPr>
       <w:r>
-        <w:pict w14:anchorId="6663EEF2">
-          <v:shape id="_x0000_i1032" type="#_x0000_t75" style="width:384pt;height:118.5pt">
-            <v:imagedata r:id="rId37" o:title="9TapPlayerCheck"/>
-          </v:shape>
-        </w:pict>
+        <w:rPr>
+          <w:noProof/>
+        </w:rPr>
+        <w:lastRenderedPageBreak/>
+        <w:drawing>
+          <wp:inline distT="0" distB="0" distL="0" distR="0" wp14:anchorId="6663EEF2" wp14:editId="4C99F0AD">
+            <wp:extent cx="4876800" cy="1504950"/>
+            <wp:effectExtent l="0" t="0" r="0" b="0"/>
+            <wp:docPr id="36" name="Picture 8" descr="9TapPlayerCheck"/>
+            <wp:cNvGraphicFramePr>
+              <a:graphicFrameLocks xmlns:a="http://schemas.openxmlformats.org/drawingml/2006/main" noChangeAspect="1"/>
+            </wp:cNvGraphicFramePr>
+            <a:graphic xmlns:a="http://schemas.openxmlformats.org/drawingml/2006/main">
+              <a:graphicData uri="http://schemas.openxmlformats.org/drawingml/2006/picture">
+                <pic:pic xmlns:pic="http://schemas.openxmlformats.org/drawingml/2006/picture">
+                  <pic:nvPicPr>
+                    <pic:cNvPr id="0" name="Picture 8" descr="9TapPlayerCheck"/>
+                    <pic:cNvPicPr>
+                      <a:picLocks noChangeAspect="1" noChangeArrowheads="1"/>
+                    </pic:cNvPicPr>
+                  </pic:nvPicPr>
+                  <pic:blipFill>
+                    <a:blip r:embed="rId38">
+                      <a:extLst>
+                        <a:ext uri="{28A0092B-C50C-407E-A947-70E740481C1C}">
+                          <a14:useLocalDpi xmlns:a14="http://schemas.microsoft.com/office/drawing/2010/main" val="0"/>
+                        </a:ext>
+                      </a:extLst>
+                    </a:blip>
+                    <a:srcRect/>
+                    <a:stretch>
+                      <a:fillRect/>
+                    </a:stretch>
+                  </pic:blipFill>
+                  <pic:spPr bwMode="auto">
+                    <a:xfrm>
+                      <a:off x="0" y="0"/>
+                      <a:ext cx="4876800" cy="1504950"/>
+                    </a:xfrm>
+                    <a:prstGeom prst="rect">
+                      <a:avLst/>
+                    </a:prstGeom>
+                    <a:noFill/>
+                    <a:ln>
+                      <a:noFill/>
+                    </a:ln>
+                  </pic:spPr>
+                </pic:pic>
+              </a:graphicData>
+            </a:graphic>
+          </wp:inline>
+        </w:drawing>
       </w:r>
       <w:r>
         <w:t xml:space="preserve">Figure 17e </w:t>
@@ -11436,11 +11903,57 @@
         <w:pStyle w:val="Caption"/>
       </w:pPr>
       <w:r>
-        <w:pict w14:anchorId="121C96E1">
-          <v:shape id="_x0000_i1033" type="#_x0000_t75" style="width:383.25pt;height:199.5pt">
-            <v:imagedata r:id="rId40" o:title="PointToFinalizeTournament"/>
-          </v:shape>
-        </w:pict>
+        <w:rPr>
+          <w:noProof/>
+        </w:rPr>
+        <w:drawing>
+          <wp:inline distT="0" distB="0" distL="0" distR="0" wp14:anchorId="121C96E1" wp14:editId="4A822B7D">
+            <wp:extent cx="4867275" cy="2533650"/>
+            <wp:effectExtent l="0" t="0" r="9525" b="0"/>
+            <wp:docPr id="34" name="Picture 9" descr="PointToFinalizeTournament"/>
+            <wp:cNvGraphicFramePr>
+              <a:graphicFrameLocks xmlns:a="http://schemas.openxmlformats.org/drawingml/2006/main" noChangeAspect="1"/>
+            </wp:cNvGraphicFramePr>
+            <a:graphic xmlns:a="http://schemas.openxmlformats.org/drawingml/2006/main">
+              <a:graphicData uri="http://schemas.openxmlformats.org/drawingml/2006/picture">
+                <pic:pic xmlns:pic="http://schemas.openxmlformats.org/drawingml/2006/picture">
+                  <pic:nvPicPr>
+                    <pic:cNvPr id="0" name="Picture 9" descr="PointToFinalizeTournament"/>
+                    <pic:cNvPicPr>
+                      <a:picLocks noChangeAspect="1" noChangeArrowheads="1"/>
+                    </pic:cNvPicPr>
+                  </pic:nvPicPr>
+                  <pic:blipFill>
+                    <a:blip r:embed="rId41" cstate="print">
+                      <a:extLst>
+                        <a:ext uri="{28A0092B-C50C-407E-A947-70E740481C1C}">
+                          <a14:useLocalDpi xmlns:a14="http://schemas.microsoft.com/office/drawing/2010/main" val="0"/>
+                        </a:ext>
+                      </a:extLst>
+                    </a:blip>
+                    <a:srcRect/>
+                    <a:stretch>
+                      <a:fillRect/>
+                    </a:stretch>
+                  </pic:blipFill>
+                  <pic:spPr bwMode="auto">
+                    <a:xfrm>
+                      <a:off x="0" y="0"/>
+                      <a:ext cx="4867275" cy="2533650"/>
+                    </a:xfrm>
+                    <a:prstGeom prst="rect">
+                      <a:avLst/>
+                    </a:prstGeom>
+                    <a:noFill/>
+                    <a:ln>
+                      <a:noFill/>
+                    </a:ln>
+                  </pic:spPr>
+                </pic:pic>
+              </a:graphicData>
+            </a:graphic>
+          </wp:inline>
+        </w:drawing>
       </w:r>
       <w:r>
         <w:t>Figure 18: location of Finalize Tournament button.</w:t>
@@ -11474,7 +11987,11 @@
         <w:t>Director</w:t>
       </w:r>
       <w:r>
-        <w:t>, while an orange cell is a score that is 50 or more below a player’s average score for a given game</w:t>
+        <w:t xml:space="preserve">, while an orange cell is a score that is 50 or more below a player’s average </w:t>
+      </w:r>
+      <w:r>
+        <w:lastRenderedPageBreak/>
+        <w:t>score for a given game</w:t>
       </w:r>
       <w:r>
         <w:t xml:space="preserve">; </w:t>
@@ -11535,7 +12052,6 @@
         <w:pStyle w:val="BodyText"/>
       </w:pPr>
       <w:r>
-        <w:lastRenderedPageBreak/>
         <w:t>The data in the table can a</w:t>
       </w:r>
       <w:r>
@@ -11731,11 +12247,54 @@
         <w:rPr>
           <w:noProof/>
         </w:rPr>
-        <w:pict w14:anchorId="225EA388">
-          <v:shape id="_x0000_i1034" type="#_x0000_t75" style="width:384pt;height:222.75pt">
-            <v:imagedata r:id="rId41" o:title="FinalizeTournamentWindow"/>
-          </v:shape>
-        </w:pict>
+        <w:drawing>
+          <wp:inline distT="0" distB="0" distL="0" distR="0" wp14:anchorId="225EA388" wp14:editId="72F2860C">
+            <wp:extent cx="4876800" cy="2828925"/>
+            <wp:effectExtent l="0" t="0" r="0" b="9525"/>
+            <wp:docPr id="33" name="Picture 10" descr="FinalizeTournamentWindow"/>
+            <wp:cNvGraphicFramePr>
+              <a:graphicFrameLocks xmlns:a="http://schemas.openxmlformats.org/drawingml/2006/main" noChangeAspect="1"/>
+            </wp:cNvGraphicFramePr>
+            <a:graphic xmlns:a="http://schemas.openxmlformats.org/drawingml/2006/main">
+              <a:graphicData uri="http://schemas.openxmlformats.org/drawingml/2006/picture">
+                <pic:pic xmlns:pic="http://schemas.openxmlformats.org/drawingml/2006/picture">
+                  <pic:nvPicPr>
+                    <pic:cNvPr id="0" name="Picture 10" descr="FinalizeTournamentWindow"/>
+                    <pic:cNvPicPr>
+                      <a:picLocks noChangeAspect="1" noChangeArrowheads="1"/>
+                    </pic:cNvPicPr>
+                  </pic:nvPicPr>
+                  <pic:blipFill>
+                    <a:blip r:embed="rId42" cstate="print">
+                      <a:extLst>
+                        <a:ext uri="{28A0092B-C50C-407E-A947-70E740481C1C}">
+                          <a14:useLocalDpi xmlns:a14="http://schemas.microsoft.com/office/drawing/2010/main" val="0"/>
+                        </a:ext>
+                      </a:extLst>
+                    </a:blip>
+                    <a:srcRect/>
+                    <a:stretch>
+                      <a:fillRect/>
+                    </a:stretch>
+                  </pic:blipFill>
+                  <pic:spPr bwMode="auto">
+                    <a:xfrm>
+                      <a:off x="0" y="0"/>
+                      <a:ext cx="4876800" cy="2828925"/>
+                    </a:xfrm>
+                    <a:prstGeom prst="rect">
+                      <a:avLst/>
+                    </a:prstGeom>
+                    <a:noFill/>
+                    <a:ln>
+                      <a:noFill/>
+                    </a:ln>
+                  </pic:spPr>
+                </pic:pic>
+              </a:graphicData>
+            </a:graphic>
+          </wp:inline>
+        </w:drawing>
       </w:r>
     </w:p>
     <w:p>
@@ -11872,76 +12431,6 @@
             <wp:extent cx="526212" cy="841940"/>
             <wp:effectExtent l="0" t="0" r="7620" b="0"/>
             <wp:docPr id="27" name="Picture 27"/>
-            <wp:cNvGraphicFramePr>
-              <a:graphicFrameLocks xmlns:a="http://schemas.openxmlformats.org/drawingml/2006/main" noChangeAspect="1"/>
-            </wp:cNvGraphicFramePr>
-            <a:graphic xmlns:a="http://schemas.openxmlformats.org/drawingml/2006/main">
-              <a:graphicData uri="http://schemas.openxmlformats.org/drawingml/2006/picture">
-                <pic:pic xmlns:pic="http://schemas.openxmlformats.org/drawingml/2006/picture">
-                  <pic:nvPicPr>
-                    <pic:cNvPr id="1" name=""/>
-                    <pic:cNvPicPr/>
-                  </pic:nvPicPr>
-                  <pic:blipFill>
-                    <a:blip r:embed="rId42"/>
-                    <a:stretch>
-                      <a:fillRect/>
-                    </a:stretch>
-                  </pic:blipFill>
-                  <pic:spPr>
-                    <a:xfrm>
-                      <a:off x="0" y="0"/>
-                      <a:ext cx="585111" cy="936179"/>
-                    </a:xfrm>
-                    <a:prstGeom prst="rect">
-                      <a:avLst/>
-                    </a:prstGeom>
-                  </pic:spPr>
-                </pic:pic>
-              </a:graphicData>
-            </a:graphic>
-          </wp:inline>
-        </w:drawing>
-      </w:r>
-    </w:p>
-    <w:p>
-      <w:pPr>
-        <w:pStyle w:val="BodyText"/>
-        <w:keepNext/>
-        <w:numPr>
-          <w:ilvl w:val="0"/>
-          <w:numId w:val="10"/>
-        </w:numPr>
-      </w:pPr>
-      <w:r>
-        <w:rPr>
-          <w:b/>
-          <w:u w:val="single"/>
-        </w:rPr>
-        <w:t>GameID</w:t>
-      </w:r>
-      <w:r>
-        <w:t xml:space="preserve"> – the game identifier for the tournament.</w:t>
-      </w:r>
-    </w:p>
-    <w:p>
-      <w:pPr>
-        <w:pStyle w:val="BodyText"/>
-        <w:keepNext/>
-        <w:ind w:left="720"/>
-      </w:pPr>
-      <w:r>
-        <w:t xml:space="preserve">  </w:t>
-      </w:r>
-      <w:r>
-        <w:rPr>
-          <w:noProof/>
-        </w:rPr>
-        <w:drawing>
-          <wp:inline distT="0" distB="0" distL="0" distR="0" wp14:anchorId="4EB199F8" wp14:editId="0E6CACF1">
-            <wp:extent cx="473914" cy="770111"/>
-            <wp:effectExtent l="0" t="0" r="2540" b="0"/>
-            <wp:docPr id="29" name="Picture 29"/>
             <wp:cNvGraphicFramePr>
               <a:graphicFrameLocks xmlns:a="http://schemas.openxmlformats.org/drawingml/2006/main" noChangeAspect="1"/>
             </wp:cNvGraphicFramePr>
@@ -11961,7 +12450,7 @@
                   <pic:spPr>
                     <a:xfrm>
                       <a:off x="0" y="0"/>
-                      <a:ext cx="506426" cy="822944"/>
+                      <a:ext cx="585111" cy="936179"/>
                     </a:xfrm>
                     <a:prstGeom prst="rect">
                       <a:avLst/>
@@ -11973,9 +12462,6 @@
           </wp:inline>
         </w:drawing>
       </w:r>
-      <w:r>
-        <w:t xml:space="preserve">   </w:t>
-      </w:r>
     </w:p>
     <w:p>
       <w:pPr>
@@ -11991,19 +12477,10 @@
           <w:b/>
           <w:u w:val="single"/>
         </w:rPr>
-        <w:t>Game 1-4 and ValidScore 1-4</w:t>
-      </w:r>
-      <w:r>
-        <w:t xml:space="preserve"> - t</w:t>
-      </w:r>
-      <w:r>
-        <w:t>hat player’s score for each game</w:t>
-      </w:r>
-      <w:r>
-        <w:t xml:space="preserve"> they played, and a checkbox used to determine whether that player’s score is valid for that set of pins. E.G. a sandbagged score will be</w:t>
-      </w:r>
-      <w:r>
-        <w:t xml:space="preserve"> unchecked and thus invalidated.</w:t>
+        <w:t>GameID</w:t>
+      </w:r>
+      <w:r>
+        <w:t xml:space="preserve"> – the game identifier for the tournament.</w:t>
       </w:r>
     </w:p>
     <w:p>
@@ -12011,25 +12488,19 @@
         <w:pStyle w:val="BodyText"/>
         <w:keepNext/>
         <w:ind w:left="720"/>
+      </w:pPr>
+      <w:r>
+        <w:t xml:space="preserve">  </w:t>
+      </w:r>
+      <w:r>
         <w:rPr>
           <w:noProof/>
         </w:rPr>
-      </w:pPr>
-      <w:r>
-        <w:rPr>
-          <w:noProof/>
-        </w:rPr>
-        <w:t xml:space="preserve"> </w:t>
-      </w:r>
-      <w:r>
-        <w:rPr>
-          <w:noProof/>
-        </w:rPr>
         <w:drawing>
-          <wp:inline distT="0" distB="0" distL="0" distR="0" wp14:anchorId="7A3357F6" wp14:editId="1EC28456">
-            <wp:extent cx="491706" cy="697328"/>
-            <wp:effectExtent l="0" t="0" r="3810" b="7620"/>
-            <wp:docPr id="31" name="Picture 31"/>
+          <wp:inline distT="0" distB="0" distL="0" distR="0" wp14:anchorId="4EB199F8" wp14:editId="0E6CACF1">
+            <wp:extent cx="473914" cy="770111"/>
+            <wp:effectExtent l="0" t="0" r="2540" b="0"/>
+            <wp:docPr id="29" name="Picture 29"/>
             <wp:cNvGraphicFramePr>
               <a:graphicFrameLocks xmlns:a="http://schemas.openxmlformats.org/drawingml/2006/main" noChangeAspect="1"/>
             </wp:cNvGraphicFramePr>
@@ -12049,7 +12520,7 @@
                   <pic:spPr>
                     <a:xfrm>
                       <a:off x="0" y="0"/>
-                      <a:ext cx="515572" cy="731175"/>
+                      <a:ext cx="506426" cy="822944"/>
                     </a:xfrm>
                     <a:prstGeom prst="rect">
                       <a:avLst/>
@@ -12061,6 +12532,9 @@
           </wp:inline>
         </w:drawing>
       </w:r>
+      <w:r>
+        <w:t xml:space="preserve">   </w:t>
+      </w:r>
     </w:p>
     <w:p>
       <w:pPr>
@@ -12076,10 +12550,19 @@
           <w:b/>
           <w:u w:val="single"/>
         </w:rPr>
-        <w:t>Scratch Total</w:t>
-      </w:r>
-      <w:r>
-        <w:t xml:space="preserve"> – The player’s total score before handicaps are taken into account.</w:t>
+        <w:t>Game 1-4 and ValidScore 1-4</w:t>
+      </w:r>
+      <w:r>
+        <w:t xml:space="preserve"> - t</w:t>
+      </w:r>
+      <w:r>
+        <w:t>hat player’s score for each game</w:t>
+      </w:r>
+      <w:r>
+        <w:t xml:space="preserve"> they played, and a checkbox used to determine whether that player’s score is valid for that set of pins. E.G. a sandbagged score will be</w:t>
+      </w:r>
+      <w:r>
+        <w:t xml:space="preserve"> unchecked and thus invalidated.</w:t>
       </w:r>
     </w:p>
     <w:p>
@@ -12087,16 +12570,25 @@
         <w:pStyle w:val="BodyText"/>
         <w:keepNext/>
         <w:ind w:left="720"/>
-      </w:pPr>
-      <w:r>
         <w:rPr>
           <w:noProof/>
         </w:rPr>
+      </w:pPr>
+      <w:r>
+        <w:rPr>
+          <w:noProof/>
+        </w:rPr>
+        <w:t xml:space="preserve"> </w:t>
+      </w:r>
+      <w:r>
+        <w:rPr>
+          <w:noProof/>
+        </w:rPr>
         <w:drawing>
-          <wp:inline distT="0" distB="0" distL="0" distR="0" wp14:anchorId="275B9669" wp14:editId="7FA5F256">
-            <wp:extent cx="542925" cy="752475"/>
-            <wp:effectExtent l="0" t="0" r="9525" b="9525"/>
-            <wp:docPr id="35" name="Picture 35"/>
+          <wp:inline distT="0" distB="0" distL="0" distR="0" wp14:anchorId="7A3357F6" wp14:editId="1EC28456">
+            <wp:extent cx="491706" cy="697328"/>
+            <wp:effectExtent l="0" t="0" r="3810" b="7620"/>
+            <wp:docPr id="31" name="Picture 31"/>
             <wp:cNvGraphicFramePr>
               <a:graphicFrameLocks xmlns:a="http://schemas.openxmlformats.org/drawingml/2006/main" noChangeAspect="1"/>
             </wp:cNvGraphicFramePr>
@@ -12116,7 +12608,7 @@
                   <pic:spPr>
                     <a:xfrm>
                       <a:off x="0" y="0"/>
-                      <a:ext cx="542925" cy="752475"/>
+                      <a:ext cx="515572" cy="731175"/>
                     </a:xfrm>
                     <a:prstGeom prst="rect">
                       <a:avLst/>
@@ -12143,10 +12635,10 @@
           <w:b/>
           <w:u w:val="single"/>
         </w:rPr>
-        <w:t xml:space="preserve">Handicap Total </w:t>
-      </w:r>
-      <w:r>
-        <w:t>– The player’s total score after handicaps are taken into account.</w:t>
+        <w:t>Scratch Total</w:t>
+      </w:r>
+      <w:r>
+        <w:t xml:space="preserve"> – The player’s total score before handicaps are taken into account.</w:t>
       </w:r>
     </w:p>
     <w:p>
@@ -12160,10 +12652,10 @@
           <w:noProof/>
         </w:rPr>
         <w:drawing>
-          <wp:inline distT="0" distB="0" distL="0" distR="0" wp14:anchorId="1C4ED64A" wp14:editId="177F90E7">
-            <wp:extent cx="533400" cy="752475"/>
-            <wp:effectExtent l="0" t="0" r="0" b="9525"/>
-            <wp:docPr id="40" name="Picture 40"/>
+          <wp:inline distT="0" distB="0" distL="0" distR="0" wp14:anchorId="275B9669" wp14:editId="7FA5F256">
+            <wp:extent cx="542925" cy="752475"/>
+            <wp:effectExtent l="0" t="0" r="9525" b="9525"/>
+            <wp:docPr id="35" name="Picture 35"/>
             <wp:cNvGraphicFramePr>
               <a:graphicFrameLocks xmlns:a="http://schemas.openxmlformats.org/drawingml/2006/main" noChangeAspect="1"/>
             </wp:cNvGraphicFramePr>
@@ -12183,7 +12675,7 @@
                   <pic:spPr>
                     <a:xfrm>
                       <a:off x="0" y="0"/>
-                      <a:ext cx="533400" cy="752475"/>
+                      <a:ext cx="542925" cy="752475"/>
                     </a:xfrm>
                     <a:prstGeom prst="rect">
                       <a:avLst/>
@@ -12210,10 +12702,10 @@
           <w:b/>
           <w:u w:val="single"/>
         </w:rPr>
-        <w:t>Entry AVG</w:t>
-      </w:r>
-      <w:r>
-        <w:t xml:space="preserve"> – The average for the current entry of the player.</w:t>
+        <w:t xml:space="preserve">Handicap Total </w:t>
+      </w:r>
+      <w:r>
+        <w:t>– The player’s total score after handicaps are taken into account.</w:t>
       </w:r>
     </w:p>
     <w:p>
@@ -12226,12 +12718,11 @@
         <w:rPr>
           <w:noProof/>
         </w:rPr>
-        <w:lastRenderedPageBreak/>
         <w:drawing>
-          <wp:inline distT="0" distB="0" distL="0" distR="0" wp14:anchorId="13E6B45B" wp14:editId="14A1B0A6">
-            <wp:extent cx="533400" cy="733425"/>
+          <wp:inline distT="0" distB="0" distL="0" distR="0" wp14:anchorId="1C4ED64A" wp14:editId="177F90E7">
+            <wp:extent cx="533400" cy="752475"/>
             <wp:effectExtent l="0" t="0" r="0" b="9525"/>
-            <wp:docPr id="41" name="Picture 41"/>
+            <wp:docPr id="40" name="Picture 40"/>
             <wp:cNvGraphicFramePr>
               <a:graphicFrameLocks xmlns:a="http://schemas.openxmlformats.org/drawingml/2006/main" noChangeAspect="1"/>
             </wp:cNvGraphicFramePr>
@@ -12251,7 +12742,7 @@
                   <pic:spPr>
                     <a:xfrm>
                       <a:off x="0" y="0"/>
-                      <a:ext cx="533400" cy="733425"/>
+                      <a:ext cx="533400" cy="752475"/>
                     </a:xfrm>
                     <a:prstGeom prst="rect">
                       <a:avLst/>
@@ -12278,10 +12769,10 @@
           <w:b/>
           <w:u w:val="single"/>
         </w:rPr>
-        <w:t>30 Entry AVG</w:t>
-      </w:r>
-      <w:r>
-        <w:t xml:space="preserve"> – The average for the last 30 entries of the player.</w:t>
+        <w:t>Entry AVG</w:t>
+      </w:r>
+      <w:r>
+        <w:t xml:space="preserve"> – The average for the current entry of the player.</w:t>
       </w:r>
     </w:p>
     <w:p>
@@ -12294,11 +12785,12 @@
         <w:rPr>
           <w:noProof/>
         </w:rPr>
+        <w:lastRenderedPageBreak/>
         <w:drawing>
-          <wp:inline distT="0" distB="0" distL="0" distR="0" wp14:anchorId="1A027C84" wp14:editId="6C6F8DDF">
-            <wp:extent cx="514350" cy="781050"/>
-            <wp:effectExtent l="0" t="0" r="0" b="0"/>
-            <wp:docPr id="42" name="Picture 42"/>
+          <wp:inline distT="0" distB="0" distL="0" distR="0" wp14:anchorId="13E6B45B" wp14:editId="14A1B0A6">
+            <wp:extent cx="533400" cy="733425"/>
+            <wp:effectExtent l="0" t="0" r="0" b="9525"/>
+            <wp:docPr id="41" name="Picture 41"/>
             <wp:cNvGraphicFramePr>
               <a:graphicFrameLocks xmlns:a="http://schemas.openxmlformats.org/drawingml/2006/main" noChangeAspect="1"/>
             </wp:cNvGraphicFramePr>
@@ -12318,7 +12810,7 @@
                   <pic:spPr>
                     <a:xfrm>
                       <a:off x="0" y="0"/>
-                      <a:ext cx="514350" cy="781050"/>
+                      <a:ext cx="533400" cy="733425"/>
                     </a:xfrm>
                     <a:prstGeom prst="rect">
                       <a:avLst/>
@@ -12345,19 +12837,10 @@
           <w:b/>
           <w:u w:val="single"/>
         </w:rPr>
-        <w:t>ADJ AVG</w:t>
-      </w:r>
-      <w:r>
-        <w:t xml:space="preserve"> – Adjusted Average.</w:t>
-      </w:r>
-      <w:r>
-        <w:t xml:space="preserve"> An average that must be manually entered by the </w:t>
-      </w:r>
-      <w:r>
-        <w:t>Director</w:t>
-      </w:r>
-      <w:r>
-        <w:t>.</w:t>
+        <w:t>30 Entry AVG</w:t>
+      </w:r>
+      <w:r>
+        <w:t xml:space="preserve"> – The average for the last 30 entries of the player.</w:t>
       </w:r>
     </w:p>
     <w:p>
@@ -12371,10 +12854,10 @@
           <w:noProof/>
         </w:rPr>
         <w:drawing>
-          <wp:inline distT="0" distB="0" distL="0" distR="0" wp14:anchorId="0EA28D84" wp14:editId="0D1BAAD7">
-            <wp:extent cx="514350" cy="762000"/>
+          <wp:inline distT="0" distB="0" distL="0" distR="0" wp14:anchorId="1A027C84" wp14:editId="6C6F8DDF">
+            <wp:extent cx="514350" cy="781050"/>
             <wp:effectExtent l="0" t="0" r="0" b="0"/>
-            <wp:docPr id="43" name="Picture 43"/>
+            <wp:docPr id="42" name="Picture 42"/>
             <wp:cNvGraphicFramePr>
               <a:graphicFrameLocks xmlns:a="http://schemas.openxmlformats.org/drawingml/2006/main" noChangeAspect="1"/>
             </wp:cNvGraphicFramePr>
@@ -12394,7 +12877,7 @@
                   <pic:spPr>
                     <a:xfrm>
                       <a:off x="0" y="0"/>
-                      <a:ext cx="514350" cy="762000"/>
+                      <a:ext cx="514350" cy="781050"/>
                     </a:xfrm>
                     <a:prstGeom prst="rect">
                       <a:avLst/>
@@ -12421,26 +12904,19 @@
           <w:b/>
           <w:u w:val="single"/>
         </w:rPr>
+        <w:t>ADJ AVG</w:t>
+      </w:r>
+      <w:r>
+        <w:t xml:space="preserve"> – Adjusted Average.</w:t>
+      </w:r>
+      <w:r>
+        <w:t xml:space="preserve"> An average that must be manually entered by the </w:t>
+      </w:r>
+      <w:r>
         <w:t>Director</w:t>
       </w:r>
       <w:r>
-        <w:rPr>
-          <w:b/>
-          <w:u w:val="single"/>
-        </w:rPr>
-        <w:t xml:space="preserve"> Check</w:t>
-      </w:r>
-      <w:r>
-        <w:t xml:space="preserve"> – Checkbox to confirm a </w:t>
-      </w:r>
-      <w:r>
-        <w:t>Director</w:t>
-      </w:r>
-      <w:r>
-        <w:t xml:space="preserve"> has checked and validated</w:t>
-      </w:r>
-      <w:r>
-        <w:t xml:space="preserve"> a player’s score.</w:t>
+        <w:t>.</w:t>
       </w:r>
     </w:p>
     <w:p>
@@ -12454,10 +12930,10 @@
           <w:noProof/>
         </w:rPr>
         <w:drawing>
-          <wp:inline distT="0" distB="0" distL="0" distR="0" wp14:anchorId="7975C22F" wp14:editId="35A77B3D">
-            <wp:extent cx="542925" cy="733425"/>
-            <wp:effectExtent l="0" t="0" r="9525" b="9525"/>
-            <wp:docPr id="45" name="Picture 45"/>
+          <wp:inline distT="0" distB="0" distL="0" distR="0" wp14:anchorId="0EA28D84" wp14:editId="0D1BAAD7">
+            <wp:extent cx="514350" cy="762000"/>
+            <wp:effectExtent l="0" t="0" r="0" b="0"/>
+            <wp:docPr id="43" name="Picture 43"/>
             <wp:cNvGraphicFramePr>
               <a:graphicFrameLocks xmlns:a="http://schemas.openxmlformats.org/drawingml/2006/main" noChangeAspect="1"/>
             </wp:cNvGraphicFramePr>
@@ -12477,7 +12953,7 @@
                   <pic:spPr>
                     <a:xfrm>
                       <a:off x="0" y="0"/>
-                      <a:ext cx="542925" cy="733425"/>
+                      <a:ext cx="514350" cy="762000"/>
                     </a:xfrm>
                     <a:prstGeom prst="rect">
                       <a:avLst/>
@@ -12498,33 +12974,32 @@
           <w:ilvl w:val="0"/>
           <w:numId w:val="10"/>
         </w:numPr>
+      </w:pPr>
+      <w:r>
         <w:rPr>
           <w:b/>
           <w:u w:val="single"/>
         </w:rPr>
-      </w:pPr>
+        <w:t>Director</w:t>
+      </w:r>
       <w:r>
         <w:rPr>
           <w:b/>
           <w:u w:val="single"/>
         </w:rPr>
-        <w:t>Squad</w:t>
-      </w:r>
-      <w:r>
-        <w:rPr>
-          <w:b/>
-          <w:u w:val="single"/>
-        </w:rPr>
-        <w:t xml:space="preserve"> </w:t>
-      </w:r>
-      <w:r>
-        <w:t>–</w:t>
-      </w:r>
-      <w:r>
-        <w:t xml:space="preserve"> T</w:t>
-      </w:r>
-      <w:r>
-        <w:t>he squad of this player’s game.</w:t>
+        <w:t xml:space="preserve"> Check</w:t>
+      </w:r>
+      <w:r>
+        <w:t xml:space="preserve"> – Checkbox to confirm a </w:t>
+      </w:r>
+      <w:r>
+        <w:t>Director</w:t>
+      </w:r>
+      <w:r>
+        <w:t xml:space="preserve"> has checked and validated</w:t>
+      </w:r>
+      <w:r>
+        <w:t xml:space="preserve"> a player’s score.</w:t>
       </w:r>
     </w:p>
     <w:p>
@@ -12532,20 +13007,16 @@
         <w:pStyle w:val="BodyText"/>
         <w:keepNext/>
         <w:ind w:left="720"/>
-        <w:rPr>
-          <w:b/>
-          <w:u w:val="single"/>
-        </w:rPr>
       </w:pPr>
       <w:r>
         <w:rPr>
           <w:noProof/>
         </w:rPr>
         <w:drawing>
-          <wp:inline distT="0" distB="0" distL="0" distR="0" wp14:anchorId="752F97DE" wp14:editId="3DE20F24">
-            <wp:extent cx="504825" cy="781050"/>
-            <wp:effectExtent l="0" t="0" r="9525" b="0"/>
-            <wp:docPr id="46" name="Picture 46"/>
+          <wp:inline distT="0" distB="0" distL="0" distR="0" wp14:anchorId="7975C22F" wp14:editId="35A77B3D">
+            <wp:extent cx="542925" cy="733425"/>
+            <wp:effectExtent l="0" t="0" r="9525" b="9525"/>
+            <wp:docPr id="45" name="Picture 45"/>
             <wp:cNvGraphicFramePr>
               <a:graphicFrameLocks xmlns:a="http://schemas.openxmlformats.org/drawingml/2006/main" noChangeAspect="1"/>
             </wp:cNvGraphicFramePr>
@@ -12565,7 +13036,7 @@
                   <pic:spPr>
                     <a:xfrm>
                       <a:off x="0" y="0"/>
-                      <a:ext cx="504825" cy="781050"/>
+                      <a:ext cx="542925" cy="733425"/>
                     </a:xfrm>
                     <a:prstGeom prst="rect">
                       <a:avLst/>
@@ -12596,10 +13067,23 @@
           <w:b/>
           <w:u w:val="single"/>
         </w:rPr>
-        <w:t xml:space="preserve">Handicap </w:t>
-      </w:r>
-      <w:r>
-        <w:t>– The player’s current handicap.</w:t>
+        <w:t>Squad</w:t>
+      </w:r>
+      <w:r>
+        <w:rPr>
+          <w:b/>
+          <w:u w:val="single"/>
+        </w:rPr>
+        <w:t xml:space="preserve"> </w:t>
+      </w:r>
+      <w:r>
+        <w:t>–</w:t>
+      </w:r>
+      <w:r>
+        <w:t xml:space="preserve"> T</w:t>
+      </w:r>
+      <w:r>
+        <w:t>he squad of this player’s game.</w:t>
       </w:r>
     </w:p>
     <w:p>
@@ -12617,10 +13101,10 @@
           <w:noProof/>
         </w:rPr>
         <w:drawing>
-          <wp:inline distT="0" distB="0" distL="0" distR="0" wp14:anchorId="246BBCB5" wp14:editId="5433436B">
-            <wp:extent cx="561975" cy="762000"/>
+          <wp:inline distT="0" distB="0" distL="0" distR="0" wp14:anchorId="752F97DE" wp14:editId="3DE20F24">
+            <wp:extent cx="504825" cy="781050"/>
             <wp:effectExtent l="0" t="0" r="9525" b="0"/>
-            <wp:docPr id="47" name="Picture 47"/>
+            <wp:docPr id="46" name="Picture 46"/>
             <wp:cNvGraphicFramePr>
               <a:graphicFrameLocks xmlns:a="http://schemas.openxmlformats.org/drawingml/2006/main" noChangeAspect="1"/>
             </wp:cNvGraphicFramePr>
@@ -12640,7 +13124,7 @@
                   <pic:spPr>
                     <a:xfrm>
                       <a:off x="0" y="0"/>
-                      <a:ext cx="561975" cy="762000"/>
+                      <a:ext cx="504825" cy="781050"/>
                     </a:xfrm>
                     <a:prstGeom prst="rect">
                       <a:avLst/>
@@ -12671,10 +13155,10 @@
           <w:b/>
           <w:u w:val="single"/>
         </w:rPr>
-        <w:t>Bonus</w:t>
-      </w:r>
-      <w:r>
-        <w:t xml:space="preserve"> – Current player’s bonus.</w:t>
+        <w:t xml:space="preserve">Handicap </w:t>
+      </w:r>
+      <w:r>
+        <w:t>– The player’s current handicap.</w:t>
       </w:r>
     </w:p>
     <w:p>
@@ -12691,12 +13175,11 @@
         <w:rPr>
           <w:noProof/>
         </w:rPr>
-        <w:lastRenderedPageBreak/>
         <w:drawing>
-          <wp:inline distT="0" distB="0" distL="0" distR="0" wp14:anchorId="4DAE4DA4" wp14:editId="32E56A64">
-            <wp:extent cx="533400" cy="752475"/>
-            <wp:effectExtent l="0" t="0" r="0" b="9525"/>
-            <wp:docPr id="48" name="Picture 48"/>
+          <wp:inline distT="0" distB="0" distL="0" distR="0" wp14:anchorId="246BBCB5" wp14:editId="5433436B">
+            <wp:extent cx="561975" cy="762000"/>
+            <wp:effectExtent l="0" t="0" r="9525" b="0"/>
+            <wp:docPr id="47" name="Picture 47"/>
             <wp:cNvGraphicFramePr>
               <a:graphicFrameLocks xmlns:a="http://schemas.openxmlformats.org/drawingml/2006/main" noChangeAspect="1"/>
             </wp:cNvGraphicFramePr>
@@ -12716,7 +13199,7 @@
                   <pic:spPr>
                     <a:xfrm>
                       <a:off x="0" y="0"/>
-                      <a:ext cx="533400" cy="752475"/>
+                      <a:ext cx="561975" cy="762000"/>
                     </a:xfrm>
                     <a:prstGeom prst="rect">
                       <a:avLst/>
@@ -12747,17 +13230,10 @@
           <w:b/>
           <w:u w:val="single"/>
         </w:rPr>
-        <w:t xml:space="preserve"> Pro Pot</w:t>
-      </w:r>
-      <w:r>
-        <w:rPr>
-          <w:i/>
-          <w:u w:val="single"/>
-        </w:rPr>
-        <w:t xml:space="preserve"> </w:t>
-      </w:r>
-      <w:r>
-        <w:t>– Needs work</w:t>
+        <w:t>Bonus</w:t>
+      </w:r>
+      <w:r>
+        <w:t xml:space="preserve"> – Current player’s bonus.</w:t>
       </w:r>
     </w:p>
     <w:p>
@@ -12774,11 +13250,12 @@
         <w:rPr>
           <w:noProof/>
         </w:rPr>
+        <w:lastRenderedPageBreak/>
         <w:drawing>
-          <wp:inline distT="0" distB="0" distL="0" distR="0" wp14:anchorId="262F41B1" wp14:editId="7DF7E216">
-            <wp:extent cx="533400" cy="733425"/>
+          <wp:inline distT="0" distB="0" distL="0" distR="0" wp14:anchorId="4DAE4DA4" wp14:editId="32E56A64">
+            <wp:extent cx="533400" cy="752475"/>
             <wp:effectExtent l="0" t="0" r="0" b="9525"/>
-            <wp:docPr id="49" name="Picture 49"/>
+            <wp:docPr id="48" name="Picture 48"/>
             <wp:cNvGraphicFramePr>
               <a:graphicFrameLocks xmlns:a="http://schemas.openxmlformats.org/drawingml/2006/main" noChangeAspect="1"/>
             </wp:cNvGraphicFramePr>
@@ -12798,7 +13275,7 @@
                   <pic:spPr>
                     <a:xfrm>
                       <a:off x="0" y="0"/>
-                      <a:ext cx="533400" cy="733425"/>
+                      <a:ext cx="533400" cy="752475"/>
                     </a:xfrm>
                     <a:prstGeom prst="rect">
                       <a:avLst/>
@@ -12829,13 +13306,17 @@
           <w:b/>
           <w:u w:val="single"/>
         </w:rPr>
-        <w:t>Notes</w:t>
-      </w:r>
-      <w:r>
-        <w:t xml:space="preserve"> – notes on the cur</w:t>
-      </w:r>
-      <w:r>
-        <w:t>rent player.</w:t>
+        <w:t xml:space="preserve"> Pro Pot</w:t>
+      </w:r>
+      <w:r>
+        <w:rPr>
+          <w:i/>
+          <w:u w:val="single"/>
+        </w:rPr>
+        <w:t xml:space="preserve"> </w:t>
+      </w:r>
+      <w:r>
+        <w:t>– Needs work</w:t>
       </w:r>
     </w:p>
     <w:p>
@@ -12853,10 +13334,10 @@
           <w:noProof/>
         </w:rPr>
         <w:drawing>
-          <wp:inline distT="0" distB="0" distL="0" distR="0" wp14:anchorId="29A96E70" wp14:editId="63FE8FAF">
+          <wp:inline distT="0" distB="0" distL="0" distR="0" wp14:anchorId="262F41B1" wp14:editId="7DF7E216">
             <wp:extent cx="533400" cy="733425"/>
             <wp:effectExtent l="0" t="0" r="0" b="9525"/>
-            <wp:docPr id="50" name="Picture 50"/>
+            <wp:docPr id="49" name="Picture 49"/>
             <wp:cNvGraphicFramePr>
               <a:graphicFrameLocks xmlns:a="http://schemas.openxmlformats.org/drawingml/2006/main" noChangeAspect="1"/>
             </wp:cNvGraphicFramePr>
@@ -12891,6 +13372,84 @@
     </w:p>
     <w:p>
       <w:pPr>
+        <w:pStyle w:val="BodyText"/>
+        <w:keepNext/>
+        <w:numPr>
+          <w:ilvl w:val="0"/>
+          <w:numId w:val="10"/>
+        </w:numPr>
+        <w:rPr>
+          <w:b/>
+          <w:u w:val="single"/>
+        </w:rPr>
+      </w:pPr>
+      <w:r>
+        <w:rPr>
+          <w:b/>
+          <w:u w:val="single"/>
+        </w:rPr>
+        <w:t>Notes</w:t>
+      </w:r>
+      <w:r>
+        <w:t xml:space="preserve"> – notes on the cur</w:t>
+      </w:r>
+      <w:r>
+        <w:t>rent player.</w:t>
+      </w:r>
+    </w:p>
+    <w:p>
+      <w:pPr>
+        <w:pStyle w:val="BodyText"/>
+        <w:keepNext/>
+        <w:ind w:left="720"/>
+        <w:rPr>
+          <w:b/>
+          <w:u w:val="single"/>
+        </w:rPr>
+      </w:pPr>
+      <w:r>
+        <w:rPr>
+          <w:noProof/>
+        </w:rPr>
+        <w:drawing>
+          <wp:inline distT="0" distB="0" distL="0" distR="0" wp14:anchorId="29A96E70" wp14:editId="63FE8FAF">
+            <wp:extent cx="533400" cy="733425"/>
+            <wp:effectExtent l="0" t="0" r="0" b="9525"/>
+            <wp:docPr id="50" name="Picture 50"/>
+            <wp:cNvGraphicFramePr>
+              <a:graphicFrameLocks xmlns:a="http://schemas.openxmlformats.org/drawingml/2006/main" noChangeAspect="1"/>
+            </wp:cNvGraphicFramePr>
+            <a:graphic xmlns:a="http://schemas.openxmlformats.org/drawingml/2006/main">
+              <a:graphicData uri="http://schemas.openxmlformats.org/drawingml/2006/picture">
+                <pic:pic xmlns:pic="http://schemas.openxmlformats.org/drawingml/2006/picture">
+                  <pic:nvPicPr>
+                    <pic:cNvPr id="1" name=""/>
+                    <pic:cNvPicPr/>
+                  </pic:nvPicPr>
+                  <pic:blipFill>
+                    <a:blip r:embed="rId56"/>
+                    <a:stretch>
+                      <a:fillRect/>
+                    </a:stretch>
+                  </pic:blipFill>
+                  <pic:spPr>
+                    <a:xfrm>
+                      <a:off x="0" y="0"/>
+                      <a:ext cx="533400" cy="733425"/>
+                    </a:xfrm>
+                    <a:prstGeom prst="rect">
+                      <a:avLst/>
+                    </a:prstGeom>
+                  </pic:spPr>
+                </pic:pic>
+              </a:graphicData>
+            </a:graphic>
+          </wp:inline>
+        </w:drawing>
+      </w:r>
+    </w:p>
+    <w:p>
+      <w:pPr>
         <w:pStyle w:val="Caption"/>
       </w:pPr>
     </w:p>
@@ -12967,11 +13526,57 @@
         <w:keepNext/>
       </w:pPr>
       <w:r>
-        <w:pict w14:anchorId="61FE76F3">
-          <v:shape id="_x0000_i1035" type="#_x0000_t75" style="width:275.25pt;height:126pt">
-            <v:imagedata r:id="rId56" o:title="PointToTools"/>
-          </v:shape>
-        </w:pict>
+        <w:rPr>
+          <w:noProof/>
+        </w:rPr>
+        <w:drawing>
+          <wp:inline distT="0" distB="0" distL="0" distR="0" wp14:anchorId="61FE76F3" wp14:editId="3C20AA03">
+            <wp:extent cx="3495675" cy="1600200"/>
+            <wp:effectExtent l="0" t="0" r="9525" b="0"/>
+            <wp:docPr id="20" name="Picture 11" descr="PointToTools"/>
+            <wp:cNvGraphicFramePr>
+              <a:graphicFrameLocks xmlns:a="http://schemas.openxmlformats.org/drawingml/2006/main" noChangeAspect="1"/>
+            </wp:cNvGraphicFramePr>
+            <a:graphic xmlns:a="http://schemas.openxmlformats.org/drawingml/2006/main">
+              <a:graphicData uri="http://schemas.openxmlformats.org/drawingml/2006/picture">
+                <pic:pic xmlns:pic="http://schemas.openxmlformats.org/drawingml/2006/picture">
+                  <pic:nvPicPr>
+                    <pic:cNvPr id="0" name="Picture 11" descr="PointToTools"/>
+                    <pic:cNvPicPr>
+                      <a:picLocks noChangeAspect="1" noChangeArrowheads="1"/>
+                    </pic:cNvPicPr>
+                  </pic:nvPicPr>
+                  <pic:blipFill>
+                    <a:blip r:embed="rId57">
+                      <a:extLst>
+                        <a:ext uri="{28A0092B-C50C-407E-A947-70E740481C1C}">
+                          <a14:useLocalDpi xmlns:a14="http://schemas.microsoft.com/office/drawing/2010/main" val="0"/>
+                        </a:ext>
+                      </a:extLst>
+                    </a:blip>
+                    <a:srcRect/>
+                    <a:stretch>
+                      <a:fillRect/>
+                    </a:stretch>
+                  </pic:blipFill>
+                  <pic:spPr bwMode="auto">
+                    <a:xfrm>
+                      <a:off x="0" y="0"/>
+                      <a:ext cx="3495675" cy="1600200"/>
+                    </a:xfrm>
+                    <a:prstGeom prst="rect">
+                      <a:avLst/>
+                    </a:prstGeom>
+                    <a:noFill/>
+                    <a:ln>
+                      <a:noFill/>
+                    </a:ln>
+                  </pic:spPr>
+                </pic:pic>
+              </a:graphicData>
+            </a:graphic>
+          </wp:inline>
+        </w:drawing>
       </w:r>
     </w:p>
     <w:p>
@@ -13029,11 +13634,57 @@
         <w:pStyle w:val="BodyText"/>
       </w:pPr>
       <w:r>
-        <w:pict w14:anchorId="7A87F9DB">
-          <v:shape id="_x0000_i1036" type="#_x0000_t75" style="width:242.25pt;height:243pt">
-            <v:imagedata r:id="rId57" o:title="BackUpDatabaseBrowseWindow"/>
-          </v:shape>
-        </w:pict>
+        <w:rPr>
+          <w:noProof/>
+        </w:rPr>
+        <w:drawing>
+          <wp:inline distT="0" distB="0" distL="0" distR="0" wp14:anchorId="7A87F9DB" wp14:editId="4092FB9C">
+            <wp:extent cx="3076575" cy="3086100"/>
+            <wp:effectExtent l="0" t="0" r="9525" b="0"/>
+            <wp:docPr id="19" name="Picture 12" descr="BackUpDatabaseBrowseWindow"/>
+            <wp:cNvGraphicFramePr>
+              <a:graphicFrameLocks xmlns:a="http://schemas.openxmlformats.org/drawingml/2006/main" noChangeAspect="1"/>
+            </wp:cNvGraphicFramePr>
+            <a:graphic xmlns:a="http://schemas.openxmlformats.org/drawingml/2006/main">
+              <a:graphicData uri="http://schemas.openxmlformats.org/drawingml/2006/picture">
+                <pic:pic xmlns:pic="http://schemas.openxmlformats.org/drawingml/2006/picture">
+                  <pic:nvPicPr>
+                    <pic:cNvPr id="0" name="Picture 12" descr="BackUpDatabaseBrowseWindow"/>
+                    <pic:cNvPicPr>
+                      <a:picLocks noChangeAspect="1" noChangeArrowheads="1"/>
+                    </pic:cNvPicPr>
+                  </pic:nvPicPr>
+                  <pic:blipFill>
+                    <a:blip r:embed="rId58">
+                      <a:extLst>
+                        <a:ext uri="{28A0092B-C50C-407E-A947-70E740481C1C}">
+                          <a14:useLocalDpi xmlns:a14="http://schemas.microsoft.com/office/drawing/2010/main" val="0"/>
+                        </a:ext>
+                      </a:extLst>
+                    </a:blip>
+                    <a:srcRect/>
+                    <a:stretch>
+                      <a:fillRect/>
+                    </a:stretch>
+                  </pic:blipFill>
+                  <pic:spPr bwMode="auto">
+                    <a:xfrm>
+                      <a:off x="0" y="0"/>
+                      <a:ext cx="3076575" cy="3086100"/>
+                    </a:xfrm>
+                    <a:prstGeom prst="rect">
+                      <a:avLst/>
+                    </a:prstGeom>
+                    <a:noFill/>
+                    <a:ln>
+                      <a:noFill/>
+                    </a:ln>
+                  </pic:spPr>
+                </pic:pic>
+              </a:graphicData>
+            </a:graphic>
+          </wp:inline>
+        </w:drawing>
       </w:r>
     </w:p>
     <w:p>
@@ -13093,12 +13744,58 @@
         <w:pStyle w:val="BodyText"/>
       </w:pPr>
       <w:r>
+        <w:rPr>
+          <w:noProof/>
+        </w:rPr>
         <w:lastRenderedPageBreak/>
-        <w:pict w14:anchorId="3FAD1F11">
-          <v:shape id="_x0000_i1037" type="#_x0000_t75" style="width:384pt;height:231pt">
-            <v:imagedata r:id="rId58" o:title="RestoreDatabaseFolderNavigation"/>
-          </v:shape>
-        </w:pict>
+        <w:drawing>
+          <wp:inline distT="0" distB="0" distL="0" distR="0" wp14:anchorId="3FAD1F11" wp14:editId="43237219">
+            <wp:extent cx="4876800" cy="2933700"/>
+            <wp:effectExtent l="0" t="0" r="0" b="0"/>
+            <wp:docPr id="13" name="Picture 13" descr="RestoreDatabaseFolderNavigation"/>
+            <wp:cNvGraphicFramePr>
+              <a:graphicFrameLocks xmlns:a="http://schemas.openxmlformats.org/drawingml/2006/main" noChangeAspect="1"/>
+            </wp:cNvGraphicFramePr>
+            <a:graphic xmlns:a="http://schemas.openxmlformats.org/drawingml/2006/main">
+              <a:graphicData uri="http://schemas.openxmlformats.org/drawingml/2006/picture">
+                <pic:pic xmlns:pic="http://schemas.openxmlformats.org/drawingml/2006/picture">
+                  <pic:nvPicPr>
+                    <pic:cNvPr id="0" name="Picture 13" descr="RestoreDatabaseFolderNavigation"/>
+                    <pic:cNvPicPr>
+                      <a:picLocks noChangeAspect="1" noChangeArrowheads="1"/>
+                    </pic:cNvPicPr>
+                  </pic:nvPicPr>
+                  <pic:blipFill>
+                    <a:blip r:embed="rId59">
+                      <a:extLst>
+                        <a:ext uri="{28A0092B-C50C-407E-A947-70E740481C1C}">
+                          <a14:useLocalDpi xmlns:a14="http://schemas.microsoft.com/office/drawing/2010/main" val="0"/>
+                        </a:ext>
+                      </a:extLst>
+                    </a:blip>
+                    <a:srcRect/>
+                    <a:stretch>
+                      <a:fillRect/>
+                    </a:stretch>
+                  </pic:blipFill>
+                  <pic:spPr bwMode="auto">
+                    <a:xfrm>
+                      <a:off x="0" y="0"/>
+                      <a:ext cx="4876800" cy="2933700"/>
+                    </a:xfrm>
+                    <a:prstGeom prst="rect">
+                      <a:avLst/>
+                    </a:prstGeom>
+                    <a:noFill/>
+                    <a:ln>
+                      <a:noFill/>
+                    </a:ln>
+                  </pic:spPr>
+                </pic:pic>
+              </a:graphicData>
+            </a:graphic>
+          </wp:inline>
+        </w:drawing>
       </w:r>
     </w:p>
     <w:p>
@@ -13124,8 +13821,26 @@
         <w:pStyle w:val="Heading2"/>
       </w:pPr>
       <w:r>
+        <w:t>Update Inactive Members</w:t>
+      </w:r>
+    </w:p>
+    <w:p>
+      <w:pPr>
+        <w:pStyle w:val="BodyText"/>
+        <w:keepNext/>
+      </w:pPr>
+      <w:r>
+        <w:t xml:space="preserve">Under the tools tab, the third tool is for updating the </w:t>
+      </w:r>
+      <w:r>
+        <w:t xml:space="preserve">active status of members. Members </w:t>
+      </w:r>
+      <w:r>
+        <w:t xml:space="preserve">who have not participated in a tournament for more than 180 days may be deemed inactive. Upon opening the form, a date picker will be defaulted to 180 days ago from today’s date. Below this date picker a list of players in the database who have been inactive will appear. Click on all of the members you’d like to change to inactive and select the update button to be prompted to update their active status. The check all </w:t>
+      </w:r>
+      <w:r>
         <w:lastRenderedPageBreak/>
-        <w:t>Update Inactive Members</w:t>
+        <w:t>button beside the update button should select all of the members displayed in the list for a quick update, although at this time it does not work.</w:t>
       </w:r>
     </w:p>
     <w:p>
@@ -13134,29 +13849,57 @@
         <w:keepNext/>
       </w:pPr>
       <w:r>
-        <w:t xml:space="preserve">Under the tools tab, the third tool is for updating the </w:t>
-      </w:r>
-      <w:r>
-        <w:t xml:space="preserve">active status of members. Members </w:t>
-      </w:r>
-      <w:r>
-        <w:t>who have not participated in a tournament for more than 180 days may be deemed inactive. Upon opening the form, a date picker will be defaulted to 180 days ago from today’s date. Below this date picker a list of players in the database who have been inactive will appear. Click on all of the members you’d like to change to inactive and select the update button to be prompted to update their active status. The check all button beside the update button should select all of the members displayed in the list for a quick update, although at this time it does not work.</w:t>
-      </w:r>
-    </w:p>
-    <w:p>
-      <w:pPr>
-        <w:pStyle w:val="BodyText"/>
-        <w:keepNext/>
-      </w:pPr>
-      <w:r>
         <w:rPr>
           <w:noProof/>
         </w:rPr>
-        <w:pict w14:anchorId="6C066037">
-          <v:shape id="_x0000_i1038" type="#_x0000_t75" style="width:216.75pt;height:370.5pt">
-            <v:imagedata r:id="rId59" o:title="UpdateInactiveMemberForm"/>
-          </v:shape>
-        </w:pict>
+        <w:drawing>
+          <wp:inline distT="0" distB="0" distL="0" distR="0" wp14:anchorId="6C066037" wp14:editId="0BBFA65E">
+            <wp:extent cx="2752725" cy="4705350"/>
+            <wp:effectExtent l="0" t="0" r="9525" b="0"/>
+            <wp:docPr id="7" name="Picture 14" descr="UpdateInactiveMemberForm"/>
+            <wp:cNvGraphicFramePr>
+              <a:graphicFrameLocks xmlns:a="http://schemas.openxmlformats.org/drawingml/2006/main" noChangeAspect="1"/>
+            </wp:cNvGraphicFramePr>
+            <a:graphic xmlns:a="http://schemas.openxmlformats.org/drawingml/2006/main">
+              <a:graphicData uri="http://schemas.openxmlformats.org/drawingml/2006/picture">
+                <pic:pic xmlns:pic="http://schemas.openxmlformats.org/drawingml/2006/picture">
+                  <pic:nvPicPr>
+                    <pic:cNvPr id="0" name="Picture 14" descr="UpdateInactiveMemberForm"/>
+                    <pic:cNvPicPr>
+                      <a:picLocks noChangeAspect="1" noChangeArrowheads="1"/>
+                    </pic:cNvPicPr>
+                  </pic:nvPicPr>
+                  <pic:blipFill>
+                    <a:blip r:embed="rId60">
+                      <a:extLst>
+                        <a:ext uri="{28A0092B-C50C-407E-A947-70E740481C1C}">
+                          <a14:useLocalDpi xmlns:a14="http://schemas.microsoft.com/office/drawing/2010/main" val="0"/>
+                        </a:ext>
+                      </a:extLst>
+                    </a:blip>
+                    <a:srcRect/>
+                    <a:stretch>
+                      <a:fillRect/>
+                    </a:stretch>
+                  </pic:blipFill>
+                  <pic:spPr bwMode="auto">
+                    <a:xfrm>
+                      <a:off x="0" y="0"/>
+                      <a:ext cx="2752725" cy="4705350"/>
+                    </a:xfrm>
+                    <a:prstGeom prst="rect">
+                      <a:avLst/>
+                    </a:prstGeom>
+                    <a:noFill/>
+                    <a:ln>
+                      <a:noFill/>
+                    </a:ln>
+                  </pic:spPr>
+                </pic:pic>
+              </a:graphicData>
+            </a:graphic>
+          </wp:inline>
+        </w:drawing>
       </w:r>
     </w:p>
     <w:p>
@@ -13523,7 +14266,7 @@
                     <pic:cNvPicPr/>
                   </pic:nvPicPr>
                   <pic:blipFill>
-                    <a:blip r:embed="rId60" cstate="print">
+                    <a:blip r:embed="rId61" cstate="print">
                       <a:extLst>
                         <a:ext uri="{28A0092B-C50C-407E-A947-70E740481C1C}">
                           <a14:useLocalDpi xmlns:a14="http://schemas.microsoft.com/office/drawing/2010/main" val="0"/>
@@ -13730,7 +14473,7 @@
                     <pic:cNvPicPr/>
                   </pic:nvPicPr>
                   <pic:blipFill>
-                    <a:blip r:embed="rId61">
+                    <a:blip r:embed="rId62">
                       <a:extLst>
                         <a:ext uri="{28A0092B-C50C-407E-A947-70E740481C1C}">
                           <a14:useLocalDpi xmlns:a14="http://schemas.microsoft.com/office/drawing/2010/main" val="0"/>
@@ -13892,11 +14635,57 @@
         <w:pStyle w:val="BodyText"/>
       </w:pPr>
       <w:r>
-        <w:pict w14:anchorId="0E18A813">
-          <v:shape id="_x0000_i1039" type="#_x0000_t75" style="width:384pt;height:199.5pt">
-            <v:imagedata r:id="rId62" o:title="9TapMemberInfo"/>
-          </v:shape>
-        </w:pict>
+        <w:rPr>
+          <w:noProof/>
+        </w:rPr>
+        <w:drawing>
+          <wp:inline distT="0" distB="0" distL="0" distR="0" wp14:anchorId="0E18A813" wp14:editId="395DB028">
+            <wp:extent cx="4876800" cy="2533650"/>
+            <wp:effectExtent l="0" t="0" r="0" b="0"/>
+            <wp:docPr id="6" name="Picture 15" descr="9TapMemberInfo"/>
+            <wp:cNvGraphicFramePr>
+              <a:graphicFrameLocks xmlns:a="http://schemas.openxmlformats.org/drawingml/2006/main" noChangeAspect="1"/>
+            </wp:cNvGraphicFramePr>
+            <a:graphic xmlns:a="http://schemas.openxmlformats.org/drawingml/2006/main">
+              <a:graphicData uri="http://schemas.openxmlformats.org/drawingml/2006/picture">
+                <pic:pic xmlns:pic="http://schemas.openxmlformats.org/drawingml/2006/picture">
+                  <pic:nvPicPr>
+                    <pic:cNvPr id="0" name="Picture 15" descr="9TapMemberInfo"/>
+                    <pic:cNvPicPr>
+                      <a:picLocks noChangeAspect="1" noChangeArrowheads="1"/>
+                    </pic:cNvPicPr>
+                  </pic:nvPicPr>
+                  <pic:blipFill>
+                    <a:blip r:embed="rId16" cstate="print">
+                      <a:extLst>
+                        <a:ext uri="{28A0092B-C50C-407E-A947-70E740481C1C}">
+                          <a14:useLocalDpi xmlns:a14="http://schemas.microsoft.com/office/drawing/2010/main" val="0"/>
+                        </a:ext>
+                      </a:extLst>
+                    </a:blip>
+                    <a:srcRect/>
+                    <a:stretch>
+                      <a:fillRect/>
+                    </a:stretch>
+                  </pic:blipFill>
+                  <pic:spPr bwMode="auto">
+                    <a:xfrm>
+                      <a:off x="0" y="0"/>
+                      <a:ext cx="4876800" cy="2533650"/>
+                    </a:xfrm>
+                    <a:prstGeom prst="rect">
+                      <a:avLst/>
+                    </a:prstGeom>
+                    <a:noFill/>
+                    <a:ln>
+                      <a:noFill/>
+                    </a:ln>
+                  </pic:spPr>
+                </pic:pic>
+              </a:graphicData>
+            </a:graphic>
+          </wp:inline>
+        </w:drawing>
       </w:r>
     </w:p>
     <w:p>
@@ -13915,12 +14704,58 @@
     </w:p>
     <w:p>
       <w:r>
+        <w:rPr>
+          <w:noProof/>
+        </w:rPr>
         <w:lastRenderedPageBreak/>
-        <w:pict w14:anchorId="5B245710">
-          <v:shape id="_x0000_i1040" type="#_x0000_t75" style="width:383.25pt;height:204.75pt">
-            <v:imagedata r:id="rId63" o:title="MemberInfoSwappedLayout"/>
-          </v:shape>
-        </w:pict>
+        <w:drawing>
+          <wp:inline distT="0" distB="0" distL="0" distR="0" wp14:anchorId="5B245710" wp14:editId="7844CCD8">
+            <wp:extent cx="4867275" cy="2600325"/>
+            <wp:effectExtent l="0" t="0" r="9525" b="9525"/>
+            <wp:docPr id="16" name="Picture 16" descr="MemberInfoSwappedLayout"/>
+            <wp:cNvGraphicFramePr>
+              <a:graphicFrameLocks xmlns:a="http://schemas.openxmlformats.org/drawingml/2006/main" noChangeAspect="1"/>
+            </wp:cNvGraphicFramePr>
+            <a:graphic xmlns:a="http://schemas.openxmlformats.org/drawingml/2006/main">
+              <a:graphicData uri="http://schemas.openxmlformats.org/drawingml/2006/picture">
+                <pic:pic xmlns:pic="http://schemas.openxmlformats.org/drawingml/2006/picture">
+                  <pic:nvPicPr>
+                    <pic:cNvPr id="0" name="Picture 16" descr="MemberInfoSwappedLayout"/>
+                    <pic:cNvPicPr>
+                      <a:picLocks noChangeAspect="1" noChangeArrowheads="1"/>
+                    </pic:cNvPicPr>
+                  </pic:nvPicPr>
+                  <pic:blipFill>
+                    <a:blip r:embed="rId63" cstate="print">
+                      <a:extLst>
+                        <a:ext uri="{28A0092B-C50C-407E-A947-70E740481C1C}">
+                          <a14:useLocalDpi xmlns:a14="http://schemas.microsoft.com/office/drawing/2010/main" val="0"/>
+                        </a:ext>
+                      </a:extLst>
+                    </a:blip>
+                    <a:srcRect/>
+                    <a:stretch>
+                      <a:fillRect/>
+                    </a:stretch>
+                  </pic:blipFill>
+                  <pic:spPr bwMode="auto">
+                    <a:xfrm>
+                      <a:off x="0" y="0"/>
+                      <a:ext cx="4867275" cy="2600325"/>
+                    </a:xfrm>
+                    <a:prstGeom prst="rect">
+                      <a:avLst/>
+                    </a:prstGeom>
+                    <a:noFill/>
+                    <a:ln>
+                      <a:noFill/>
+                    </a:ln>
+                  </pic:spPr>
+                </pic:pic>
+              </a:graphicData>
+            </a:graphic>
+          </wp:inline>
+        </w:drawing>
       </w:r>
     </w:p>
     <w:p/>
@@ -14067,11 +14902,57 @@
         <w:pStyle w:val="BodyText"/>
       </w:pPr>
       <w:r>
-        <w:pict w14:anchorId="3F82314C">
-          <v:shape id="_x0000_i1041" type="#_x0000_t75" style="width:384pt;height:207pt">
-            <v:imagedata r:id="rId64" o:title="ImportButtonExample"/>
-          </v:shape>
-        </w:pict>
+        <w:rPr>
+          <w:noProof/>
+        </w:rPr>
+        <w:drawing>
+          <wp:inline distT="0" distB="0" distL="0" distR="0" wp14:anchorId="3F82314C" wp14:editId="73078ED2">
+            <wp:extent cx="4876800" cy="2628900"/>
+            <wp:effectExtent l="0" t="0" r="0" b="0"/>
+            <wp:docPr id="5" name="Picture 17" descr="ImportButtonExample"/>
+            <wp:cNvGraphicFramePr>
+              <a:graphicFrameLocks xmlns:a="http://schemas.openxmlformats.org/drawingml/2006/main" noChangeAspect="1"/>
+            </wp:cNvGraphicFramePr>
+            <a:graphic xmlns:a="http://schemas.openxmlformats.org/drawingml/2006/main">
+              <a:graphicData uri="http://schemas.openxmlformats.org/drawingml/2006/picture">
+                <pic:pic xmlns:pic="http://schemas.openxmlformats.org/drawingml/2006/picture">
+                  <pic:nvPicPr>
+                    <pic:cNvPr id="0" name="Picture 17" descr="ImportButtonExample"/>
+                    <pic:cNvPicPr>
+                      <a:picLocks noChangeAspect="1" noChangeArrowheads="1"/>
+                    </pic:cNvPicPr>
+                  </pic:nvPicPr>
+                  <pic:blipFill>
+                    <a:blip r:embed="rId64" cstate="print">
+                      <a:extLst>
+                        <a:ext uri="{28A0092B-C50C-407E-A947-70E740481C1C}">
+                          <a14:useLocalDpi xmlns:a14="http://schemas.microsoft.com/office/drawing/2010/main" val="0"/>
+                        </a:ext>
+                      </a:extLst>
+                    </a:blip>
+                    <a:srcRect/>
+                    <a:stretch>
+                      <a:fillRect/>
+                    </a:stretch>
+                  </pic:blipFill>
+                  <pic:spPr bwMode="auto">
+                    <a:xfrm>
+                      <a:off x="0" y="0"/>
+                      <a:ext cx="4876800" cy="2628900"/>
+                    </a:xfrm>
+                    <a:prstGeom prst="rect">
+                      <a:avLst/>
+                    </a:prstGeom>
+                    <a:noFill/>
+                    <a:ln>
+                      <a:noFill/>
+                    </a:ln>
+                  </pic:spPr>
+                </pic:pic>
+              </a:graphicData>
+            </a:graphic>
+          </wp:inline>
+        </w:drawing>
       </w:r>
     </w:p>
     <w:p>
@@ -14828,6 +15709,7 @@
         </w:numPr>
       </w:pPr>
       <w:r>
+        <w:lastRenderedPageBreak/>
         <w:t>Member Number</w:t>
       </w:r>
       <w:r>
@@ -14900,7 +15782,6 @@
         </w:numPr>
       </w:pPr>
       <w:r>
-        <w:lastRenderedPageBreak/>
         <w:t>Middle Initial—member’s middle initial.</w:t>
       </w:r>
     </w:p>
@@ -15222,6 +16103,7 @@
         </w:numPr>
       </w:pPr>
       <w:r>
+        <w:lastRenderedPageBreak/>
         <w:t>Year End Tournaments</w:t>
       </w:r>
       <w:r>
@@ -15385,7 +16267,6 @@
         </w:numPr>
       </w:pPr>
       <w:r>
-        <w:lastRenderedPageBreak/>
         <w:t>Save—saves member information to the database.</w:t>
       </w:r>
     </w:p>
@@ -15845,6 +16726,7 @@
       </w:pPr>
       <w:bookmarkStart w:id="52" w:name="_Toc509165876"/>
       <w:r>
+        <w:lastRenderedPageBreak/>
         <w:t>Member Scores</w:t>
       </w:r>
       <w:bookmarkEnd w:id="52"/>
@@ -16068,7 +16950,6 @@
         </w:numPr>
       </w:pPr>
       <w:r>
-        <w:lastRenderedPageBreak/>
         <w:t>Middle Initial</w:t>
       </w:r>
       <w:r>
@@ -16503,6 +17384,7 @@
         </w:numPr>
       </w:pPr>
       <w:r>
+        <w:lastRenderedPageBreak/>
         <w:t>Leaders section</w:t>
       </w:r>
     </w:p>
@@ -16701,7 +17583,6 @@
         </w:numPr>
       </w:pPr>
       <w:r>
-        <w:lastRenderedPageBreak/>
         <w:t>Add New/Update Record</w:t>
       </w:r>
       <w:r>
@@ -16998,6 +17879,7 @@
         </w:numPr>
       </w:pPr>
       <w:r>
+        <w:lastRenderedPageBreak/>
         <w:t>Tournament File</w:t>
       </w:r>
       <w:r>
@@ -17218,7 +18100,6 @@
         </w:numPr>
       </w:pPr>
       <w:r>
-        <w:lastRenderedPageBreak/>
         <w:t>Tournament Results</w:t>
       </w:r>
       <w:r>
@@ -18938,7 +19819,7 @@
         <w:rStyle w:val="PageNumber"/>
         <w:noProof/>
       </w:rPr>
-      <w:t>28</w:t>
+      <w:t>23</w:t>
     </w:r>
     <w:r>
       <w:rPr>
@@ -18988,7 +19869,7 @@
         <w:rStyle w:val="PageNumber"/>
         <w:noProof/>
       </w:rPr>
-      <w:t>50</w:t>
+      <w:t>52</w:t>
     </w:r>
     <w:r>
       <w:rPr>
@@ -19031,10 +19912,7 @@
       <w:pStyle w:val="Header"/>
     </w:pPr>
     <w:r>
-      <w:t>9-Tap</w:t>
-    </w:r>
-    <w:r>
-      <w:t xml:space="preserve"> tour</w:t>
+      <w:t>9-Tap tour</w:t>
     </w:r>
   </w:p>
 </w:hdr>
@@ -19047,10 +19925,7 @@
       <w:pStyle w:val="Header"/>
     </w:pPr>
     <w:r>
-      <w:t>9-Tap</w:t>
-    </w:r>
-    <w:r>
-      <w:t xml:space="preserve"> tour</w:t>
+      <w:t>9-Tap tour</w:t>
     </w:r>
   </w:p>
 </w:hdr>
@@ -19063,10 +19938,7 @@
       <w:pStyle w:val="Header"/>
     </w:pPr>
     <w:r>
-      <w:t>9-Tap</w:t>
-    </w:r>
-    <w:r>
-      <w:t xml:space="preserve"> Tour</w:t>
+      <w:t>9-Tap Tour</w:t>
     </w:r>
   </w:p>
 </w:hdr>
@@ -22048,7 +22920,7 @@
 </file>
 
 <file path=customXml/itemProps1.xml><?xml version="1.0" encoding="utf-8"?>
-<ds:datastoreItem xmlns:ds="http://schemas.openxmlformats.org/officeDocument/2006/customXml" ds:itemID="{BB03D24D-E369-41CC-A1FD-46A8C4690751}">
+<ds:datastoreItem xmlns:ds="http://schemas.openxmlformats.org/officeDocument/2006/customXml" ds:itemID="{0102EFED-19AE-4C50-B8F5-0428BA4776A7}">
   <ds:schemaRefs>
     <ds:schemaRef ds:uri="http://schemas.openxmlformats.org/officeDocument/2006/bibliography"/>
   </ds:schemaRefs>

</xml_diff>

<commit_message>
Edited the user manual for the printing recap section and added the new screenshot for the updated form
</commit_message>
<xml_diff>
--- a/NineTapTour/NineTapTour/Resources/9tapUserManual.docx
+++ b/NineTapTour/NineTapTour/Resources/9tapUserManual.docx
@@ -4534,14 +4534,27 @@
       <w:r>
         <w:t xml:space="preserve">Figure </w:t>
       </w:r>
-      <w:fldSimple w:instr=" SEQ Figure \* ARABIC ">
-        <w:r>
-          <w:rPr>
-            <w:noProof/>
-          </w:rPr>
-          <w:t>1</w:t>
-        </w:r>
-      </w:fldSimple>
+      <w:r>
+        <w:fldChar w:fldCharType="begin"/>
+      </w:r>
+      <w:r>
+        <w:instrText xml:space="preserve"> SEQ Figure \* ARABIC </w:instrText>
+      </w:r>
+      <w:r>
+        <w:fldChar w:fldCharType="separate"/>
+      </w:r>
+      <w:r>
+        <w:rPr>
+          <w:noProof/>
+        </w:rPr>
+        <w:t>1</w:t>
+      </w:r>
+      <w:r>
+        <w:rPr>
+          <w:noProof/>
+        </w:rPr>
+        <w:fldChar w:fldCharType="end"/>
+      </w:r>
       <w:r>
         <w:t xml:space="preserve">: </w:t>
       </w:r>
@@ -5347,19 +5360,16 @@
         </w:numPr>
       </w:pPr>
       <w:r>
-        <w:t xml:space="preserve">The 9 Tap Tour program has now been successfully installed. Choose “Run 9 Tap Tour” to immediately launch the program, or “View ReadMe.txt” to view </w:t>
-      </w:r>
+        <w:t>The 9 Tap Tour program has now been successfully installed. Choose “Run 9 Tap Tour” to immediately launch the program, or “View ReadMe.txt” to view the ReadMe file where you can view updated program information made after the game manual was printed.</w:t>
+      </w:r>
+    </w:p>
+    <w:p>
+      <w:pPr>
+        <w:pStyle w:val="Heading2"/>
+      </w:pPr>
+      <w:bookmarkStart w:id="11" w:name="_Toc509165838"/>
       <w:r>
         <w:lastRenderedPageBreak/>
-        <w:t>the ReadMe file where you can view updated program information made after the game manual was printed.</w:t>
-      </w:r>
-    </w:p>
-    <w:p>
-      <w:pPr>
-        <w:pStyle w:val="Heading2"/>
-      </w:pPr>
-      <w:bookmarkStart w:id="11" w:name="_Toc509165838"/>
-      <w:r>
         <w:t xml:space="preserve">How do I Launch </w:t>
       </w:r>
       <w:r>
@@ -6149,14 +6159,30 @@
       <w:r>
         <w:t xml:space="preserve">Figure </w:t>
       </w:r>
-      <w:fldSimple w:instr=" SEQ Figure \* ARABIC ">
-        <w:r>
-          <w:rPr>
-            <w:noProof/>
-          </w:rPr>
-          <w:t>2</w:t>
-        </w:r>
-      </w:fldSimple>
+      <w:r>
+        <w:fldChar w:fldCharType="begin"/>
+      </w:r>
+      <w:r>
+        <w:instrText xml:space="preserve"> SEQ Fi</w:instrText>
+      </w:r>
+      <w:r>
+        <w:instrText xml:space="preserve">gure \* ARABIC </w:instrText>
+      </w:r>
+      <w:r>
+        <w:fldChar w:fldCharType="separate"/>
+      </w:r>
+      <w:r>
+        <w:rPr>
+          <w:noProof/>
+        </w:rPr>
+        <w:t>2</w:t>
+      </w:r>
+      <w:r>
+        <w:rPr>
+          <w:noProof/>
+        </w:rPr>
+        <w:fldChar w:fldCharType="end"/>
+      </w:r>
       <w:r>
         <w:t>: Main Menu</w:t>
       </w:r>
@@ -6484,14 +6510,27 @@
       <w:r>
         <w:t xml:space="preserve">Figure </w:t>
       </w:r>
-      <w:fldSimple w:instr=" SEQ Figure \* ARABIC ">
-        <w:r>
-          <w:rPr>
-            <w:noProof/>
-          </w:rPr>
-          <w:t>3</w:t>
-        </w:r>
-      </w:fldSimple>
+      <w:r>
+        <w:fldChar w:fldCharType="begin"/>
+      </w:r>
+      <w:r>
+        <w:instrText xml:space="preserve"> SEQ Figure \* ARABIC </w:instrText>
+      </w:r>
+      <w:r>
+        <w:fldChar w:fldCharType="separate"/>
+      </w:r>
+      <w:r>
+        <w:rPr>
+          <w:noProof/>
+        </w:rPr>
+        <w:t>3</w:t>
+      </w:r>
+      <w:r>
+        <w:rPr>
+          <w:noProof/>
+        </w:rPr>
+        <w:fldChar w:fldCharType="end"/>
+      </w:r>
       <w:r>
         <w:t>: Member Information</w:t>
       </w:r>
@@ -6804,7 +6843,6 @@
         <w:rPr>
           <w:u w:val="single"/>
         </w:rPr>
-        <w:lastRenderedPageBreak/>
         <w:t>Gender</w:t>
       </w:r>
       <w:r>
@@ -6829,6 +6867,7 @@
         <w:rPr>
           <w:u w:val="single"/>
         </w:rPr>
+        <w:lastRenderedPageBreak/>
         <w:t>Lifetime member checkbox</w:t>
       </w:r>
       <w:r>
@@ -7273,6 +7312,7 @@
         <w:ind w:left="360"/>
       </w:pPr>
       <w:r>
+        <w:lastRenderedPageBreak/>
         <w:t>The following fields are calculated automatically or otherwise unable to be modified in Member Info:</w:t>
       </w:r>
     </w:p>
@@ -7402,10 +7442,10 @@
           <w:noProof/>
         </w:rPr>
         <w:drawing>
-          <wp:inline distT="0" distB="0" distL="0" distR="0" wp14:anchorId="100D6018" wp14:editId="4F2D6461">
-            <wp:extent cx="4883150" cy="2539683"/>
+          <wp:inline distT="0" distB="0" distL="0" distR="0" wp14:anchorId="07BC0CF8" wp14:editId="72D08DC4">
+            <wp:extent cx="4883150" cy="2420766"/>
             <wp:effectExtent l="0" t="0" r="0" b="0"/>
-            <wp:docPr id="30" name="Picture 30" descr="C:\Users\Tfair\Desktop\DocumentationBackup-9Tap\9TapMemberInfo.png"/>
+            <wp:docPr id="54" name="Picture 54" descr="C:\Users\zeller8964\Desktop\PrintRecap1.jpg"/>
             <wp:cNvGraphicFramePr>
               <a:graphicFrameLocks xmlns:a="http://schemas.openxmlformats.org/drawingml/2006/main" noChangeAspect="1"/>
             </wp:cNvGraphicFramePr>
@@ -7413,13 +7453,13 @@
               <a:graphicData uri="http://schemas.openxmlformats.org/drawingml/2006/picture">
                 <pic:pic xmlns:pic="http://schemas.openxmlformats.org/drawingml/2006/picture">
                   <pic:nvPicPr>
-                    <pic:cNvPr id="0" name="Picture 5" descr="C:\Users\Tfair\Desktop\DocumentationBackup-9Tap\9TapMemberInfo.png"/>
+                    <pic:cNvPr id="0" name="Picture 1" descr="C:\Users\zeller8964\Desktop\PrintRecap1.jpg"/>
                     <pic:cNvPicPr>
                       <a:picLocks noChangeAspect="1" noChangeArrowheads="1"/>
                     </pic:cNvPicPr>
                   </pic:nvPicPr>
                   <pic:blipFill>
-                    <a:blip r:embed="rId16" cstate="print">
+                    <a:blip r:embed="rId17" cstate="print">
                       <a:extLst>
                         <a:ext uri="{28A0092B-C50C-407E-A947-70E740481C1C}">
                           <a14:useLocalDpi xmlns:a14="http://schemas.microsoft.com/office/drawing/2010/main" val="0"/>
@@ -7434,7 +7474,7 @@
                   <pic:spPr bwMode="auto">
                     <a:xfrm>
                       <a:off x="0" y="0"/>
-                      <a:ext cx="4883150" cy="2539683"/>
+                      <a:ext cx="4883150" cy="2420766"/>
                     </a:xfrm>
                     <a:prstGeom prst="rect">
                       <a:avLst/>
@@ -7450,6 +7490,8 @@
           </wp:inline>
         </w:drawing>
       </w:r>
+      <w:bookmarkStart w:id="20" w:name="_GoBack"/>
+      <w:bookmarkEnd w:id="20"/>
     </w:p>
     <w:p>
       <w:pPr>
@@ -7459,14 +7501,27 @@
       <w:r>
         <w:t xml:space="preserve">Figure </w:t>
       </w:r>
-      <w:fldSimple w:instr=" SEQ Figure \* ARABIC ">
-        <w:r>
-          <w:rPr>
-            <w:noProof/>
-          </w:rPr>
-          <w:t>4</w:t>
-        </w:r>
-      </w:fldSimple>
+      <w:r>
+        <w:fldChar w:fldCharType="begin"/>
+      </w:r>
+      <w:r>
+        <w:instrText xml:space="preserve"> SEQ Figure \* ARABIC </w:instrText>
+      </w:r>
+      <w:r>
+        <w:fldChar w:fldCharType="separate"/>
+      </w:r>
+      <w:r>
+        <w:rPr>
+          <w:noProof/>
+        </w:rPr>
+        <w:t>4</w:t>
+      </w:r>
+      <w:r>
+        <w:rPr>
+          <w:noProof/>
+        </w:rPr>
+        <w:fldChar w:fldCharType="end"/>
+      </w:r>
       <w:r>
         <w:t>: Member Information</w:t>
       </w:r>
@@ -7475,14 +7530,14 @@
       <w:pPr>
         <w:pStyle w:val="Heading3"/>
       </w:pPr>
-      <w:bookmarkStart w:id="20" w:name="_Toc509165847"/>
+      <w:bookmarkStart w:id="21" w:name="_Toc509165847"/>
       <w:r>
         <w:t xml:space="preserve">Updating </w:t>
       </w:r>
       <w:r>
         <w:t>Members</w:t>
       </w:r>
-      <w:bookmarkEnd w:id="20"/>
+      <w:bookmarkEnd w:id="21"/>
       <w:r>
         <w:fldChar w:fldCharType="begin"/>
       </w:r>
@@ -7592,7 +7647,6 @@
         <w:pStyle w:val="BodyText"/>
       </w:pPr>
       <w:r>
-        <w:lastRenderedPageBreak/>
         <w:t>Select the member to be updated and click “Select”. The member will now be displayed on the Member Info</w:t>
       </w:r>
       <w:r>
@@ -7639,7 +7693,11 @@
         <w:t xml:space="preserve"> screen. Make updates to the member’s information. Then click “Save”. The updates will be saved to the member database.</w:t>
       </w:r>
       <w:r>
-        <w:t xml:space="preserve"> When switching between Members using the Record Number navigatio</w:t>
+        <w:t xml:space="preserve"> When switching between </w:t>
+      </w:r>
+      <w:r>
+        <w:lastRenderedPageBreak/>
+        <w:t>Members using the Record Number navigatio</w:t>
       </w:r>
       <w:r>
         <w:t>n buttons, the changes made if any will be saved.</w:t>
@@ -7652,14 +7710,14 @@
           <w:szCs w:val="20"/>
         </w:rPr>
       </w:pPr>
-      <w:bookmarkStart w:id="21" w:name="_Toc509165848"/>
+      <w:bookmarkStart w:id="22" w:name="_Toc509165848"/>
       <w:r>
         <w:rPr>
           <w:szCs w:val="20"/>
         </w:rPr>
         <w:t>Stats</w:t>
       </w:r>
-      <w:bookmarkEnd w:id="21"/>
+      <w:bookmarkEnd w:id="22"/>
       <w:r>
         <w:rPr>
           <w:szCs w:val="20"/>
@@ -7771,7 +7829,7 @@
                     </pic:cNvPicPr>
                   </pic:nvPicPr>
                   <pic:blipFill>
-                    <a:blip r:embed="rId17">
+                    <a:blip r:embed="rId18">
                       <a:extLst>
                         <a:ext uri="{28A0092B-C50C-407E-A947-70E740481C1C}">
                           <a14:useLocalDpi xmlns:a14="http://schemas.microsoft.com/office/drawing/2010/main" val="0"/>
@@ -7811,14 +7869,27 @@
       <w:r>
         <w:t xml:space="preserve">Figure </w:t>
       </w:r>
-      <w:fldSimple w:instr=" SEQ Figure \* ARABIC ">
-        <w:r>
-          <w:rPr>
-            <w:noProof/>
-          </w:rPr>
-          <w:t>5</w:t>
-        </w:r>
-      </w:fldSimple>
+      <w:r>
+        <w:fldChar w:fldCharType="begin"/>
+      </w:r>
+      <w:r>
+        <w:instrText xml:space="preserve"> SEQ Figure \* ARABIC </w:instrText>
+      </w:r>
+      <w:r>
+        <w:fldChar w:fldCharType="separate"/>
+      </w:r>
+      <w:r>
+        <w:rPr>
+          <w:noProof/>
+        </w:rPr>
+        <w:t>5</w:t>
+      </w:r>
+      <w:r>
+        <w:rPr>
+          <w:noProof/>
+        </w:rPr>
+        <w:fldChar w:fldCharType="end"/>
+      </w:r>
       <w:r>
         <w:t>: Stats</w:t>
       </w:r>
@@ -7836,14 +7907,14 @@
           <w:szCs w:val="20"/>
         </w:rPr>
       </w:pPr>
-      <w:bookmarkStart w:id="22" w:name="_Toc509165849"/>
+      <w:bookmarkStart w:id="23" w:name="_Toc509165849"/>
       <w:r>
         <w:rPr>
           <w:szCs w:val="20"/>
         </w:rPr>
         <w:t>Member Search</w:t>
       </w:r>
-      <w:bookmarkEnd w:id="22"/>
+      <w:bookmarkEnd w:id="23"/>
       <w:r>
         <w:rPr>
           <w:szCs w:val="20"/>
@@ -7979,7 +8050,7 @@
                     <pic:cNvPicPr/>
                   </pic:nvPicPr>
                   <pic:blipFill>
-                    <a:blip r:embed="rId18">
+                    <a:blip r:embed="rId19">
                       <a:extLst>
                         <a:ext uri="{28A0092B-C50C-407E-A947-70E740481C1C}">
                           <a14:useLocalDpi xmlns:a14="http://schemas.microsoft.com/office/drawing/2010/main" val="0"/>
@@ -8025,7 +8096,7 @@
                     <pic:cNvPicPr/>
                   </pic:nvPicPr>
                   <pic:blipFill>
-                    <a:blip r:embed="rId19">
+                    <a:blip r:embed="rId20">
                       <a:extLst>
                         <a:ext uri="{28A0092B-C50C-407E-A947-70E740481C1C}">
                           <a14:useLocalDpi xmlns:a14="http://schemas.microsoft.com/office/drawing/2010/main" val="0"/>
@@ -8060,14 +8131,27 @@
       <w:r>
         <w:t xml:space="preserve">Figure </w:t>
       </w:r>
-      <w:fldSimple w:instr=" SEQ Figure \* ARABIC ">
-        <w:r>
-          <w:rPr>
-            <w:noProof/>
-          </w:rPr>
-          <w:t>6</w:t>
-        </w:r>
-      </w:fldSimple>
+      <w:r>
+        <w:fldChar w:fldCharType="begin"/>
+      </w:r>
+      <w:r>
+        <w:instrText xml:space="preserve"> SEQ Figure \* ARABIC </w:instrText>
+      </w:r>
+      <w:r>
+        <w:fldChar w:fldCharType="separate"/>
+      </w:r>
+      <w:r>
+        <w:rPr>
+          <w:noProof/>
+        </w:rPr>
+        <w:t>6</w:t>
+      </w:r>
+      <w:r>
+        <w:rPr>
+          <w:noProof/>
+        </w:rPr>
+        <w:fldChar w:fldCharType="end"/>
+      </w:r>
       <w:r>
         <w:t>: Member search, blank and with results</w:t>
       </w:r>
@@ -8079,14 +8163,15 @@
           <w:szCs w:val="20"/>
         </w:rPr>
       </w:pPr>
-      <w:bookmarkStart w:id="23" w:name="_Toc509165850"/>
+      <w:bookmarkStart w:id="24" w:name="_Toc509165850"/>
       <w:r>
         <w:rPr>
           <w:szCs w:val="20"/>
         </w:rPr>
+        <w:lastRenderedPageBreak/>
         <w:t>Print Recaps</w:t>
       </w:r>
-      <w:bookmarkEnd w:id="23"/>
+      <w:bookmarkEnd w:id="24"/>
       <w:r>
         <w:rPr>
           <w:szCs w:val="20"/>
@@ -8162,14 +8247,7 @@
         <w:t>’</w:t>
       </w:r>
       <w:r>
-        <w:t xml:space="preserve">s print dialog. You can then “print to pdf” to save the information as a pdf file. The “Print by </w:t>
-      </w:r>
-      <w:r>
-        <w:lastRenderedPageBreak/>
-        <w:t xml:space="preserve">Date” button </w:t>
-      </w:r>
-      <w:r>
-        <w:t>opens the print by date screen. You can enter a date range to print multiple tournaments from here.</w:t>
+        <w:t>s print dialog. You can then “print to pdf” to save the information as a pdf file.</w:t>
       </w:r>
     </w:p>
     <w:p>
@@ -8197,7 +8275,7 @@
                     <pic:cNvPicPr/>
                   </pic:nvPicPr>
                   <pic:blipFill>
-                    <a:blip r:embed="rId20">
+                    <a:blip r:embed="rId21">
                       <a:extLst>
                         <a:ext uri="{28A0092B-C50C-407E-A947-70E740481C1C}">
                           <a14:useLocalDpi xmlns:a14="http://schemas.microsoft.com/office/drawing/2010/main" val="0"/>
@@ -8223,52 +8301,6 @@
           </wp:inline>
         </w:drawing>
       </w:r>
-      <w:r>
-        <w:rPr>
-          <w:noProof/>
-        </w:rPr>
-        <w:drawing>
-          <wp:inline distT="0" distB="0" distL="0" distR="0" wp14:anchorId="443E965A" wp14:editId="301AC7B9">
-            <wp:extent cx="1590632" cy="2000422"/>
-            <wp:effectExtent l="0" t="0" r="0" b="0"/>
-            <wp:docPr id="2" name="Picture 2"/>
-            <wp:cNvGraphicFramePr>
-              <a:graphicFrameLocks xmlns:a="http://schemas.openxmlformats.org/drawingml/2006/main" noChangeAspect="1"/>
-            </wp:cNvGraphicFramePr>
-            <a:graphic xmlns:a="http://schemas.openxmlformats.org/drawingml/2006/main">
-              <a:graphicData uri="http://schemas.openxmlformats.org/drawingml/2006/picture">
-                <pic:pic xmlns:pic="http://schemas.openxmlformats.org/drawingml/2006/picture">
-                  <pic:nvPicPr>
-                    <pic:cNvPr id="2" name="PrintByDateForm.PNG"/>
-                    <pic:cNvPicPr/>
-                  </pic:nvPicPr>
-                  <pic:blipFill>
-                    <a:blip r:embed="rId21">
-                      <a:extLst>
-                        <a:ext uri="{28A0092B-C50C-407E-A947-70E740481C1C}">
-                          <a14:useLocalDpi xmlns:a14="http://schemas.microsoft.com/office/drawing/2010/main" val="0"/>
-                        </a:ext>
-                      </a:extLst>
-                    </a:blip>
-                    <a:stretch>
-                      <a:fillRect/>
-                    </a:stretch>
-                  </pic:blipFill>
-                  <pic:spPr>
-                    <a:xfrm>
-                      <a:off x="0" y="0"/>
-                      <a:ext cx="1660851" cy="2088731"/>
-                    </a:xfrm>
-                    <a:prstGeom prst="rect">
-                      <a:avLst/>
-                    </a:prstGeom>
-                  </pic:spPr>
-                </pic:pic>
-              </a:graphicData>
-            </a:graphic>
-          </wp:inline>
-        </w:drawing>
-      </w:r>
     </w:p>
     <w:p>
       <w:pPr>
@@ -8278,14 +8310,27 @@
       <w:r>
         <w:t xml:space="preserve">Figure </w:t>
       </w:r>
-      <w:fldSimple w:instr=" SEQ Figure \* ARABIC ">
-        <w:r>
-          <w:rPr>
-            <w:noProof/>
-          </w:rPr>
-          <w:t>7</w:t>
-        </w:r>
-      </w:fldSimple>
+      <w:r>
+        <w:fldChar w:fldCharType="begin"/>
+      </w:r>
+      <w:r>
+        <w:instrText xml:space="preserve"> SEQ Figure \* ARABIC </w:instrText>
+      </w:r>
+      <w:r>
+        <w:fldChar w:fldCharType="separate"/>
+      </w:r>
+      <w:r>
+        <w:rPr>
+          <w:noProof/>
+        </w:rPr>
+        <w:t>7</w:t>
+      </w:r>
+      <w:r>
+        <w:rPr>
+          <w:noProof/>
+        </w:rPr>
+        <w:fldChar w:fldCharType="end"/>
+      </w:r>
       <w:r>
         <w:t>: basic printer dialog</w:t>
       </w:r>
@@ -8300,14 +8345,14 @@
           <w:szCs w:val="20"/>
         </w:rPr>
       </w:pPr>
-      <w:bookmarkStart w:id="24" w:name="_Toc509165851"/>
+      <w:bookmarkStart w:id="25" w:name="_Toc509165851"/>
       <w:r>
         <w:rPr>
           <w:szCs w:val="20"/>
         </w:rPr>
         <w:t>Import</w:t>
       </w:r>
-      <w:bookmarkEnd w:id="24"/>
+      <w:bookmarkEnd w:id="25"/>
       <w:r>
         <w:rPr>
           <w:szCs w:val="20"/>
@@ -8462,14 +8507,27 @@
       <w:r>
         <w:t xml:space="preserve">Figure </w:t>
       </w:r>
-      <w:fldSimple w:instr=" SEQ Figure \* ARABIC ">
-        <w:r>
-          <w:rPr>
-            <w:noProof/>
-          </w:rPr>
-          <w:t>8</w:t>
-        </w:r>
-      </w:fldSimple>
+      <w:r>
+        <w:fldChar w:fldCharType="begin"/>
+      </w:r>
+      <w:r>
+        <w:instrText xml:space="preserve"> SEQ Figure \* ARABIC </w:instrText>
+      </w:r>
+      <w:r>
+        <w:fldChar w:fldCharType="separate"/>
+      </w:r>
+      <w:r>
+        <w:rPr>
+          <w:noProof/>
+        </w:rPr>
+        <w:t>8</w:t>
+      </w:r>
+      <w:r>
+        <w:rPr>
+          <w:noProof/>
+        </w:rPr>
+        <w:fldChar w:fldCharType="end"/>
+      </w:r>
       <w:r>
         <w:t>: Importing existing player information</w:t>
       </w:r>
@@ -8478,12 +8536,12 @@
       <w:pPr>
         <w:pStyle w:val="Heading1"/>
       </w:pPr>
-      <w:bookmarkStart w:id="25" w:name="_Toc509165852"/>
+      <w:bookmarkStart w:id="26" w:name="_Toc509165852"/>
       <w:r>
         <w:lastRenderedPageBreak/>
         <w:t>Member Scores</w:t>
       </w:r>
-      <w:bookmarkEnd w:id="25"/>
+      <w:bookmarkEnd w:id="26"/>
       <w:r>
         <w:fldChar w:fldCharType="begin"/>
       </w:r>
@@ -8597,14 +8655,27 @@
       <w:r>
         <w:t xml:space="preserve">Figure </w:t>
       </w:r>
-      <w:fldSimple w:instr=" SEQ Figure \* ARABIC ">
-        <w:r>
-          <w:rPr>
-            <w:noProof/>
-          </w:rPr>
-          <w:t>9</w:t>
-        </w:r>
-      </w:fldSimple>
+      <w:r>
+        <w:fldChar w:fldCharType="begin"/>
+      </w:r>
+      <w:r>
+        <w:instrText xml:space="preserve"> SEQ Figure \* ARABIC </w:instrText>
+      </w:r>
+      <w:r>
+        <w:fldChar w:fldCharType="separate"/>
+      </w:r>
+      <w:r>
+        <w:rPr>
+          <w:noProof/>
+        </w:rPr>
+        <w:t>9</w:t>
+      </w:r>
+      <w:r>
+        <w:rPr>
+          <w:noProof/>
+        </w:rPr>
+        <w:fldChar w:fldCharType="end"/>
+      </w:r>
       <w:r>
         <w:t>: Member Scores</w:t>
       </w:r>
@@ -8777,11 +8848,11 @@
       <w:pPr>
         <w:pStyle w:val="Heading2"/>
       </w:pPr>
-      <w:bookmarkStart w:id="26" w:name="_Toc509165865"/>
+      <w:bookmarkStart w:id="27" w:name="_Toc509165865"/>
       <w:r>
         <w:t>Comments</w:t>
       </w:r>
-      <w:bookmarkEnd w:id="26"/>
+      <w:bookmarkEnd w:id="27"/>
       <w:r>
         <w:fldChar w:fldCharType="begin"/>
       </w:r>
@@ -8854,7 +8925,7 @@
           <w:szCs w:val="20"/>
         </w:rPr>
       </w:pPr>
-      <w:bookmarkStart w:id="27" w:name="_Toc509165853"/>
+      <w:bookmarkStart w:id="28" w:name="_Toc509165853"/>
       <w:r>
         <w:rPr>
           <w:szCs w:val="20"/>
@@ -8862,7 +8933,7 @@
         <w:lastRenderedPageBreak/>
         <w:t>Tournament Stats</w:t>
       </w:r>
-      <w:bookmarkEnd w:id="27"/>
+      <w:bookmarkEnd w:id="28"/>
       <w:r>
         <w:rPr>
           <w:szCs w:val="20"/>
@@ -9062,14 +9133,27 @@
       <w:r>
         <w:t xml:space="preserve">Figure </w:t>
       </w:r>
-      <w:fldSimple w:instr=" SEQ Figure \* ARABIC ">
-        <w:r>
-          <w:rPr>
-            <w:noProof/>
-          </w:rPr>
-          <w:t>10</w:t>
-        </w:r>
-      </w:fldSimple>
+      <w:r>
+        <w:fldChar w:fldCharType="begin"/>
+      </w:r>
+      <w:r>
+        <w:instrText xml:space="preserve"> SEQ Figure \* ARABIC </w:instrText>
+      </w:r>
+      <w:r>
+        <w:fldChar w:fldCharType="separate"/>
+      </w:r>
+      <w:r>
+        <w:rPr>
+          <w:noProof/>
+        </w:rPr>
+        <w:t>10</w:t>
+      </w:r>
+      <w:r>
+        <w:rPr>
+          <w:noProof/>
+        </w:rPr>
+        <w:fldChar w:fldCharType="end"/>
+      </w:r>
       <w:r>
         <w:t>: Tournament Stats</w:t>
       </w:r>
@@ -9124,7 +9208,7 @@
           <w:szCs w:val="20"/>
         </w:rPr>
       </w:pPr>
-      <w:bookmarkStart w:id="28" w:name="_Toc509165854"/>
+      <w:bookmarkStart w:id="29" w:name="_Toc509165854"/>
       <w:r>
         <w:rPr>
           <w:szCs w:val="20"/>
@@ -9143,7 +9227,7 @@
         </w:rPr>
         <w:t>By Tournament</w:t>
       </w:r>
-      <w:bookmarkEnd w:id="28"/>
+      <w:bookmarkEnd w:id="29"/>
       <w:r>
         <w:rPr>
           <w:szCs w:val="20"/>
@@ -9276,7 +9360,7 @@
                     <pic:cNvPicPr/>
                   </pic:nvPicPr>
                   <pic:blipFill>
-                    <a:blip r:embed="rId20">
+                    <a:blip r:embed="rId21">
                       <a:extLst>
                         <a:ext uri="{28A0092B-C50C-407E-A947-70E740481C1C}">
                           <a14:useLocalDpi xmlns:a14="http://schemas.microsoft.com/office/drawing/2010/main" val="0"/>
@@ -9311,14 +9395,27 @@
       <w:r>
         <w:t xml:space="preserve">Figure </w:t>
       </w:r>
-      <w:fldSimple w:instr=" SEQ Figure \* ARABIC ">
-        <w:r>
-          <w:rPr>
-            <w:noProof/>
-          </w:rPr>
-          <w:t>11</w:t>
-        </w:r>
-      </w:fldSimple>
+      <w:r>
+        <w:fldChar w:fldCharType="begin"/>
+      </w:r>
+      <w:r>
+        <w:instrText xml:space="preserve"> SEQ Figure \* ARABIC </w:instrText>
+      </w:r>
+      <w:r>
+        <w:fldChar w:fldCharType="separate"/>
+      </w:r>
+      <w:r>
+        <w:rPr>
+          <w:noProof/>
+        </w:rPr>
+        <w:t>11</w:t>
+      </w:r>
+      <w:r>
+        <w:rPr>
+          <w:noProof/>
+        </w:rPr>
+        <w:fldChar w:fldCharType="end"/>
+      </w:r>
       <w:r>
         <w:t xml:space="preserve"> Print Dialog</w:t>
       </w:r>
@@ -9327,12 +9424,12 @@
       <w:pPr>
         <w:pStyle w:val="Heading2"/>
       </w:pPr>
-      <w:bookmarkStart w:id="29" w:name="_Toc509165855"/>
+      <w:bookmarkStart w:id="30" w:name="_Toc509165855"/>
       <w:r>
         <w:lastRenderedPageBreak/>
         <w:t>Tournament Place Standings</w:t>
       </w:r>
-      <w:bookmarkEnd w:id="29"/>
+      <w:bookmarkEnd w:id="30"/>
       <w:r>
         <w:fldChar w:fldCharType="begin"/>
       </w:r>
@@ -9460,14 +9557,27 @@
       <w:r>
         <w:t xml:space="preserve">Figure </w:t>
       </w:r>
-      <w:fldSimple w:instr=" SEQ Figure \* ARABIC ">
-        <w:r>
-          <w:rPr>
-            <w:noProof/>
-          </w:rPr>
-          <w:t>12</w:t>
-        </w:r>
-      </w:fldSimple>
+      <w:r>
+        <w:fldChar w:fldCharType="begin"/>
+      </w:r>
+      <w:r>
+        <w:instrText xml:space="preserve"> SEQ Figure \* ARABIC </w:instrText>
+      </w:r>
+      <w:r>
+        <w:fldChar w:fldCharType="separate"/>
+      </w:r>
+      <w:r>
+        <w:rPr>
+          <w:noProof/>
+        </w:rPr>
+        <w:t>12</w:t>
+      </w:r>
+      <w:r>
+        <w:rPr>
+          <w:noProof/>
+        </w:rPr>
+        <w:fldChar w:fldCharType="end"/>
+      </w:r>
       <w:r>
         <w:t>: Tournament Place Standings</w:t>
       </w:r>
@@ -9501,14 +9611,14 @@
       <w:pPr>
         <w:pStyle w:val="Heading2"/>
       </w:pPr>
-      <w:bookmarkStart w:id="30" w:name="_Toc509165856"/>
+      <w:bookmarkStart w:id="31" w:name="_Toc509165856"/>
       <w:r>
         <w:t xml:space="preserve"> How to create or e</w:t>
       </w:r>
       <w:r>
         <w:t>dit Tournament</w:t>
       </w:r>
-      <w:bookmarkEnd w:id="30"/>
+      <w:bookmarkEnd w:id="31"/>
       <w:r>
         <w:fldChar w:fldCharType="begin"/>
       </w:r>
@@ -9776,14 +9886,27 @@
       <w:r>
         <w:t xml:space="preserve">Figure </w:t>
       </w:r>
-      <w:fldSimple w:instr=" SEQ Figure \* ARABIC ">
-        <w:r>
-          <w:rPr>
-            <w:noProof/>
-          </w:rPr>
-          <w:t>13</w:t>
-        </w:r>
-      </w:fldSimple>
+      <w:r>
+        <w:fldChar w:fldCharType="begin"/>
+      </w:r>
+      <w:r>
+        <w:instrText xml:space="preserve"> SEQ Figure \* ARABIC </w:instrText>
+      </w:r>
+      <w:r>
+        <w:fldChar w:fldCharType="separate"/>
+      </w:r>
+      <w:r>
+        <w:rPr>
+          <w:noProof/>
+        </w:rPr>
+        <w:t>13</w:t>
+      </w:r>
+      <w:r>
+        <w:rPr>
+          <w:noProof/>
+        </w:rPr>
+        <w:fldChar w:fldCharType="end"/>
+      </w:r>
       <w:r>
         <w:t xml:space="preserve">: </w:t>
       </w:r>
@@ -9826,14 +9949,14 @@
       <w:pPr>
         <w:pStyle w:val="Heading3"/>
       </w:pPr>
-      <w:bookmarkStart w:id="31" w:name="_Toc509165857"/>
+      <w:bookmarkStart w:id="32" w:name="_Toc509165857"/>
       <w:r>
         <w:t xml:space="preserve"> How t</w:t>
       </w:r>
       <w:r>
         <w:t>o Update an Existing Tournament</w:t>
       </w:r>
-      <w:bookmarkEnd w:id="31"/>
+      <w:bookmarkEnd w:id="32"/>
     </w:p>
     <w:p>
       <w:pPr>
@@ -9913,11 +10036,12 @@
       <w:pPr>
         <w:pStyle w:val="Heading2"/>
       </w:pPr>
-      <w:bookmarkStart w:id="32" w:name="_Toc509165858"/>
-      <w:r>
+      <w:bookmarkStart w:id="33" w:name="_Toc509165858"/>
+      <w:r>
+        <w:lastRenderedPageBreak/>
         <w:t>Search Tournaments</w:t>
       </w:r>
-      <w:bookmarkEnd w:id="32"/>
+      <w:bookmarkEnd w:id="33"/>
       <w:r>
         <w:fldChar w:fldCharType="begin"/>
       </w:r>
@@ -9940,11 +10064,7 @@
         <w:keepNext/>
       </w:pPr>
       <w:r>
-        <w:t xml:space="preserve">Tournaments can be searched by location, event, or tournament date. This function can be reached by either the “Edit Existing Tournament” button on the New Tournament </w:t>
-      </w:r>
-      <w:r>
-        <w:lastRenderedPageBreak/>
-        <w:t>screen; or by the “Search Tournaments</w:t>
+        <w:t>Tournaments can be searched by location, event, or tournament date. This function can be reached by either the “Edit Existing Tournament” button on the New Tournament screen; or by the “Search Tournaments</w:t>
       </w:r>
       <w:r>
         <w:fldChar w:fldCharType="begin"/>
@@ -10089,14 +10209,27 @@
       <w:r>
         <w:t xml:space="preserve">Figure </w:t>
       </w:r>
-      <w:fldSimple w:instr=" SEQ Figure \* ARABIC ">
-        <w:r>
-          <w:rPr>
-            <w:noProof/>
-          </w:rPr>
-          <w:t>14</w:t>
-        </w:r>
-      </w:fldSimple>
+      <w:r>
+        <w:fldChar w:fldCharType="begin"/>
+      </w:r>
+      <w:r>
+        <w:instrText xml:space="preserve"> SEQ Figure \* ARABIC </w:instrText>
+      </w:r>
+      <w:r>
+        <w:fldChar w:fldCharType="separate"/>
+      </w:r>
+      <w:r>
+        <w:rPr>
+          <w:noProof/>
+        </w:rPr>
+        <w:t>14</w:t>
+      </w:r>
+      <w:r>
+        <w:rPr>
+          <w:noProof/>
+        </w:rPr>
+        <w:fldChar w:fldCharType="end"/>
+      </w:r>
       <w:r>
         <w:t>: Tournament Search Forms</w:t>
       </w:r>
@@ -10105,11 +10238,11 @@
       <w:pPr>
         <w:pStyle w:val="Heading3"/>
       </w:pPr>
-      <w:bookmarkStart w:id="33" w:name="_Toc509165859"/>
+      <w:bookmarkStart w:id="34" w:name="_Toc509165859"/>
       <w:r>
         <w:t>Search by Location</w:t>
       </w:r>
-      <w:bookmarkEnd w:id="33"/>
+      <w:bookmarkEnd w:id="34"/>
       <w:r>
         <w:fldChar w:fldCharType="begin"/>
       </w:r>
@@ -10147,11 +10280,11 @@
       <w:pPr>
         <w:pStyle w:val="Heading3"/>
       </w:pPr>
-      <w:bookmarkStart w:id="34" w:name="_Toc509165860"/>
+      <w:bookmarkStart w:id="35" w:name="_Toc509165860"/>
       <w:r>
         <w:t>Search by Event</w:t>
       </w:r>
-      <w:bookmarkEnd w:id="34"/>
+      <w:bookmarkEnd w:id="35"/>
       <w:r>
         <w:fldChar w:fldCharType="begin"/>
       </w:r>
@@ -10246,11 +10379,11 @@
       <w:pPr>
         <w:pStyle w:val="Heading3"/>
       </w:pPr>
-      <w:bookmarkStart w:id="35" w:name="_Toc509165861"/>
+      <w:bookmarkStart w:id="36" w:name="_Toc509165861"/>
       <w:r>
         <w:t>Search by Date</w:t>
       </w:r>
-      <w:bookmarkEnd w:id="35"/>
+      <w:bookmarkEnd w:id="36"/>
       <w:r>
         <w:fldChar w:fldCharType="begin"/>
       </w:r>
@@ -10279,7 +10412,7 @@
       <w:pPr>
         <w:pStyle w:val="Heading2"/>
       </w:pPr>
-      <w:bookmarkStart w:id="36" w:name="_Toc509165862"/>
+      <w:bookmarkStart w:id="37" w:name="_Toc509165862"/>
       <w:r>
         <w:lastRenderedPageBreak/>
         <w:t>List Tournaments</w:t>
@@ -10315,7 +10448,7 @@
       <w:r>
         <w:t>ear</w:t>
       </w:r>
-      <w:bookmarkEnd w:id="36"/>
+      <w:bookmarkEnd w:id="37"/>
       <w:r>
         <w:fldChar w:fldCharType="begin"/>
       </w:r>
@@ -10525,14 +10658,27 @@
       <w:r>
         <w:t xml:space="preserve">Figure </w:t>
       </w:r>
-      <w:fldSimple w:instr=" SEQ Figure \* ARABIC ">
-        <w:r>
-          <w:rPr>
-            <w:noProof/>
-          </w:rPr>
-          <w:t>15</w:t>
-        </w:r>
-      </w:fldSimple>
+      <w:r>
+        <w:fldChar w:fldCharType="begin"/>
+      </w:r>
+      <w:r>
+        <w:instrText xml:space="preserve"> SEQ Figure \* ARABIC </w:instrText>
+      </w:r>
+      <w:r>
+        <w:fldChar w:fldCharType="separate"/>
+      </w:r>
+      <w:r>
+        <w:rPr>
+          <w:noProof/>
+        </w:rPr>
+        <w:t>15</w:t>
+      </w:r>
+      <w:r>
+        <w:rPr>
+          <w:noProof/>
+        </w:rPr>
+        <w:fldChar w:fldCharType="end"/>
+      </w:r>
       <w:r>
         <w:t>: Tournaments</w:t>
       </w:r>
@@ -10569,11 +10715,11 @@
       <w:pPr>
         <w:pStyle w:val="Heading2"/>
       </w:pPr>
-      <w:bookmarkStart w:id="37" w:name="_Toc509165863"/>
+      <w:bookmarkStart w:id="38" w:name="_Toc509165863"/>
       <w:r>
         <w:t>Reports</w:t>
       </w:r>
-      <w:bookmarkEnd w:id="37"/>
+      <w:bookmarkEnd w:id="38"/>
       <w:r>
         <w:fldChar w:fldCharType="begin"/>
       </w:r>
@@ -10748,14 +10894,27 @@
       <w:r>
         <w:t xml:space="preserve">Figure </w:t>
       </w:r>
-      <w:fldSimple w:instr=" SEQ Figure \* ARABIC ">
-        <w:r>
-          <w:rPr>
-            <w:noProof/>
-          </w:rPr>
-          <w:t>16</w:t>
-        </w:r>
-      </w:fldSimple>
+      <w:r>
+        <w:fldChar w:fldCharType="begin"/>
+      </w:r>
+      <w:r>
+        <w:instrText xml:space="preserve"> SEQ Figure \* ARABIC </w:instrText>
+      </w:r>
+      <w:r>
+        <w:fldChar w:fldCharType="separate"/>
+      </w:r>
+      <w:r>
+        <w:rPr>
+          <w:noProof/>
+        </w:rPr>
+        <w:t>16</w:t>
+      </w:r>
+      <w:r>
+        <w:rPr>
+          <w:noProof/>
+        </w:rPr>
+        <w:fldChar w:fldCharType="end"/>
+      </w:r>
       <w:r>
         <w:t xml:space="preserve"> Member Scores</w:t>
       </w:r>
@@ -10885,8 +11044,6 @@
       <w:pPr>
         <w:pStyle w:val="Heading3"/>
       </w:pPr>
-      <w:bookmarkStart w:id="38" w:name="_GoBack"/>
-      <w:bookmarkEnd w:id="38"/>
       <w:r>
         <w:t>Print Series by Squad</w:t>
       </w:r>
@@ -10896,16 +11053,7 @@
         <w:pStyle w:val="BodyText"/>
       </w:pPr>
       <w:r>
-        <w:t xml:space="preserve">To print a Series report displaying specific squads indicate what squads should be displayed on the printout using “Filter Series by Squad” checkboxes </w:t>
-      </w:r>
-      <w:r>
-        <w:t xml:space="preserve">on the member scores screen </w:t>
-      </w:r>
-      <w:r>
-        <w:t xml:space="preserve">before clicking the “Series” print button. The Series printout will say which squads are displayed at the top of the printout and the players will be ordered by score. </w:t>
-      </w:r>
-      <w:r>
-        <w:t xml:space="preserve"> </w:t>
+        <w:t xml:space="preserve">To print a Series report displaying specific squads indicate what squads should be displayed on the printout using “Filter Series by Squad” checkboxes on the member scores screen before clicking the “Series” print button. The Series printout will say which squads are displayed at the top of the printout and the players will be ordered by score.  </w:t>
       </w:r>
     </w:p>
     <w:p>
@@ -10923,6 +11071,9 @@
         <w:t xml:space="preserve">                                  </w:t>
       </w:r>
       <w:r>
+        <w:rPr>
+          <w:noProof/>
+        </w:rPr>
         <w:drawing>
           <wp:inline distT="0" distB="0" distL="0" distR="0" wp14:anchorId="3FE298C4" wp14:editId="43CE0D6C">
             <wp:extent cx="1051508" cy="1600200"/>
@@ -11243,14 +11394,27 @@
       <w:r>
         <w:t xml:space="preserve">Figure </w:t>
       </w:r>
-      <w:fldSimple w:instr=" SEQ Figure \* ARABIC ">
-        <w:r>
-          <w:rPr>
-            <w:noProof/>
-          </w:rPr>
-          <w:t>17</w:t>
-        </w:r>
-      </w:fldSimple>
+      <w:r>
+        <w:fldChar w:fldCharType="begin"/>
+      </w:r>
+      <w:r>
+        <w:instrText xml:space="preserve"> SEQ Figure \* ARABIC </w:instrText>
+      </w:r>
+      <w:r>
+        <w:fldChar w:fldCharType="separate"/>
+      </w:r>
+      <w:r>
+        <w:rPr>
+          <w:noProof/>
+        </w:rPr>
+        <w:t>17</w:t>
+      </w:r>
+      <w:r>
+        <w:rPr>
+          <w:noProof/>
+        </w:rPr>
+        <w:fldChar w:fldCharType="end"/>
+      </w:r>
       <w:r>
         <w:rPr>
           <w:noProof/>
@@ -12304,14 +12468,27 @@
       <w:r>
         <w:t xml:space="preserve">Figure </w:t>
       </w:r>
-      <w:fldSimple w:instr=" SEQ Figure \* ARABIC ">
-        <w:r>
-          <w:rPr>
-            <w:noProof/>
-          </w:rPr>
-          <w:t>18</w:t>
-        </w:r>
-      </w:fldSimple>
+      <w:r>
+        <w:fldChar w:fldCharType="begin"/>
+      </w:r>
+      <w:r>
+        <w:instrText xml:space="preserve"> SEQ Figure \* ARABIC </w:instrText>
+      </w:r>
+      <w:r>
+        <w:fldChar w:fldCharType="separate"/>
+      </w:r>
+      <w:r>
+        <w:rPr>
+          <w:noProof/>
+        </w:rPr>
+        <w:t>18</w:t>
+      </w:r>
+      <w:r>
+        <w:rPr>
+          <w:noProof/>
+        </w:rPr>
+        <w:fldChar w:fldCharType="end"/>
+      </w:r>
       <w:r>
         <w:t xml:space="preserve">a </w:t>
       </w:r>
@@ -13910,14 +14087,27 @@
       <w:r>
         <w:t xml:space="preserve">Figure </w:t>
       </w:r>
-      <w:fldSimple w:instr=" SEQ Figure \* ARABIC ">
-        <w:r>
-          <w:rPr>
-            <w:noProof/>
-          </w:rPr>
-          <w:t>19</w:t>
-        </w:r>
-      </w:fldSimple>
+      <w:r>
+        <w:fldChar w:fldCharType="begin"/>
+      </w:r>
+      <w:r>
+        <w:instrText xml:space="preserve"> SEQ Figure \* ARABIC </w:instrText>
+      </w:r>
+      <w:r>
+        <w:fldChar w:fldCharType="separate"/>
+      </w:r>
+      <w:r>
+        <w:rPr>
+          <w:noProof/>
+        </w:rPr>
+        <w:t>19</w:t>
+      </w:r>
+      <w:r>
+        <w:rPr>
+          <w:noProof/>
+        </w:rPr>
+        <w:fldChar w:fldCharType="end"/>
+      </w:r>
       <w:r>
         <w:rPr>
           <w:noProof/>
@@ -14301,14 +14491,27 @@
       <w:r>
         <w:t xml:space="preserve">Figure </w:t>
       </w:r>
-      <w:fldSimple w:instr=" SEQ Figure \* ARABIC ">
-        <w:r>
-          <w:rPr>
-            <w:noProof/>
-          </w:rPr>
-          <w:t>20</w:t>
-        </w:r>
-      </w:fldSimple>
+      <w:r>
+        <w:fldChar w:fldCharType="begin"/>
+      </w:r>
+      <w:r>
+        <w:instrText xml:space="preserve"> SEQ Figure \* ARABIC </w:instrText>
+      </w:r>
+      <w:r>
+        <w:fldChar w:fldCharType="separate"/>
+      </w:r>
+      <w:r>
+        <w:rPr>
+          <w:noProof/>
+        </w:rPr>
+        <w:t>20</w:t>
+      </w:r>
+      <w:r>
+        <w:rPr>
+          <w:noProof/>
+        </w:rPr>
+        <w:fldChar w:fldCharType="end"/>
+      </w:r>
       <w:r>
         <w:t xml:space="preserve"> Showing split screen error</w:t>
       </w:r>
@@ -14376,14 +14579,27 @@
                             <w:r>
                               <w:t xml:space="preserve">Figure </w:t>
                             </w:r>
-                            <w:fldSimple w:instr=" SEQ Figure \* ARABIC ">
-                              <w:r>
-                                <w:rPr>
-                                  <w:noProof/>
-                                </w:rPr>
-                                <w:t>21</w:t>
-                              </w:r>
-                            </w:fldSimple>
+                            <w:r>
+                              <w:fldChar w:fldCharType="begin"/>
+                            </w:r>
+                            <w:r>
+                              <w:instrText xml:space="preserve"> SEQ Figure \* ARABIC </w:instrText>
+                            </w:r>
+                            <w:r>
+                              <w:fldChar w:fldCharType="separate"/>
+                            </w:r>
+                            <w:r>
+                              <w:rPr>
+                                <w:noProof/>
+                              </w:rPr>
+                              <w:t>21</w:t>
+                            </w:r>
+                            <w:r>
+                              <w:rPr>
+                                <w:noProof/>
+                              </w:rPr>
+                              <w:fldChar w:fldCharType="end"/>
+                            </w:r>
                             <w:r>
                               <w:t xml:space="preserve"> Inner screen maximize</w:t>
                             </w:r>
@@ -15709,7 +15925,6 @@
         </w:numPr>
       </w:pPr>
       <w:r>
-        <w:lastRenderedPageBreak/>
         <w:t>Member Number</w:t>
       </w:r>
       <w:r>
@@ -15782,6 +15997,7 @@
         </w:numPr>
       </w:pPr>
       <w:r>
+        <w:lastRenderedPageBreak/>
         <w:t>Middle Initial—member’s middle initial.</w:t>
       </w:r>
     </w:p>
@@ -16103,7 +16319,6 @@
         </w:numPr>
       </w:pPr>
       <w:r>
-        <w:lastRenderedPageBreak/>
         <w:t>Year End Tournaments</w:t>
       </w:r>
       <w:r>
@@ -16267,6 +16482,7 @@
         </w:numPr>
       </w:pPr>
       <w:r>
+        <w:lastRenderedPageBreak/>
         <w:t>Save—saves member information to the database.</w:t>
       </w:r>
     </w:p>
@@ -16726,7 +16942,6 @@
       </w:pPr>
       <w:bookmarkStart w:id="52" w:name="_Toc509165876"/>
       <w:r>
-        <w:lastRenderedPageBreak/>
         <w:t>Member Scores</w:t>
       </w:r>
       <w:bookmarkEnd w:id="52"/>
@@ -16950,6 +17165,7 @@
         </w:numPr>
       </w:pPr>
       <w:r>
+        <w:lastRenderedPageBreak/>
         <w:t>Middle Initial</w:t>
       </w:r>
       <w:r>
@@ -17384,7 +17600,6 @@
         </w:numPr>
       </w:pPr>
       <w:r>
-        <w:lastRenderedPageBreak/>
         <w:t>Leaders section</w:t>
       </w:r>
     </w:p>
@@ -17583,6 +17798,7 @@
         </w:numPr>
       </w:pPr>
       <w:r>
+        <w:lastRenderedPageBreak/>
         <w:t>Add New/Update Record</w:t>
       </w:r>
       <w:r>
@@ -17879,7 +18095,6 @@
         </w:numPr>
       </w:pPr>
       <w:r>
-        <w:lastRenderedPageBreak/>
         <w:t>Tournament File</w:t>
       </w:r>
       <w:r>
@@ -18130,6 +18345,7 @@
         </w:numPr>
       </w:pPr>
       <w:r>
+        <w:lastRenderedPageBreak/>
         <w:t>Comments</w:t>
       </w:r>
       <w:r>
@@ -19819,7 +20035,7 @@
         <w:rStyle w:val="PageNumber"/>
         <w:noProof/>
       </w:rPr>
-      <w:t>23</w:t>
+      <w:t>13</w:t>
     </w:r>
     <w:r>
       <w:rPr>
@@ -22920,7 +23136,7 @@
 </file>
 
 <file path=customXml/itemProps1.xml><?xml version="1.0" encoding="utf-8"?>
-<ds:datastoreItem xmlns:ds="http://schemas.openxmlformats.org/officeDocument/2006/customXml" ds:itemID="{0102EFED-19AE-4C50-B8F5-0428BA4776A7}">
+<ds:datastoreItem xmlns:ds="http://schemas.openxmlformats.org/officeDocument/2006/customXml" ds:itemID="{ACEED1EC-522F-4871-A654-03A90C83104D}">
   <ds:schemaRefs>
     <ds:schemaRef ds:uri="http://schemas.openxmlformats.org/officeDocument/2006/bibliography"/>
   </ds:schemaRefs>

</xml_diff>

<commit_message>
Added another screenshot and edited the information
</commit_message>
<xml_diff>
--- a/NineTapTour/NineTapTour/Resources/9tapUserManual.docx
+++ b/NineTapTour/NineTapTour/Resources/9tapUserManual.docx
@@ -7490,8 +7490,6 @@
           </wp:inline>
         </w:drawing>
       </w:r>
-      <w:bookmarkStart w:id="20" w:name="_GoBack"/>
-      <w:bookmarkEnd w:id="20"/>
     </w:p>
     <w:p>
       <w:pPr>
@@ -7530,14 +7528,14 @@
       <w:pPr>
         <w:pStyle w:val="Heading3"/>
       </w:pPr>
-      <w:bookmarkStart w:id="21" w:name="_Toc509165847"/>
+      <w:bookmarkStart w:id="20" w:name="_Toc509165847"/>
       <w:r>
         <w:t xml:space="preserve">Updating </w:t>
       </w:r>
       <w:r>
         <w:t>Members</w:t>
       </w:r>
-      <w:bookmarkEnd w:id="21"/>
+      <w:bookmarkEnd w:id="20"/>
       <w:r>
         <w:fldChar w:fldCharType="begin"/>
       </w:r>
@@ -7710,14 +7708,14 @@
           <w:szCs w:val="20"/>
         </w:rPr>
       </w:pPr>
-      <w:bookmarkStart w:id="22" w:name="_Toc509165848"/>
+      <w:bookmarkStart w:id="21" w:name="_Toc509165848"/>
       <w:r>
         <w:rPr>
           <w:szCs w:val="20"/>
         </w:rPr>
         <w:t>Stats</w:t>
       </w:r>
-      <w:bookmarkEnd w:id="22"/>
+      <w:bookmarkEnd w:id="21"/>
       <w:r>
         <w:rPr>
           <w:szCs w:val="20"/>
@@ -7907,14 +7905,14 @@
           <w:szCs w:val="20"/>
         </w:rPr>
       </w:pPr>
-      <w:bookmarkStart w:id="23" w:name="_Toc509165849"/>
+      <w:bookmarkStart w:id="22" w:name="_Toc509165849"/>
       <w:r>
         <w:rPr>
           <w:szCs w:val="20"/>
         </w:rPr>
         <w:t>Member Search</w:t>
       </w:r>
-      <w:bookmarkEnd w:id="23"/>
+      <w:bookmarkEnd w:id="22"/>
       <w:r>
         <w:rPr>
           <w:szCs w:val="20"/>
@@ -8163,15 +8161,14 @@
           <w:szCs w:val="20"/>
         </w:rPr>
       </w:pPr>
-      <w:bookmarkStart w:id="24" w:name="_Toc509165850"/>
+      <w:bookmarkStart w:id="23" w:name="_Toc509165850"/>
       <w:r>
         <w:rPr>
           <w:szCs w:val="20"/>
         </w:rPr>
-        <w:lastRenderedPageBreak/>
         <w:t>Print Recaps</w:t>
       </w:r>
-      <w:bookmarkEnd w:id="24"/>
+      <w:bookmarkEnd w:id="23"/>
       <w:r>
         <w:rPr>
           <w:szCs w:val="20"/>
@@ -8241,7 +8238,19 @@
         <w:keepNext/>
       </w:pPr>
       <w:r>
-        <w:t>The “Print Single” and “Print Tournament” buttons go directly to your computer</w:t>
+        <w:t xml:space="preserve">The “Print Single” </w:t>
+      </w:r>
+      <w:r>
+        <w:t>button</w:t>
+      </w:r>
+      <w:r>
+        <w:t xml:space="preserve"> go</w:t>
+      </w:r>
+      <w:r>
+        <w:t>es</w:t>
+      </w:r>
+      <w:r>
+        <w:t xml:space="preserve"> directly to your computer</w:t>
       </w:r>
       <w:r>
         <w:t>’</w:t>
@@ -8249,12 +8258,84 @@
       <w:r>
         <w:t>s print dialog. You can then “print to pdf” to save the information as a pdf file.</w:t>
       </w:r>
+      <w:r>
+        <w:t xml:space="preserve"> The </w:t>
+      </w:r>
+      <w:r>
+        <w:t>“Print Active Members”</w:t>
+      </w:r>
+      <w:r>
+        <w:t xml:space="preserve"> button </w:t>
+      </w:r>
+      <w:r>
+        <w:lastRenderedPageBreak/>
+        <w:t>will have the window dialog pop up, asking you to confirm before printing the information</w:t>
+      </w:r>
+      <w:r>
+        <w:t xml:space="preserve"> for the active members</w:t>
+      </w:r>
+      <w:r>
+        <w:t>.</w:t>
+      </w:r>
     </w:p>
     <w:p>
       <w:pPr>
         <w:pStyle w:val="BodyText"/>
         <w:keepNext/>
       </w:pPr>
+      <w:bookmarkStart w:id="24" w:name="_GoBack"/>
+      <w:r>
+        <w:rPr>
+          <w:noProof/>
+        </w:rPr>
+        <w:drawing>
+          <wp:inline distT="0" distB="0" distL="0" distR="0" wp14:anchorId="737D8029" wp14:editId="1CD48A1C">
+            <wp:extent cx="2161309" cy="1192964"/>
+            <wp:effectExtent l="0" t="0" r="0" b="7620"/>
+            <wp:docPr id="55" name="Picture 55" descr="C:\Users\zeller8964\Desktop\PrintRecap2.jpg"/>
+            <wp:cNvGraphicFramePr>
+              <a:graphicFrameLocks xmlns:a="http://schemas.openxmlformats.org/drawingml/2006/main" noChangeAspect="1"/>
+            </wp:cNvGraphicFramePr>
+            <a:graphic xmlns:a="http://schemas.openxmlformats.org/drawingml/2006/main">
+              <a:graphicData uri="http://schemas.openxmlformats.org/drawingml/2006/picture">
+                <pic:pic xmlns:pic="http://schemas.openxmlformats.org/drawingml/2006/picture">
+                  <pic:nvPicPr>
+                    <pic:cNvPr id="0" name="Picture 2" descr="C:\Users\zeller8964\Desktop\PrintRecap2.jpg"/>
+                    <pic:cNvPicPr>
+                      <a:picLocks noChangeAspect="1" noChangeArrowheads="1"/>
+                    </pic:cNvPicPr>
+                  </pic:nvPicPr>
+                  <pic:blipFill rotWithShape="1">
+                    <a:blip r:embed="rId21" cstate="print">
+                      <a:extLst>
+                        <a:ext uri="{28A0092B-C50C-407E-A947-70E740481C1C}">
+                          <a14:useLocalDpi xmlns:a14="http://schemas.microsoft.com/office/drawing/2010/main" val="0"/>
+                        </a:ext>
+                      </a:extLst>
+                    </a:blip>
+                    <a:srcRect l="18573" b="38011"/>
+                    <a:stretch/>
+                  </pic:blipFill>
+                  <pic:spPr bwMode="auto">
+                    <a:xfrm>
+                      <a:off x="0" y="0"/>
+                      <a:ext cx="2241349" cy="1237143"/>
+                    </a:xfrm>
+                    <a:prstGeom prst="rect">
+                      <a:avLst/>
+                    </a:prstGeom>
+                    <a:noFill/>
+                    <a:ln>
+                      <a:noFill/>
+                    </a:ln>
+                  </pic:spPr>
+                </pic:pic>
+              </a:graphicData>
+            </a:graphic>
+          </wp:inline>
+        </w:drawing>
+      </w:r>
+      <w:bookmarkEnd w:id="24"/>
       <w:r>
         <w:rPr>
           <w:noProof/>
@@ -8275,7 +8356,7 @@
                     <pic:cNvPicPr/>
                   </pic:nvPicPr>
                   <pic:blipFill>
-                    <a:blip r:embed="rId21">
+                    <a:blip r:embed="rId22">
                       <a:extLst>
                         <a:ext uri="{28A0092B-C50C-407E-A947-70E740481C1C}">
                           <a14:useLocalDpi xmlns:a14="http://schemas.microsoft.com/office/drawing/2010/main" val="0"/>
@@ -8335,7 +8416,7 @@
         <w:t>: basic printer dialog</w:t>
       </w:r>
       <w:r>
-        <w:t>, Print By Date form.</w:t>
+        <w:t>.</w:t>
       </w:r>
     </w:p>
     <w:p>
@@ -8472,7 +8553,7 @@
                     <pic:cNvPicPr/>
                   </pic:nvPicPr>
                   <pic:blipFill>
-                    <a:blip r:embed="rId22">
+                    <a:blip r:embed="rId23">
                       <a:extLst>
                         <a:ext uri="{28A0092B-C50C-407E-A947-70E740481C1C}">
                           <a14:useLocalDpi xmlns:a14="http://schemas.microsoft.com/office/drawing/2010/main" val="0"/>
@@ -8615,7 +8696,7 @@
                     </pic:cNvPicPr>
                   </pic:nvPicPr>
                   <pic:blipFill>
-                    <a:blip r:embed="rId23" cstate="print">
+                    <a:blip r:embed="rId24" cstate="print">
                       <a:extLst>
                         <a:ext uri="{28A0092B-C50C-407E-A947-70E740481C1C}">
                           <a14:useLocalDpi xmlns:a14="http://schemas.microsoft.com/office/drawing/2010/main" val="0"/>
@@ -9098,7 +9179,7 @@
                     <pic:cNvPicPr/>
                   </pic:nvPicPr>
                   <pic:blipFill>
-                    <a:blip r:embed="rId24" cstate="print">
+                    <a:blip r:embed="rId25" cstate="print">
                       <a:extLst>
                         <a:ext uri="{28A0092B-C50C-407E-A947-70E740481C1C}">
                           <a14:useLocalDpi xmlns:a14="http://schemas.microsoft.com/office/drawing/2010/main" val="0"/>
@@ -9360,7 +9441,7 @@
                     <pic:cNvPicPr/>
                   </pic:nvPicPr>
                   <pic:blipFill>
-                    <a:blip r:embed="rId21">
+                    <a:blip r:embed="rId22">
                       <a:extLst>
                         <a:ext uri="{28A0092B-C50C-407E-A947-70E740481C1C}">
                           <a14:useLocalDpi xmlns:a14="http://schemas.microsoft.com/office/drawing/2010/main" val="0"/>
@@ -9522,7 +9603,7 @@
                     <pic:cNvPicPr/>
                   </pic:nvPicPr>
                   <pic:blipFill>
-                    <a:blip r:embed="rId25" cstate="print">
+                    <a:blip r:embed="rId26" cstate="print">
                       <a:extLst>
                         <a:ext uri="{28A0092B-C50C-407E-A947-70E740481C1C}">
                           <a14:useLocalDpi xmlns:a14="http://schemas.microsoft.com/office/drawing/2010/main" val="0"/>
@@ -9846,7 +9927,7 @@
                     </pic:cNvPicPr>
                   </pic:nvPicPr>
                   <pic:blipFill>
-                    <a:blip r:embed="rId26">
+                    <a:blip r:embed="rId27">
                       <a:extLst>
                         <a:ext uri="{28A0092B-C50C-407E-A947-70E740481C1C}">
                           <a14:useLocalDpi xmlns:a14="http://schemas.microsoft.com/office/drawing/2010/main" val="0"/>
@@ -10128,7 +10209,7 @@
                     <pic:cNvPicPr/>
                   </pic:nvPicPr>
                   <pic:blipFill>
-                    <a:blip r:embed="rId27">
+                    <a:blip r:embed="rId28">
                       <a:extLst>
                         <a:ext uri="{28A0092B-C50C-407E-A947-70E740481C1C}">
                           <a14:useLocalDpi xmlns:a14="http://schemas.microsoft.com/office/drawing/2010/main" val="0"/>
@@ -10174,7 +10255,7 @@
                     <pic:cNvPicPr/>
                   </pic:nvPicPr>
                   <pic:blipFill>
-                    <a:blip r:embed="rId28">
+                    <a:blip r:embed="rId29">
                       <a:extLst>
                         <a:ext uri="{28A0092B-C50C-407E-A947-70E740481C1C}">
                           <a14:useLocalDpi xmlns:a14="http://schemas.microsoft.com/office/drawing/2010/main" val="0"/>
@@ -10570,7 +10651,7 @@
                     <pic:cNvPicPr/>
                   </pic:nvPicPr>
                   <pic:blipFill>
-                    <a:blip r:embed="rId29" cstate="print">
+                    <a:blip r:embed="rId30" cstate="print">
                       <a:extLst>
                         <a:ext uri="{28A0092B-C50C-407E-A947-70E740481C1C}">
                           <a14:useLocalDpi xmlns:a14="http://schemas.microsoft.com/office/drawing/2010/main" val="0"/>
@@ -10618,7 +10699,7 @@
                     </pic:cNvPicPr>
                   </pic:nvPicPr>
                   <pic:blipFill>
-                    <a:blip r:embed="rId30" cstate="print">
+                    <a:blip r:embed="rId31" cstate="print">
                       <a:extLst>
                         <a:ext uri="{28A0092B-C50C-407E-A947-70E740481C1C}">
                           <a14:useLocalDpi xmlns:a14="http://schemas.microsoft.com/office/drawing/2010/main" val="0"/>
@@ -10859,7 +10940,7 @@
                     <pic:cNvPicPr/>
                   </pic:nvPicPr>
                   <pic:blipFill>
-                    <a:blip r:embed="rId31">
+                    <a:blip r:embed="rId32">
                       <a:extLst>
                         <a:ext uri="{28A0092B-C50C-407E-A947-70E740481C1C}">
                           <a14:useLocalDpi xmlns:a14="http://schemas.microsoft.com/office/drawing/2010/main" val="0"/>
@@ -11092,7 +11173,7 @@
                     </pic:cNvPicPr>
                   </pic:nvPicPr>
                   <pic:blipFill rotWithShape="1">
-                    <a:blip r:embed="rId32">
+                    <a:blip r:embed="rId33">
                       <a:extLst>
                         <a:ext uri="{28A0092B-C50C-407E-A947-70E740481C1C}">
                           <a14:useLocalDpi xmlns:a14="http://schemas.microsoft.com/office/drawing/2010/main" val="0"/>
@@ -11291,7 +11372,7 @@
                     </pic:cNvPicPr>
                   </pic:nvPicPr>
                   <pic:blipFill>
-                    <a:blip r:embed="rId33" cstate="print">
+                    <a:blip r:embed="rId34" cstate="print">
                       <a:extLst>
                         <a:ext uri="{28A0092B-C50C-407E-A947-70E740481C1C}">
                           <a14:useLocalDpi xmlns:a14="http://schemas.microsoft.com/office/drawing/2010/main" val="0"/>
@@ -11354,7 +11435,7 @@
                     </pic:cNvPicPr>
                   </pic:nvPicPr>
                   <pic:blipFill>
-                    <a:blip r:embed="rId34">
+                    <a:blip r:embed="rId35">
                       <a:extLst>
                         <a:ext uri="{28A0092B-C50C-407E-A947-70E740481C1C}">
                           <a14:useLocalDpi xmlns:a14="http://schemas.microsoft.com/office/drawing/2010/main" val="0"/>
@@ -11541,7 +11622,7 @@
                     </pic:cNvPicPr>
                   </pic:nvPicPr>
                   <pic:blipFill>
-                    <a:blip r:embed="rId35">
+                    <a:blip r:embed="rId36">
                       <a:extLst>
                         <a:ext uri="{28A0092B-C50C-407E-A947-70E740481C1C}">
                           <a14:useLocalDpi xmlns:a14="http://schemas.microsoft.com/office/drawing/2010/main" val="0"/>
@@ -11790,7 +11871,7 @@
                     </pic:cNvPicPr>
                   </pic:nvPicPr>
                   <pic:blipFill>
-                    <a:blip r:embed="rId36" cstate="print">
+                    <a:blip r:embed="rId37" cstate="print">
                       <a:extLst>
                         <a:ext uri="{28A0092B-C50C-407E-A947-70E740481C1C}">
                           <a14:useLocalDpi xmlns:a14="http://schemas.microsoft.com/office/drawing/2010/main" val="0"/>
@@ -11859,7 +11940,7 @@
                     </pic:cNvPicPr>
                   </pic:nvPicPr>
                   <pic:blipFill>
-                    <a:blip r:embed="rId37" cstate="print">
+                    <a:blip r:embed="rId38" cstate="print">
                       <a:extLst>
                         <a:ext uri="{28A0092B-C50C-407E-A947-70E740481C1C}">
                           <a14:useLocalDpi xmlns:a14="http://schemas.microsoft.com/office/drawing/2010/main" val="0"/>
@@ -11929,7 +12010,7 @@
                     </pic:cNvPicPr>
                   </pic:nvPicPr>
                   <pic:blipFill>
-                    <a:blip r:embed="rId38">
+                    <a:blip r:embed="rId39">
                       <a:extLst>
                         <a:ext uri="{28A0092B-C50C-407E-A947-70E740481C1C}">
                           <a14:useLocalDpi xmlns:a14="http://schemas.microsoft.com/office/drawing/2010/main" val="0"/>
@@ -12088,7 +12169,7 @@
                     </pic:cNvPicPr>
                   </pic:nvPicPr>
                   <pic:blipFill>
-                    <a:blip r:embed="rId41" cstate="print">
+                    <a:blip r:embed="rId42" cstate="print">
                       <a:extLst>
                         <a:ext uri="{28A0092B-C50C-407E-A947-70E740481C1C}">
                           <a14:useLocalDpi xmlns:a14="http://schemas.microsoft.com/office/drawing/2010/main" val="0"/>
@@ -12429,7 +12510,7 @@
                     </pic:cNvPicPr>
                   </pic:nvPicPr>
                   <pic:blipFill>
-                    <a:blip r:embed="rId42" cstate="print">
+                    <a:blip r:embed="rId43" cstate="print">
                       <a:extLst>
                         <a:ext uri="{28A0092B-C50C-407E-A947-70E740481C1C}">
                           <a14:useLocalDpi xmlns:a14="http://schemas.microsoft.com/office/drawing/2010/main" val="0"/>
@@ -12619,7 +12700,7 @@
                     <pic:cNvPicPr/>
                   </pic:nvPicPr>
                   <pic:blipFill>
-                    <a:blip r:embed="rId43"/>
+                    <a:blip r:embed="rId44"/>
                     <a:stretch>
                       <a:fillRect/>
                     </a:stretch>
@@ -12678,94 +12759,6 @@
             <wp:extent cx="473914" cy="770111"/>
             <wp:effectExtent l="0" t="0" r="2540" b="0"/>
             <wp:docPr id="29" name="Picture 29"/>
-            <wp:cNvGraphicFramePr>
-              <a:graphicFrameLocks xmlns:a="http://schemas.openxmlformats.org/drawingml/2006/main" noChangeAspect="1"/>
-            </wp:cNvGraphicFramePr>
-            <a:graphic xmlns:a="http://schemas.openxmlformats.org/drawingml/2006/main">
-              <a:graphicData uri="http://schemas.openxmlformats.org/drawingml/2006/picture">
-                <pic:pic xmlns:pic="http://schemas.openxmlformats.org/drawingml/2006/picture">
-                  <pic:nvPicPr>
-                    <pic:cNvPr id="1" name=""/>
-                    <pic:cNvPicPr/>
-                  </pic:nvPicPr>
-                  <pic:blipFill>
-                    <a:blip r:embed="rId44"/>
-                    <a:stretch>
-                      <a:fillRect/>
-                    </a:stretch>
-                  </pic:blipFill>
-                  <pic:spPr>
-                    <a:xfrm>
-                      <a:off x="0" y="0"/>
-                      <a:ext cx="506426" cy="822944"/>
-                    </a:xfrm>
-                    <a:prstGeom prst="rect">
-                      <a:avLst/>
-                    </a:prstGeom>
-                  </pic:spPr>
-                </pic:pic>
-              </a:graphicData>
-            </a:graphic>
-          </wp:inline>
-        </w:drawing>
-      </w:r>
-      <w:r>
-        <w:t xml:space="preserve">   </w:t>
-      </w:r>
-    </w:p>
-    <w:p>
-      <w:pPr>
-        <w:pStyle w:val="BodyText"/>
-        <w:keepNext/>
-        <w:numPr>
-          <w:ilvl w:val="0"/>
-          <w:numId w:val="10"/>
-        </w:numPr>
-      </w:pPr>
-      <w:r>
-        <w:rPr>
-          <w:b/>
-          <w:u w:val="single"/>
-        </w:rPr>
-        <w:t>Game 1-4 and ValidScore 1-4</w:t>
-      </w:r>
-      <w:r>
-        <w:t xml:space="preserve"> - t</w:t>
-      </w:r>
-      <w:r>
-        <w:t>hat player’s score for each game</w:t>
-      </w:r>
-      <w:r>
-        <w:t xml:space="preserve"> they played, and a checkbox used to determine whether that player’s score is valid for that set of pins. E.G. a sandbagged score will be</w:t>
-      </w:r>
-      <w:r>
-        <w:t xml:space="preserve"> unchecked and thus invalidated.</w:t>
-      </w:r>
-    </w:p>
-    <w:p>
-      <w:pPr>
-        <w:pStyle w:val="BodyText"/>
-        <w:keepNext/>
-        <w:ind w:left="720"/>
-        <w:rPr>
-          <w:noProof/>
-        </w:rPr>
-      </w:pPr>
-      <w:r>
-        <w:rPr>
-          <w:noProof/>
-        </w:rPr>
-        <w:t xml:space="preserve"> </w:t>
-      </w:r>
-      <w:r>
-        <w:rPr>
-          <w:noProof/>
-        </w:rPr>
-        <w:drawing>
-          <wp:inline distT="0" distB="0" distL="0" distR="0" wp14:anchorId="7A3357F6" wp14:editId="1EC28456">
-            <wp:extent cx="491706" cy="697328"/>
-            <wp:effectExtent l="0" t="0" r="3810" b="7620"/>
-            <wp:docPr id="31" name="Picture 31"/>
             <wp:cNvGraphicFramePr>
               <a:graphicFrameLocks xmlns:a="http://schemas.openxmlformats.org/drawingml/2006/main" noChangeAspect="1"/>
             </wp:cNvGraphicFramePr>
@@ -12785,7 +12778,7 @@
                   <pic:spPr>
                     <a:xfrm>
                       <a:off x="0" y="0"/>
-                      <a:ext cx="515572" cy="731175"/>
+                      <a:ext cx="506426" cy="822944"/>
                     </a:xfrm>
                     <a:prstGeom prst="rect">
                       <a:avLst/>
@@ -12797,6 +12790,9 @@
           </wp:inline>
         </w:drawing>
       </w:r>
+      <w:r>
+        <w:t xml:space="preserve">   </w:t>
+      </w:r>
     </w:p>
     <w:p>
       <w:pPr>
@@ -12812,10 +12808,19 @@
           <w:b/>
           <w:u w:val="single"/>
         </w:rPr>
-        <w:t>Scratch Total</w:t>
-      </w:r>
-      <w:r>
-        <w:t xml:space="preserve"> – The player’s total score before handicaps are taken into account.</w:t>
+        <w:t>Game 1-4 and ValidScore 1-4</w:t>
+      </w:r>
+      <w:r>
+        <w:t xml:space="preserve"> - t</w:t>
+      </w:r>
+      <w:r>
+        <w:t>hat player’s score for each game</w:t>
+      </w:r>
+      <w:r>
+        <w:t xml:space="preserve"> they played, and a checkbox used to determine whether that player’s score is valid for that set of pins. E.G. a sandbagged score will be</w:t>
+      </w:r>
+      <w:r>
+        <w:t xml:space="preserve"> unchecked and thus invalidated.</w:t>
       </w:r>
     </w:p>
     <w:p>
@@ -12823,16 +12828,25 @@
         <w:pStyle w:val="BodyText"/>
         <w:keepNext/>
         <w:ind w:left="720"/>
-      </w:pPr>
-      <w:r>
         <w:rPr>
           <w:noProof/>
         </w:rPr>
+      </w:pPr>
+      <w:r>
+        <w:rPr>
+          <w:noProof/>
+        </w:rPr>
+        <w:t xml:space="preserve"> </w:t>
+      </w:r>
+      <w:r>
+        <w:rPr>
+          <w:noProof/>
+        </w:rPr>
         <w:drawing>
-          <wp:inline distT="0" distB="0" distL="0" distR="0" wp14:anchorId="275B9669" wp14:editId="7FA5F256">
-            <wp:extent cx="542925" cy="752475"/>
-            <wp:effectExtent l="0" t="0" r="9525" b="9525"/>
-            <wp:docPr id="35" name="Picture 35"/>
+          <wp:inline distT="0" distB="0" distL="0" distR="0" wp14:anchorId="7A3357F6" wp14:editId="1EC28456">
+            <wp:extent cx="491706" cy="697328"/>
+            <wp:effectExtent l="0" t="0" r="3810" b="7620"/>
+            <wp:docPr id="31" name="Picture 31"/>
             <wp:cNvGraphicFramePr>
               <a:graphicFrameLocks xmlns:a="http://schemas.openxmlformats.org/drawingml/2006/main" noChangeAspect="1"/>
             </wp:cNvGraphicFramePr>
@@ -12852,7 +12866,7 @@
                   <pic:spPr>
                     <a:xfrm>
                       <a:off x="0" y="0"/>
-                      <a:ext cx="542925" cy="752475"/>
+                      <a:ext cx="515572" cy="731175"/>
                     </a:xfrm>
                     <a:prstGeom prst="rect">
                       <a:avLst/>
@@ -12879,10 +12893,10 @@
           <w:b/>
           <w:u w:val="single"/>
         </w:rPr>
-        <w:t xml:space="preserve">Handicap Total </w:t>
-      </w:r>
-      <w:r>
-        <w:t>– The player’s total score after handicaps are taken into account.</w:t>
+        <w:t>Scratch Total</w:t>
+      </w:r>
+      <w:r>
+        <w:t xml:space="preserve"> – The player’s total score before handicaps are taken into account.</w:t>
       </w:r>
     </w:p>
     <w:p>
@@ -12896,10 +12910,10 @@
           <w:noProof/>
         </w:rPr>
         <w:drawing>
-          <wp:inline distT="0" distB="0" distL="0" distR="0" wp14:anchorId="1C4ED64A" wp14:editId="177F90E7">
-            <wp:extent cx="533400" cy="752475"/>
-            <wp:effectExtent l="0" t="0" r="0" b="9525"/>
-            <wp:docPr id="40" name="Picture 40"/>
+          <wp:inline distT="0" distB="0" distL="0" distR="0" wp14:anchorId="275B9669" wp14:editId="7FA5F256">
+            <wp:extent cx="542925" cy="752475"/>
+            <wp:effectExtent l="0" t="0" r="9525" b="9525"/>
+            <wp:docPr id="35" name="Picture 35"/>
             <wp:cNvGraphicFramePr>
               <a:graphicFrameLocks xmlns:a="http://schemas.openxmlformats.org/drawingml/2006/main" noChangeAspect="1"/>
             </wp:cNvGraphicFramePr>
@@ -12919,7 +12933,7 @@
                   <pic:spPr>
                     <a:xfrm>
                       <a:off x="0" y="0"/>
-                      <a:ext cx="533400" cy="752475"/>
+                      <a:ext cx="542925" cy="752475"/>
                     </a:xfrm>
                     <a:prstGeom prst="rect">
                       <a:avLst/>
@@ -12946,10 +12960,10 @@
           <w:b/>
           <w:u w:val="single"/>
         </w:rPr>
-        <w:t>Entry AVG</w:t>
-      </w:r>
-      <w:r>
-        <w:t xml:space="preserve"> – The average for the current entry of the player.</w:t>
+        <w:t xml:space="preserve">Handicap Total </w:t>
+      </w:r>
+      <w:r>
+        <w:t>– The player’s total score after handicaps are taken into account.</w:t>
       </w:r>
     </w:p>
     <w:p>
@@ -12962,12 +12976,11 @@
         <w:rPr>
           <w:noProof/>
         </w:rPr>
-        <w:lastRenderedPageBreak/>
         <w:drawing>
-          <wp:inline distT="0" distB="0" distL="0" distR="0" wp14:anchorId="13E6B45B" wp14:editId="14A1B0A6">
-            <wp:extent cx="533400" cy="733425"/>
+          <wp:inline distT="0" distB="0" distL="0" distR="0" wp14:anchorId="1C4ED64A" wp14:editId="177F90E7">
+            <wp:extent cx="533400" cy="752475"/>
             <wp:effectExtent l="0" t="0" r="0" b="9525"/>
-            <wp:docPr id="41" name="Picture 41"/>
+            <wp:docPr id="40" name="Picture 40"/>
             <wp:cNvGraphicFramePr>
               <a:graphicFrameLocks xmlns:a="http://schemas.openxmlformats.org/drawingml/2006/main" noChangeAspect="1"/>
             </wp:cNvGraphicFramePr>
@@ -12987,7 +13000,7 @@
                   <pic:spPr>
                     <a:xfrm>
                       <a:off x="0" y="0"/>
-                      <a:ext cx="533400" cy="733425"/>
+                      <a:ext cx="533400" cy="752475"/>
                     </a:xfrm>
                     <a:prstGeom prst="rect">
                       <a:avLst/>
@@ -13014,10 +13027,10 @@
           <w:b/>
           <w:u w:val="single"/>
         </w:rPr>
-        <w:t>30 Entry AVG</w:t>
-      </w:r>
-      <w:r>
-        <w:t xml:space="preserve"> – The average for the last 30 entries of the player.</w:t>
+        <w:t>Entry AVG</w:t>
+      </w:r>
+      <w:r>
+        <w:t xml:space="preserve"> – The average for the current entry of the player.</w:t>
       </w:r>
     </w:p>
     <w:p>
@@ -13030,11 +13043,12 @@
         <w:rPr>
           <w:noProof/>
         </w:rPr>
+        <w:lastRenderedPageBreak/>
         <w:drawing>
-          <wp:inline distT="0" distB="0" distL="0" distR="0" wp14:anchorId="1A027C84" wp14:editId="6C6F8DDF">
-            <wp:extent cx="514350" cy="781050"/>
-            <wp:effectExtent l="0" t="0" r="0" b="0"/>
-            <wp:docPr id="42" name="Picture 42"/>
+          <wp:inline distT="0" distB="0" distL="0" distR="0" wp14:anchorId="13E6B45B" wp14:editId="14A1B0A6">
+            <wp:extent cx="533400" cy="733425"/>
+            <wp:effectExtent l="0" t="0" r="0" b="9525"/>
+            <wp:docPr id="41" name="Picture 41"/>
             <wp:cNvGraphicFramePr>
               <a:graphicFrameLocks xmlns:a="http://schemas.openxmlformats.org/drawingml/2006/main" noChangeAspect="1"/>
             </wp:cNvGraphicFramePr>
@@ -13054,7 +13068,7 @@
                   <pic:spPr>
                     <a:xfrm>
                       <a:off x="0" y="0"/>
-                      <a:ext cx="514350" cy="781050"/>
+                      <a:ext cx="533400" cy="733425"/>
                     </a:xfrm>
                     <a:prstGeom prst="rect">
                       <a:avLst/>
@@ -13081,19 +13095,10 @@
           <w:b/>
           <w:u w:val="single"/>
         </w:rPr>
-        <w:t>ADJ AVG</w:t>
-      </w:r>
-      <w:r>
-        <w:t xml:space="preserve"> – Adjusted Average.</w:t>
-      </w:r>
-      <w:r>
-        <w:t xml:space="preserve"> An average that must be manually entered by the </w:t>
-      </w:r>
-      <w:r>
-        <w:t>Director</w:t>
-      </w:r>
-      <w:r>
-        <w:t>.</w:t>
+        <w:t>30 Entry AVG</w:t>
+      </w:r>
+      <w:r>
+        <w:t xml:space="preserve"> – The average for the last 30 entries of the player.</w:t>
       </w:r>
     </w:p>
     <w:p>
@@ -13107,10 +13112,10 @@
           <w:noProof/>
         </w:rPr>
         <w:drawing>
-          <wp:inline distT="0" distB="0" distL="0" distR="0" wp14:anchorId="0EA28D84" wp14:editId="0D1BAAD7">
-            <wp:extent cx="514350" cy="762000"/>
+          <wp:inline distT="0" distB="0" distL="0" distR="0" wp14:anchorId="1A027C84" wp14:editId="6C6F8DDF">
+            <wp:extent cx="514350" cy="781050"/>
             <wp:effectExtent l="0" t="0" r="0" b="0"/>
-            <wp:docPr id="43" name="Picture 43"/>
+            <wp:docPr id="42" name="Picture 42"/>
             <wp:cNvGraphicFramePr>
               <a:graphicFrameLocks xmlns:a="http://schemas.openxmlformats.org/drawingml/2006/main" noChangeAspect="1"/>
             </wp:cNvGraphicFramePr>
@@ -13130,7 +13135,7 @@
                   <pic:spPr>
                     <a:xfrm>
                       <a:off x="0" y="0"/>
-                      <a:ext cx="514350" cy="762000"/>
+                      <a:ext cx="514350" cy="781050"/>
                     </a:xfrm>
                     <a:prstGeom prst="rect">
                       <a:avLst/>
@@ -13157,26 +13162,19 @@
           <w:b/>
           <w:u w:val="single"/>
         </w:rPr>
+        <w:t>ADJ AVG</w:t>
+      </w:r>
+      <w:r>
+        <w:t xml:space="preserve"> – Adjusted Average.</w:t>
+      </w:r>
+      <w:r>
+        <w:t xml:space="preserve"> An average that must be manually entered by the </w:t>
+      </w:r>
+      <w:r>
         <w:t>Director</w:t>
       </w:r>
       <w:r>
-        <w:rPr>
-          <w:b/>
-          <w:u w:val="single"/>
-        </w:rPr>
-        <w:t xml:space="preserve"> Check</w:t>
-      </w:r>
-      <w:r>
-        <w:t xml:space="preserve"> – Checkbox to confirm a </w:t>
-      </w:r>
-      <w:r>
-        <w:t>Director</w:t>
-      </w:r>
-      <w:r>
-        <w:t xml:space="preserve"> has checked and validated</w:t>
-      </w:r>
-      <w:r>
-        <w:t xml:space="preserve"> a player’s score.</w:t>
+        <w:t>.</w:t>
       </w:r>
     </w:p>
     <w:p>
@@ -13190,10 +13188,10 @@
           <w:noProof/>
         </w:rPr>
         <w:drawing>
-          <wp:inline distT="0" distB="0" distL="0" distR="0" wp14:anchorId="7975C22F" wp14:editId="35A77B3D">
-            <wp:extent cx="542925" cy="733425"/>
-            <wp:effectExtent l="0" t="0" r="9525" b="9525"/>
-            <wp:docPr id="45" name="Picture 45"/>
+          <wp:inline distT="0" distB="0" distL="0" distR="0" wp14:anchorId="0EA28D84" wp14:editId="0D1BAAD7">
+            <wp:extent cx="514350" cy="762000"/>
+            <wp:effectExtent l="0" t="0" r="0" b="0"/>
+            <wp:docPr id="43" name="Picture 43"/>
             <wp:cNvGraphicFramePr>
               <a:graphicFrameLocks xmlns:a="http://schemas.openxmlformats.org/drawingml/2006/main" noChangeAspect="1"/>
             </wp:cNvGraphicFramePr>
@@ -13213,7 +13211,7 @@
                   <pic:spPr>
                     <a:xfrm>
                       <a:off x="0" y="0"/>
-                      <a:ext cx="542925" cy="733425"/>
+                      <a:ext cx="514350" cy="762000"/>
                     </a:xfrm>
                     <a:prstGeom prst="rect">
                       <a:avLst/>
@@ -13234,33 +13232,32 @@
           <w:ilvl w:val="0"/>
           <w:numId w:val="10"/>
         </w:numPr>
+      </w:pPr>
+      <w:r>
         <w:rPr>
           <w:b/>
           <w:u w:val="single"/>
         </w:rPr>
-      </w:pPr>
+        <w:t>Director</w:t>
+      </w:r>
       <w:r>
         <w:rPr>
           <w:b/>
           <w:u w:val="single"/>
         </w:rPr>
-        <w:t>Squad</w:t>
-      </w:r>
-      <w:r>
-        <w:rPr>
-          <w:b/>
-          <w:u w:val="single"/>
-        </w:rPr>
-        <w:t xml:space="preserve"> </w:t>
-      </w:r>
-      <w:r>
-        <w:t>–</w:t>
-      </w:r>
-      <w:r>
-        <w:t xml:space="preserve"> T</w:t>
-      </w:r>
-      <w:r>
-        <w:t>he squad of this player’s game.</w:t>
+        <w:t xml:space="preserve"> Check</w:t>
+      </w:r>
+      <w:r>
+        <w:t xml:space="preserve"> – Checkbox to confirm a </w:t>
+      </w:r>
+      <w:r>
+        <w:t>Director</w:t>
+      </w:r>
+      <w:r>
+        <w:t xml:space="preserve"> has checked and validated</w:t>
+      </w:r>
+      <w:r>
+        <w:t xml:space="preserve"> a player’s score.</w:t>
       </w:r>
     </w:p>
     <w:p>
@@ -13268,20 +13265,16 @@
         <w:pStyle w:val="BodyText"/>
         <w:keepNext/>
         <w:ind w:left="720"/>
-        <w:rPr>
-          <w:b/>
-          <w:u w:val="single"/>
-        </w:rPr>
       </w:pPr>
       <w:r>
         <w:rPr>
           <w:noProof/>
         </w:rPr>
         <w:drawing>
-          <wp:inline distT="0" distB="0" distL="0" distR="0" wp14:anchorId="752F97DE" wp14:editId="3DE20F24">
-            <wp:extent cx="504825" cy="781050"/>
-            <wp:effectExtent l="0" t="0" r="9525" b="0"/>
-            <wp:docPr id="46" name="Picture 46"/>
+          <wp:inline distT="0" distB="0" distL="0" distR="0" wp14:anchorId="7975C22F" wp14:editId="35A77B3D">
+            <wp:extent cx="542925" cy="733425"/>
+            <wp:effectExtent l="0" t="0" r="9525" b="9525"/>
+            <wp:docPr id="45" name="Picture 45"/>
             <wp:cNvGraphicFramePr>
               <a:graphicFrameLocks xmlns:a="http://schemas.openxmlformats.org/drawingml/2006/main" noChangeAspect="1"/>
             </wp:cNvGraphicFramePr>
@@ -13301,7 +13294,7 @@
                   <pic:spPr>
                     <a:xfrm>
                       <a:off x="0" y="0"/>
-                      <a:ext cx="504825" cy="781050"/>
+                      <a:ext cx="542925" cy="733425"/>
                     </a:xfrm>
                     <a:prstGeom prst="rect">
                       <a:avLst/>
@@ -13332,10 +13325,23 @@
           <w:b/>
           <w:u w:val="single"/>
         </w:rPr>
-        <w:t xml:space="preserve">Handicap </w:t>
-      </w:r>
-      <w:r>
-        <w:t>– The player’s current handicap.</w:t>
+        <w:t>Squad</w:t>
+      </w:r>
+      <w:r>
+        <w:rPr>
+          <w:b/>
+          <w:u w:val="single"/>
+        </w:rPr>
+        <w:t xml:space="preserve"> </w:t>
+      </w:r>
+      <w:r>
+        <w:t>–</w:t>
+      </w:r>
+      <w:r>
+        <w:t xml:space="preserve"> T</w:t>
+      </w:r>
+      <w:r>
+        <w:t>he squad of this player’s game.</w:t>
       </w:r>
     </w:p>
     <w:p>
@@ -13353,10 +13359,10 @@
           <w:noProof/>
         </w:rPr>
         <w:drawing>
-          <wp:inline distT="0" distB="0" distL="0" distR="0" wp14:anchorId="246BBCB5" wp14:editId="5433436B">
-            <wp:extent cx="561975" cy="762000"/>
+          <wp:inline distT="0" distB="0" distL="0" distR="0" wp14:anchorId="752F97DE" wp14:editId="3DE20F24">
+            <wp:extent cx="504825" cy="781050"/>
             <wp:effectExtent l="0" t="0" r="9525" b="0"/>
-            <wp:docPr id="47" name="Picture 47"/>
+            <wp:docPr id="46" name="Picture 46"/>
             <wp:cNvGraphicFramePr>
               <a:graphicFrameLocks xmlns:a="http://schemas.openxmlformats.org/drawingml/2006/main" noChangeAspect="1"/>
             </wp:cNvGraphicFramePr>
@@ -13376,7 +13382,7 @@
                   <pic:spPr>
                     <a:xfrm>
                       <a:off x="0" y="0"/>
-                      <a:ext cx="561975" cy="762000"/>
+                      <a:ext cx="504825" cy="781050"/>
                     </a:xfrm>
                     <a:prstGeom prst="rect">
                       <a:avLst/>
@@ -13407,10 +13413,10 @@
           <w:b/>
           <w:u w:val="single"/>
         </w:rPr>
-        <w:t>Bonus</w:t>
-      </w:r>
-      <w:r>
-        <w:t xml:space="preserve"> – Current player’s bonus.</w:t>
+        <w:t xml:space="preserve">Handicap </w:t>
+      </w:r>
+      <w:r>
+        <w:t>– The player’s current handicap.</w:t>
       </w:r>
     </w:p>
     <w:p>
@@ -13427,12 +13433,11 @@
         <w:rPr>
           <w:noProof/>
         </w:rPr>
-        <w:lastRenderedPageBreak/>
         <w:drawing>
-          <wp:inline distT="0" distB="0" distL="0" distR="0" wp14:anchorId="4DAE4DA4" wp14:editId="32E56A64">
-            <wp:extent cx="533400" cy="752475"/>
-            <wp:effectExtent l="0" t="0" r="0" b="9525"/>
-            <wp:docPr id="48" name="Picture 48"/>
+          <wp:inline distT="0" distB="0" distL="0" distR="0" wp14:anchorId="246BBCB5" wp14:editId="5433436B">
+            <wp:extent cx="561975" cy="762000"/>
+            <wp:effectExtent l="0" t="0" r="9525" b="0"/>
+            <wp:docPr id="47" name="Picture 47"/>
             <wp:cNvGraphicFramePr>
               <a:graphicFrameLocks xmlns:a="http://schemas.openxmlformats.org/drawingml/2006/main" noChangeAspect="1"/>
             </wp:cNvGraphicFramePr>
@@ -13452,7 +13457,7 @@
                   <pic:spPr>
                     <a:xfrm>
                       <a:off x="0" y="0"/>
-                      <a:ext cx="533400" cy="752475"/>
+                      <a:ext cx="561975" cy="762000"/>
                     </a:xfrm>
                     <a:prstGeom prst="rect">
                       <a:avLst/>
@@ -13483,17 +13488,10 @@
           <w:b/>
           <w:u w:val="single"/>
         </w:rPr>
-        <w:t xml:space="preserve"> Pro Pot</w:t>
-      </w:r>
-      <w:r>
-        <w:rPr>
-          <w:i/>
-          <w:u w:val="single"/>
-        </w:rPr>
-        <w:t xml:space="preserve"> </w:t>
-      </w:r>
-      <w:r>
-        <w:t>– Needs work</w:t>
+        <w:t>Bonus</w:t>
+      </w:r>
+      <w:r>
+        <w:t xml:space="preserve"> – Current player’s bonus.</w:t>
       </w:r>
     </w:p>
     <w:p>
@@ -13510,11 +13508,12 @@
         <w:rPr>
           <w:noProof/>
         </w:rPr>
+        <w:lastRenderedPageBreak/>
         <w:drawing>
-          <wp:inline distT="0" distB="0" distL="0" distR="0" wp14:anchorId="262F41B1" wp14:editId="7DF7E216">
-            <wp:extent cx="533400" cy="733425"/>
+          <wp:inline distT="0" distB="0" distL="0" distR="0" wp14:anchorId="4DAE4DA4" wp14:editId="32E56A64">
+            <wp:extent cx="533400" cy="752475"/>
             <wp:effectExtent l="0" t="0" r="0" b="9525"/>
-            <wp:docPr id="49" name="Picture 49"/>
+            <wp:docPr id="48" name="Picture 48"/>
             <wp:cNvGraphicFramePr>
               <a:graphicFrameLocks xmlns:a="http://schemas.openxmlformats.org/drawingml/2006/main" noChangeAspect="1"/>
             </wp:cNvGraphicFramePr>
@@ -13534,7 +13533,7 @@
                   <pic:spPr>
                     <a:xfrm>
                       <a:off x="0" y="0"/>
-                      <a:ext cx="533400" cy="733425"/>
+                      <a:ext cx="533400" cy="752475"/>
                     </a:xfrm>
                     <a:prstGeom prst="rect">
                       <a:avLst/>
@@ -13565,13 +13564,17 @@
           <w:b/>
           <w:u w:val="single"/>
         </w:rPr>
-        <w:t>Notes</w:t>
-      </w:r>
-      <w:r>
-        <w:t xml:space="preserve"> – notes on the cur</w:t>
-      </w:r>
-      <w:r>
-        <w:t>rent player.</w:t>
+        <w:t xml:space="preserve"> Pro Pot</w:t>
+      </w:r>
+      <w:r>
+        <w:rPr>
+          <w:i/>
+          <w:u w:val="single"/>
+        </w:rPr>
+        <w:t xml:space="preserve"> </w:t>
+      </w:r>
+      <w:r>
+        <w:t>– Needs work</w:t>
       </w:r>
     </w:p>
     <w:p>
@@ -13589,10 +13592,10 @@
           <w:noProof/>
         </w:rPr>
         <w:drawing>
-          <wp:inline distT="0" distB="0" distL="0" distR="0" wp14:anchorId="29A96E70" wp14:editId="63FE8FAF">
+          <wp:inline distT="0" distB="0" distL="0" distR="0" wp14:anchorId="262F41B1" wp14:editId="7DF7E216">
             <wp:extent cx="533400" cy="733425"/>
             <wp:effectExtent l="0" t="0" r="0" b="9525"/>
-            <wp:docPr id="50" name="Picture 50"/>
+            <wp:docPr id="49" name="Picture 49"/>
             <wp:cNvGraphicFramePr>
               <a:graphicFrameLocks xmlns:a="http://schemas.openxmlformats.org/drawingml/2006/main" noChangeAspect="1"/>
             </wp:cNvGraphicFramePr>
@@ -13627,6 +13630,84 @@
     </w:p>
     <w:p>
       <w:pPr>
+        <w:pStyle w:val="BodyText"/>
+        <w:keepNext/>
+        <w:numPr>
+          <w:ilvl w:val="0"/>
+          <w:numId w:val="10"/>
+        </w:numPr>
+        <w:rPr>
+          <w:b/>
+          <w:u w:val="single"/>
+        </w:rPr>
+      </w:pPr>
+      <w:r>
+        <w:rPr>
+          <w:b/>
+          <w:u w:val="single"/>
+        </w:rPr>
+        <w:t>Notes</w:t>
+      </w:r>
+      <w:r>
+        <w:t xml:space="preserve"> – notes on the cur</w:t>
+      </w:r>
+      <w:r>
+        <w:t>rent player.</w:t>
+      </w:r>
+    </w:p>
+    <w:p>
+      <w:pPr>
+        <w:pStyle w:val="BodyText"/>
+        <w:keepNext/>
+        <w:ind w:left="720"/>
+        <w:rPr>
+          <w:b/>
+          <w:u w:val="single"/>
+        </w:rPr>
+      </w:pPr>
+      <w:r>
+        <w:rPr>
+          <w:noProof/>
+        </w:rPr>
+        <w:drawing>
+          <wp:inline distT="0" distB="0" distL="0" distR="0" wp14:anchorId="29A96E70" wp14:editId="63FE8FAF">
+            <wp:extent cx="533400" cy="733425"/>
+            <wp:effectExtent l="0" t="0" r="0" b="9525"/>
+            <wp:docPr id="50" name="Picture 50"/>
+            <wp:cNvGraphicFramePr>
+              <a:graphicFrameLocks xmlns:a="http://schemas.openxmlformats.org/drawingml/2006/main" noChangeAspect="1"/>
+            </wp:cNvGraphicFramePr>
+            <a:graphic xmlns:a="http://schemas.openxmlformats.org/drawingml/2006/main">
+              <a:graphicData uri="http://schemas.openxmlformats.org/drawingml/2006/picture">
+                <pic:pic xmlns:pic="http://schemas.openxmlformats.org/drawingml/2006/picture">
+                  <pic:nvPicPr>
+                    <pic:cNvPr id="1" name=""/>
+                    <pic:cNvPicPr/>
+                  </pic:nvPicPr>
+                  <pic:blipFill>
+                    <a:blip r:embed="rId57"/>
+                    <a:stretch>
+                      <a:fillRect/>
+                    </a:stretch>
+                  </pic:blipFill>
+                  <pic:spPr>
+                    <a:xfrm>
+                      <a:off x="0" y="0"/>
+                      <a:ext cx="533400" cy="733425"/>
+                    </a:xfrm>
+                    <a:prstGeom prst="rect">
+                      <a:avLst/>
+                    </a:prstGeom>
+                  </pic:spPr>
+                </pic:pic>
+              </a:graphicData>
+            </a:graphic>
+          </wp:inline>
+        </w:drawing>
+      </w:r>
+    </w:p>
+    <w:p>
+      <w:pPr>
         <w:pStyle w:val="Caption"/>
       </w:pPr>
     </w:p>
@@ -13724,7 +13805,7 @@
                     </pic:cNvPicPr>
                   </pic:nvPicPr>
                   <pic:blipFill>
-                    <a:blip r:embed="rId57">
+                    <a:blip r:embed="rId58">
                       <a:extLst>
                         <a:ext uri="{28A0092B-C50C-407E-A947-70E740481C1C}">
                           <a14:useLocalDpi xmlns:a14="http://schemas.microsoft.com/office/drawing/2010/main" val="0"/>
@@ -13832,7 +13913,7 @@
                     </pic:cNvPicPr>
                   </pic:nvPicPr>
                   <pic:blipFill>
-                    <a:blip r:embed="rId58">
+                    <a:blip r:embed="rId59">
                       <a:extLst>
                         <a:ext uri="{28A0092B-C50C-407E-A947-70E740481C1C}">
                           <a14:useLocalDpi xmlns:a14="http://schemas.microsoft.com/office/drawing/2010/main" val="0"/>
@@ -13943,7 +14024,7 @@
                     </pic:cNvPicPr>
                   </pic:nvPicPr>
                   <pic:blipFill>
-                    <a:blip r:embed="rId59">
+                    <a:blip r:embed="rId60">
                       <a:extLst>
                         <a:ext uri="{28A0092B-C50C-407E-A947-70E740481C1C}">
                           <a14:useLocalDpi xmlns:a14="http://schemas.microsoft.com/office/drawing/2010/main" val="0"/>
@@ -14047,7 +14128,7 @@
                     </pic:cNvPicPr>
                   </pic:nvPicPr>
                   <pic:blipFill>
-                    <a:blip r:embed="rId60">
+                    <a:blip r:embed="rId61">
                       <a:extLst>
                         <a:ext uri="{28A0092B-C50C-407E-A947-70E740481C1C}">
                           <a14:useLocalDpi xmlns:a14="http://schemas.microsoft.com/office/drawing/2010/main" val="0"/>
@@ -14456,7 +14537,7 @@
                     <pic:cNvPicPr/>
                   </pic:nvPicPr>
                   <pic:blipFill>
-                    <a:blip r:embed="rId61" cstate="print">
+                    <a:blip r:embed="rId62" cstate="print">
                       <a:extLst>
                         <a:ext uri="{28A0092B-C50C-407E-A947-70E740481C1C}">
                           <a14:useLocalDpi xmlns:a14="http://schemas.microsoft.com/office/drawing/2010/main" val="0"/>
@@ -14689,7 +14770,7 @@
                     <pic:cNvPicPr/>
                   </pic:nvPicPr>
                   <pic:blipFill>
-                    <a:blip r:embed="rId62">
+                    <a:blip r:embed="rId63">
                       <a:extLst>
                         <a:ext uri="{28A0092B-C50C-407E-A947-70E740481C1C}">
                           <a14:useLocalDpi xmlns:a14="http://schemas.microsoft.com/office/drawing/2010/main" val="0"/>
@@ -14942,7 +15023,7 @@
                     </pic:cNvPicPr>
                   </pic:nvPicPr>
                   <pic:blipFill>
-                    <a:blip r:embed="rId63" cstate="print">
+                    <a:blip r:embed="rId64" cstate="print">
                       <a:extLst>
                         <a:ext uri="{28A0092B-C50C-407E-A947-70E740481C1C}">
                           <a14:useLocalDpi xmlns:a14="http://schemas.microsoft.com/office/drawing/2010/main" val="0"/>
@@ -15139,7 +15220,7 @@
                     </pic:cNvPicPr>
                   </pic:nvPicPr>
                   <pic:blipFill>
-                    <a:blip r:embed="rId64" cstate="print">
+                    <a:blip r:embed="rId65" cstate="print">
                       <a:extLst>
                         <a:ext uri="{28A0092B-C50C-407E-A947-70E740481C1C}">
                           <a14:useLocalDpi xmlns:a14="http://schemas.microsoft.com/office/drawing/2010/main" val="0"/>
@@ -18537,9 +18618,9 @@
     <w:p>
       <w:pPr>
         <w:sectPr>
-          <w:headerReference w:type="default" r:id="rId65"/>
-          <w:footerReference w:type="default" r:id="rId66"/>
-          <w:headerReference w:type="first" r:id="rId67"/>
+          <w:headerReference w:type="default" r:id="rId66"/>
+          <w:footerReference w:type="default" r:id="rId67"/>
+          <w:headerReference w:type="first" r:id="rId68"/>
           <w:type w:val="continuous"/>
           <w:pgSz w:w="12240" w:h="15840" w:code="1"/>
           <w:pgMar w:top="1800" w:right="1195" w:bottom="1440" w:left="3355" w:header="720" w:footer="720" w:gutter="0"/>
@@ -20035,7 +20116,7 @@
         <w:rStyle w:val="PageNumber"/>
         <w:noProof/>
       </w:rPr>
-      <w:t>13</w:t>
+      <w:t>16</w:t>
     </w:r>
     <w:r>
       <w:rPr>
@@ -23136,7 +23217,7 @@
 </file>
 
 <file path=customXml/itemProps1.xml><?xml version="1.0" encoding="utf-8"?>
-<ds:datastoreItem xmlns:ds="http://schemas.openxmlformats.org/officeDocument/2006/customXml" ds:itemID="{ACEED1EC-522F-4871-A654-03A90C83104D}">
+<ds:datastoreItem xmlns:ds="http://schemas.openxmlformats.org/officeDocument/2006/customXml" ds:itemID="{8FB9DCAB-F4E4-4853-B445-294F5ABB381C}">
   <ds:schemaRefs>
     <ds:schemaRef ds:uri="http://schemas.openxmlformats.org/officeDocument/2006/bibliography"/>
   </ds:schemaRefs>

</xml_diff>